<commit_message>
docs: restore four report figures
</commit_message>
<xml_diff>
--- a/docs/SCAMGUARD_VN_THUYET_MINH_EUREKA_2026_BAN_VIET_HOA.docx
+++ b/docs/SCAMGUARD_VN_THUYET_MINH_EUREKA_2026_BAN_VIET_HOA.docx
@@ -162,7 +162,7 @@
       <w:pPr>
         <w:pStyle w:val="Heading1"/>
       </w:pPr>
-      <w:bookmarkStart w:id="0" w:name="_Toc238122611"/>
+      <w:bookmarkStart w:id="0" w:name="_Toc238122910"/>
       <w:r>
         <w:rPr>
           <w:rFonts w:ascii="Times New Roman" w:eastAsia="Times New Roman" w:hAnsi="Times New Roman"/>
@@ -207,7 +207,7 @@
         </w:rPr>
         <w:fldChar w:fldCharType="separate"/>
       </w:r>
-      <w:hyperlink w:anchor="_Toc238122611" w:history="1">
+      <w:hyperlink w:anchor="_Toc238122910" w:history="1">
         <w:r>
           <w:rPr>
             <w:rStyle w:val="Hyperlink"/>
@@ -234,7 +234,7 @@
             <w:noProof/>
             <w:webHidden/>
           </w:rPr>
-          <w:instrText xml:space="preserve"> PAGEREF _Toc238122611 \h </w:instrText>
+          <w:instrText xml:space="preserve"> PAGEREF _Toc238122910 \h </w:instrText>
         </w:r>
         <w:r>
           <w:rPr>
@@ -282,7 +282,7 @@
           <w14:ligatures w14:val="standardContextual"/>
         </w:rPr>
       </w:pPr>
-      <w:hyperlink w:anchor="_Toc238122612" w:history="1">
+      <w:hyperlink w:anchor="_Toc238122911" w:history="1">
         <w:r>
           <w:rPr>
             <w:rStyle w:val="Hyperlink"/>
@@ -309,7 +309,7 @@
             <w:noProof/>
             <w:webHidden/>
           </w:rPr>
-          <w:instrText xml:space="preserve"> PAGEREF _Toc238122612 \h </w:instrText>
+          <w:instrText xml:space="preserve"> PAGEREF _Toc238122911 \h </w:instrText>
         </w:r>
         <w:r>
           <w:rPr>
@@ -357,7 +357,7 @@
           <w14:ligatures w14:val="standardContextual"/>
         </w:rPr>
       </w:pPr>
-      <w:hyperlink w:anchor="_Toc238122613" w:history="1">
+      <w:hyperlink w:anchor="_Toc238122912" w:history="1">
         <w:r>
           <w:rPr>
             <w:rStyle w:val="Hyperlink"/>
@@ -384,7 +384,7 @@
             <w:noProof/>
             <w:webHidden/>
           </w:rPr>
-          <w:instrText xml:space="preserve"> PAGEREF _Toc238122613 \h </w:instrText>
+          <w:instrText xml:space="preserve"> PAGEREF _Toc238122912 \h </w:instrText>
         </w:r>
         <w:r>
           <w:rPr>
@@ -432,7 +432,7 @@
           <w14:ligatures w14:val="standardContextual"/>
         </w:rPr>
       </w:pPr>
-      <w:hyperlink w:anchor="_Toc238122614" w:history="1">
+      <w:hyperlink w:anchor="_Toc238122913" w:history="1">
         <w:r>
           <w:rPr>
             <w:rStyle w:val="Hyperlink"/>
@@ -459,7 +459,7 @@
             <w:noProof/>
             <w:webHidden/>
           </w:rPr>
-          <w:instrText xml:space="preserve"> PAGEREF _Toc238122614 \h </w:instrText>
+          <w:instrText xml:space="preserve"> PAGEREF _Toc238122913 \h </w:instrText>
         </w:r>
         <w:r>
           <w:rPr>
@@ -507,7 +507,7 @@
           <w14:ligatures w14:val="standardContextual"/>
         </w:rPr>
       </w:pPr>
-      <w:hyperlink w:anchor="_Toc238122615" w:history="1">
+      <w:hyperlink w:anchor="_Toc238122914" w:history="1">
         <w:r>
           <w:rPr>
             <w:rStyle w:val="Hyperlink"/>
@@ -534,7 +534,7 @@
             <w:noProof/>
             <w:webHidden/>
           </w:rPr>
-          <w:instrText xml:space="preserve"> PAGEREF _Toc238122615 \h </w:instrText>
+          <w:instrText xml:space="preserve"> PAGEREF _Toc238122914 \h </w:instrText>
         </w:r>
         <w:r>
           <w:rPr>
@@ -582,7 +582,7 @@
           <w14:ligatures w14:val="standardContextual"/>
         </w:rPr>
       </w:pPr>
-      <w:hyperlink w:anchor="_Toc238122616" w:history="1">
+      <w:hyperlink w:anchor="_Toc238122915" w:history="1">
         <w:r>
           <w:rPr>
             <w:rStyle w:val="Hyperlink"/>
@@ -609,7 +609,7 @@
             <w:noProof/>
             <w:webHidden/>
           </w:rPr>
-          <w:instrText xml:space="preserve"> PAGEREF _Toc238122616 \h </w:instrText>
+          <w:instrText xml:space="preserve"> PAGEREF _Toc238122915 \h </w:instrText>
         </w:r>
         <w:r>
           <w:rPr>
@@ -657,7 +657,7 @@
           <w14:ligatures w14:val="standardContextual"/>
         </w:rPr>
       </w:pPr>
-      <w:hyperlink w:anchor="_Toc238122617" w:history="1">
+      <w:hyperlink w:anchor="_Toc238122916" w:history="1">
         <w:r>
           <w:rPr>
             <w:rStyle w:val="Hyperlink"/>
@@ -684,7 +684,7 @@
             <w:noProof/>
             <w:webHidden/>
           </w:rPr>
-          <w:instrText xml:space="preserve"> PAGEREF _Toc238122617 \h </w:instrText>
+          <w:instrText xml:space="preserve"> PAGEREF _Toc238122916 \h </w:instrText>
         </w:r>
         <w:r>
           <w:rPr>
@@ -732,7 +732,7 @@
           <w14:ligatures w14:val="standardContextual"/>
         </w:rPr>
       </w:pPr>
-      <w:hyperlink w:anchor="_Toc238122618" w:history="1">
+      <w:hyperlink w:anchor="_Toc238122917" w:history="1">
         <w:r>
           <w:rPr>
             <w:rStyle w:val="Hyperlink"/>
@@ -759,7 +759,7 @@
             <w:noProof/>
             <w:webHidden/>
           </w:rPr>
-          <w:instrText xml:space="preserve"> PAGEREF _Toc238122618 \h </w:instrText>
+          <w:instrText xml:space="preserve"> PAGEREF _Toc238122917 \h </w:instrText>
         </w:r>
         <w:r>
           <w:rPr>
@@ -807,7 +807,7 @@
           <w14:ligatures w14:val="standardContextual"/>
         </w:rPr>
       </w:pPr>
-      <w:hyperlink w:anchor="_Toc238122619" w:history="1">
+      <w:hyperlink w:anchor="_Toc238122918" w:history="1">
         <w:r>
           <w:rPr>
             <w:rStyle w:val="Hyperlink"/>
@@ -834,7 +834,7 @@
             <w:noProof/>
             <w:webHidden/>
           </w:rPr>
-          <w:instrText xml:space="preserve"> PAGEREF _Toc238122619 \h </w:instrText>
+          <w:instrText xml:space="preserve"> PAGEREF _Toc238122918 \h </w:instrText>
         </w:r>
         <w:r>
           <w:rPr>
@@ -882,7 +882,7 @@
           <w14:ligatures w14:val="standardContextual"/>
         </w:rPr>
       </w:pPr>
-      <w:hyperlink w:anchor="_Toc238122620" w:history="1">
+      <w:hyperlink w:anchor="_Toc238122919" w:history="1">
         <w:r>
           <w:rPr>
             <w:rStyle w:val="Hyperlink"/>
@@ -909,7 +909,7 @@
             <w:noProof/>
             <w:webHidden/>
           </w:rPr>
-          <w:instrText xml:space="preserve"> PAGEREF _Toc238122620 \h </w:instrText>
+          <w:instrText xml:space="preserve"> PAGEREF _Toc238122919 \h </w:instrText>
         </w:r>
         <w:r>
           <w:rPr>
@@ -957,7 +957,7 @@
           <w14:ligatures w14:val="standardContextual"/>
         </w:rPr>
       </w:pPr>
-      <w:hyperlink w:anchor="_Toc238122621" w:history="1">
+      <w:hyperlink w:anchor="_Toc238122920" w:history="1">
         <w:r>
           <w:rPr>
             <w:rStyle w:val="Hyperlink"/>
@@ -984,7 +984,7 @@
             <w:noProof/>
             <w:webHidden/>
           </w:rPr>
-          <w:instrText xml:space="preserve"> PAGEREF _Toc238122621 \h </w:instrText>
+          <w:instrText xml:space="preserve"> PAGEREF _Toc238122920 \h </w:instrText>
         </w:r>
         <w:r>
           <w:rPr>
@@ -1004,7 +1004,7 @@
             <w:noProof/>
             <w:webHidden/>
           </w:rPr>
-          <w:t>6</w:t>
+          <w:t>7</w:t>
         </w:r>
         <w:r>
           <w:rPr>
@@ -1032,7 +1032,7 @@
           <w14:ligatures w14:val="standardContextual"/>
         </w:rPr>
       </w:pPr>
-      <w:hyperlink w:anchor="_Toc238122622" w:history="1">
+      <w:hyperlink w:anchor="_Toc238122921" w:history="1">
         <w:r>
           <w:rPr>
             <w:rStyle w:val="Hyperlink"/>
@@ -1059,7 +1059,7 @@
             <w:noProof/>
             <w:webHidden/>
           </w:rPr>
-          <w:instrText xml:space="preserve"> PAGEREF _Toc238122622 \h </w:instrText>
+          <w:instrText xml:space="preserve"> PAGEREF _Toc238122921 \h </w:instrText>
         </w:r>
         <w:r>
           <w:rPr>
@@ -1107,7 +1107,7 @@
           <w14:ligatures w14:val="standardContextual"/>
         </w:rPr>
       </w:pPr>
-      <w:hyperlink w:anchor="_Toc238122623" w:history="1">
+      <w:hyperlink w:anchor="_Toc238122922" w:history="1">
         <w:r>
           <w:rPr>
             <w:rStyle w:val="Hyperlink"/>
@@ -1134,7 +1134,7 @@
             <w:noProof/>
             <w:webHidden/>
           </w:rPr>
-          <w:instrText xml:space="preserve"> PAGEREF _Toc238122623 \h </w:instrText>
+          <w:instrText xml:space="preserve"> PAGEREF _Toc238122922 \h </w:instrText>
         </w:r>
         <w:r>
           <w:rPr>
@@ -1182,7 +1182,7 @@
           <w14:ligatures w14:val="standardContextual"/>
         </w:rPr>
       </w:pPr>
-      <w:hyperlink w:anchor="_Toc238122624" w:history="1">
+      <w:hyperlink w:anchor="_Toc238122923" w:history="1">
         <w:r>
           <w:rPr>
             <w:rStyle w:val="Hyperlink"/>
@@ -1209,7 +1209,7 @@
             <w:noProof/>
             <w:webHidden/>
           </w:rPr>
-          <w:instrText xml:space="preserve"> PAGEREF _Toc238122624 \h </w:instrText>
+          <w:instrText xml:space="preserve"> PAGEREF _Toc238122923 \h </w:instrText>
         </w:r>
         <w:r>
           <w:rPr>
@@ -1257,7 +1257,7 @@
           <w14:ligatures w14:val="standardContextual"/>
         </w:rPr>
       </w:pPr>
-      <w:hyperlink w:anchor="_Toc238122625" w:history="1">
+      <w:hyperlink w:anchor="_Toc238122924" w:history="1">
         <w:r>
           <w:rPr>
             <w:rStyle w:val="Hyperlink"/>
@@ -1284,7 +1284,7 @@
             <w:noProof/>
             <w:webHidden/>
           </w:rPr>
-          <w:instrText xml:space="preserve"> PAGEREF _Toc238122625 \h </w:instrText>
+          <w:instrText xml:space="preserve"> PAGEREF _Toc238122924 \h </w:instrText>
         </w:r>
         <w:r>
           <w:rPr>
@@ -1332,7 +1332,7 @@
           <w14:ligatures w14:val="standardContextual"/>
         </w:rPr>
       </w:pPr>
-      <w:hyperlink w:anchor="_Toc238122626" w:history="1">
+      <w:hyperlink w:anchor="_Toc238122925" w:history="1">
         <w:r>
           <w:rPr>
             <w:rStyle w:val="Hyperlink"/>
@@ -1359,7 +1359,7 @@
             <w:noProof/>
             <w:webHidden/>
           </w:rPr>
-          <w:instrText xml:space="preserve"> PAGEREF _Toc238122626 \h </w:instrText>
+          <w:instrText xml:space="preserve"> PAGEREF _Toc238122925 \h </w:instrText>
         </w:r>
         <w:r>
           <w:rPr>
@@ -1407,7 +1407,7 @@
           <w14:ligatures w14:val="standardContextual"/>
         </w:rPr>
       </w:pPr>
-      <w:hyperlink w:anchor="_Toc238122627" w:history="1">
+      <w:hyperlink w:anchor="_Toc238122926" w:history="1">
         <w:r>
           <w:rPr>
             <w:rStyle w:val="Hyperlink"/>
@@ -1434,7 +1434,7 @@
             <w:noProof/>
             <w:webHidden/>
           </w:rPr>
-          <w:instrText xml:space="preserve"> PAGEREF _Toc238122627 \h </w:instrText>
+          <w:instrText xml:space="preserve"> PAGEREF _Toc238122926 \h </w:instrText>
         </w:r>
         <w:r>
           <w:rPr>
@@ -1482,7 +1482,7 @@
           <w14:ligatures w14:val="standardContextual"/>
         </w:rPr>
       </w:pPr>
-      <w:hyperlink w:anchor="_Toc238122628" w:history="1">
+      <w:hyperlink w:anchor="_Toc238122927" w:history="1">
         <w:r>
           <w:rPr>
             <w:rStyle w:val="Hyperlink"/>
@@ -1509,7 +1509,7 @@
             <w:noProof/>
             <w:webHidden/>
           </w:rPr>
-          <w:instrText xml:space="preserve"> PAGEREF _Toc238122628 \h </w:instrText>
+          <w:instrText xml:space="preserve"> PAGEREF _Toc238122927 \h </w:instrText>
         </w:r>
         <w:r>
           <w:rPr>
@@ -1557,7 +1557,7 @@
           <w14:ligatures w14:val="standardContextual"/>
         </w:rPr>
       </w:pPr>
-      <w:hyperlink w:anchor="_Toc238122629" w:history="1">
+      <w:hyperlink w:anchor="_Toc238122928" w:history="1">
         <w:r>
           <w:rPr>
             <w:rStyle w:val="Hyperlink"/>
@@ -1584,7 +1584,7 @@
             <w:noProof/>
             <w:webHidden/>
           </w:rPr>
-          <w:instrText xml:space="preserve"> PAGEREF _Toc238122629 \h </w:instrText>
+          <w:instrText xml:space="preserve"> PAGEREF _Toc238122928 \h </w:instrText>
         </w:r>
         <w:r>
           <w:rPr>
@@ -1632,7 +1632,7 @@
           <w14:ligatures w14:val="standardContextual"/>
         </w:rPr>
       </w:pPr>
-      <w:hyperlink w:anchor="_Toc238122630" w:history="1">
+      <w:hyperlink w:anchor="_Toc238122929" w:history="1">
         <w:r>
           <w:rPr>
             <w:rStyle w:val="Hyperlink"/>
@@ -1659,7 +1659,7 @@
             <w:noProof/>
             <w:webHidden/>
           </w:rPr>
-          <w:instrText xml:space="preserve"> PAGEREF _Toc238122630 \h </w:instrText>
+          <w:instrText xml:space="preserve"> PAGEREF _Toc238122929 \h </w:instrText>
         </w:r>
         <w:r>
           <w:rPr>
@@ -1679,7 +1679,7 @@
             <w:noProof/>
             <w:webHidden/>
           </w:rPr>
-          <w:t>8</w:t>
+          <w:t>9</w:t>
         </w:r>
         <w:r>
           <w:rPr>
@@ -1707,7 +1707,7 @@
           <w14:ligatures w14:val="standardContextual"/>
         </w:rPr>
       </w:pPr>
-      <w:hyperlink w:anchor="_Toc238122631" w:history="1">
+      <w:hyperlink w:anchor="_Toc238122930" w:history="1">
         <w:r>
           <w:rPr>
             <w:rStyle w:val="Hyperlink"/>
@@ -1734,7 +1734,7 @@
             <w:noProof/>
             <w:webHidden/>
           </w:rPr>
-          <w:instrText xml:space="preserve"> PAGEREF _Toc238122631 \h </w:instrText>
+          <w:instrText xml:space="preserve"> PAGEREF _Toc238122930 \h </w:instrText>
         </w:r>
         <w:r>
           <w:rPr>
@@ -1754,7 +1754,7 @@
             <w:noProof/>
             <w:webHidden/>
           </w:rPr>
-          <w:t>9</w:t>
+          <w:t>10</w:t>
         </w:r>
         <w:r>
           <w:rPr>
@@ -1782,7 +1782,7 @@
           <w14:ligatures w14:val="standardContextual"/>
         </w:rPr>
       </w:pPr>
-      <w:hyperlink w:anchor="_Toc238122632" w:history="1">
+      <w:hyperlink w:anchor="_Toc238122931" w:history="1">
         <w:r>
           <w:rPr>
             <w:rStyle w:val="Hyperlink"/>
@@ -1809,7 +1809,7 @@
             <w:noProof/>
             <w:webHidden/>
           </w:rPr>
-          <w:instrText xml:space="preserve"> PAGEREF _Toc238122632 \h </w:instrText>
+          <w:instrText xml:space="preserve"> PAGEREF _Toc238122931 \h </w:instrText>
         </w:r>
         <w:r>
           <w:rPr>
@@ -1857,7 +1857,7 @@
           <w14:ligatures w14:val="standardContextual"/>
         </w:rPr>
       </w:pPr>
-      <w:hyperlink w:anchor="_Toc238122633" w:history="1">
+      <w:hyperlink w:anchor="_Toc238122932" w:history="1">
         <w:r>
           <w:rPr>
             <w:rStyle w:val="Hyperlink"/>
@@ -1884,7 +1884,7 @@
             <w:noProof/>
             <w:webHidden/>
           </w:rPr>
-          <w:instrText xml:space="preserve"> PAGEREF _Toc238122633 \h </w:instrText>
+          <w:instrText xml:space="preserve"> PAGEREF _Toc238122932 \h </w:instrText>
         </w:r>
         <w:r>
           <w:rPr>
@@ -1932,7 +1932,7 @@
           <w14:ligatures w14:val="standardContextual"/>
         </w:rPr>
       </w:pPr>
-      <w:hyperlink w:anchor="_Toc238122634" w:history="1">
+      <w:hyperlink w:anchor="_Toc238122933" w:history="1">
         <w:r>
           <w:rPr>
             <w:rStyle w:val="Hyperlink"/>
@@ -1959,7 +1959,7 @@
             <w:noProof/>
             <w:webHidden/>
           </w:rPr>
-          <w:instrText xml:space="preserve"> PAGEREF _Toc238122634 \h </w:instrText>
+          <w:instrText xml:space="preserve"> PAGEREF _Toc238122933 \h </w:instrText>
         </w:r>
         <w:r>
           <w:rPr>
@@ -1979,7 +1979,7 @@
             <w:noProof/>
             <w:webHidden/>
           </w:rPr>
-          <w:t>11</w:t>
+          <w:t>12</w:t>
         </w:r>
         <w:r>
           <w:rPr>
@@ -2007,7 +2007,7 @@
           <w14:ligatures w14:val="standardContextual"/>
         </w:rPr>
       </w:pPr>
-      <w:hyperlink w:anchor="_Toc238122635" w:history="1">
+      <w:hyperlink w:anchor="_Toc238122934" w:history="1">
         <w:r>
           <w:rPr>
             <w:rStyle w:val="Hyperlink"/>
@@ -2034,7 +2034,7 @@
             <w:noProof/>
             <w:webHidden/>
           </w:rPr>
-          <w:instrText xml:space="preserve"> PAGEREF _Toc238122635 \h </w:instrText>
+          <w:instrText xml:space="preserve"> PAGEREF _Toc238122934 \h </w:instrText>
         </w:r>
         <w:r>
           <w:rPr>
@@ -2054,7 +2054,7 @@
             <w:noProof/>
             <w:webHidden/>
           </w:rPr>
-          <w:t>12</w:t>
+          <w:t>13</w:t>
         </w:r>
         <w:r>
           <w:rPr>
@@ -2082,7 +2082,7 @@
           <w14:ligatures w14:val="standardContextual"/>
         </w:rPr>
       </w:pPr>
-      <w:hyperlink w:anchor="_Toc238122636" w:history="1">
+      <w:hyperlink w:anchor="_Toc238122935" w:history="1">
         <w:r>
           <w:rPr>
             <w:rStyle w:val="Hyperlink"/>
@@ -2109,7 +2109,7 @@
             <w:noProof/>
             <w:webHidden/>
           </w:rPr>
-          <w:instrText xml:space="preserve"> PAGEREF _Toc238122636 \h </w:instrText>
+          <w:instrText xml:space="preserve"> PAGEREF _Toc238122935 \h </w:instrText>
         </w:r>
         <w:r>
           <w:rPr>
@@ -2129,7 +2129,7 @@
             <w:noProof/>
             <w:webHidden/>
           </w:rPr>
-          <w:t>13</w:t>
+          <w:t>14</w:t>
         </w:r>
         <w:r>
           <w:rPr>
@@ -2157,7 +2157,7 @@
           <w14:ligatures w14:val="standardContextual"/>
         </w:rPr>
       </w:pPr>
-      <w:hyperlink w:anchor="_Toc238122637" w:history="1">
+      <w:hyperlink w:anchor="_Toc238122936" w:history="1">
         <w:r>
           <w:rPr>
             <w:rStyle w:val="Hyperlink"/>
@@ -2184,7 +2184,7 @@
             <w:noProof/>
             <w:webHidden/>
           </w:rPr>
-          <w:instrText xml:space="preserve"> PAGEREF _Toc238122637 \h </w:instrText>
+          <w:instrText xml:space="preserve"> PAGEREF _Toc238122936 \h </w:instrText>
         </w:r>
         <w:r>
           <w:rPr>
@@ -2204,7 +2204,7 @@
             <w:noProof/>
             <w:webHidden/>
           </w:rPr>
-          <w:t>13</w:t>
+          <w:t>15</w:t>
         </w:r>
         <w:r>
           <w:rPr>
@@ -2232,7 +2232,7 @@
           <w14:ligatures w14:val="standardContextual"/>
         </w:rPr>
       </w:pPr>
-      <w:hyperlink w:anchor="_Toc238122638" w:history="1">
+      <w:hyperlink w:anchor="_Toc238122937" w:history="1">
         <w:r>
           <w:rPr>
             <w:rStyle w:val="Hyperlink"/>
@@ -2259,7 +2259,7 @@
             <w:noProof/>
             <w:webHidden/>
           </w:rPr>
-          <w:instrText xml:space="preserve"> PAGEREF _Toc238122638 \h </w:instrText>
+          <w:instrText xml:space="preserve"> PAGEREF _Toc238122937 \h </w:instrText>
         </w:r>
         <w:r>
           <w:rPr>
@@ -2279,7 +2279,7 @@
             <w:noProof/>
             <w:webHidden/>
           </w:rPr>
-          <w:t>14</w:t>
+          <w:t>16</w:t>
         </w:r>
         <w:r>
           <w:rPr>
@@ -2307,7 +2307,7 @@
           <w14:ligatures w14:val="standardContextual"/>
         </w:rPr>
       </w:pPr>
-      <w:hyperlink w:anchor="_Toc238122639" w:history="1">
+      <w:hyperlink w:anchor="_Toc238122938" w:history="1">
         <w:r>
           <w:rPr>
             <w:rStyle w:val="Hyperlink"/>
@@ -2334,7 +2334,7 @@
             <w:noProof/>
             <w:webHidden/>
           </w:rPr>
-          <w:instrText xml:space="preserve"> PAGEREF _Toc238122639 \h </w:instrText>
+          <w:instrText xml:space="preserve"> PAGEREF _Toc238122938 \h </w:instrText>
         </w:r>
         <w:r>
           <w:rPr>
@@ -2354,7 +2354,7 @@
             <w:noProof/>
             <w:webHidden/>
           </w:rPr>
-          <w:t>15</w:t>
+          <w:t>16</w:t>
         </w:r>
         <w:r>
           <w:rPr>
@@ -2382,7 +2382,7 @@
           <w14:ligatures w14:val="standardContextual"/>
         </w:rPr>
       </w:pPr>
-      <w:hyperlink w:anchor="_Toc238122640" w:history="1">
+      <w:hyperlink w:anchor="_Toc238122939" w:history="1">
         <w:r>
           <w:rPr>
             <w:rStyle w:val="Hyperlink"/>
@@ -2409,7 +2409,7 @@
             <w:noProof/>
             <w:webHidden/>
           </w:rPr>
-          <w:instrText xml:space="preserve"> PAGEREF _Toc238122640 \h </w:instrText>
+          <w:instrText xml:space="preserve"> PAGEREF _Toc238122939 \h </w:instrText>
         </w:r>
         <w:r>
           <w:rPr>
@@ -2429,7 +2429,7 @@
             <w:noProof/>
             <w:webHidden/>
           </w:rPr>
-          <w:t>15</w:t>
+          <w:t>17</w:t>
         </w:r>
         <w:r>
           <w:rPr>
@@ -2457,7 +2457,7 @@
           <w14:ligatures w14:val="standardContextual"/>
         </w:rPr>
       </w:pPr>
-      <w:hyperlink w:anchor="_Toc238122641" w:history="1">
+      <w:hyperlink w:anchor="_Toc238122940" w:history="1">
         <w:r>
           <w:rPr>
             <w:rStyle w:val="Hyperlink"/>
@@ -2484,7 +2484,7 @@
             <w:noProof/>
             <w:webHidden/>
           </w:rPr>
-          <w:instrText xml:space="preserve"> PAGEREF _Toc238122641 \h </w:instrText>
+          <w:instrText xml:space="preserve"> PAGEREF _Toc238122940 \h </w:instrText>
         </w:r>
         <w:r>
           <w:rPr>
@@ -2504,7 +2504,7 @@
             <w:noProof/>
             <w:webHidden/>
           </w:rPr>
-          <w:t>15</w:t>
+          <w:t>17</w:t>
         </w:r>
         <w:r>
           <w:rPr>
@@ -2532,7 +2532,7 @@
           <w14:ligatures w14:val="standardContextual"/>
         </w:rPr>
       </w:pPr>
-      <w:hyperlink w:anchor="_Toc238122642" w:history="1">
+      <w:hyperlink w:anchor="_Toc238122941" w:history="1">
         <w:r>
           <w:rPr>
             <w:rStyle w:val="Hyperlink"/>
@@ -2559,7 +2559,7 @@
             <w:noProof/>
             <w:webHidden/>
           </w:rPr>
-          <w:instrText xml:space="preserve"> PAGEREF _Toc238122642 \h </w:instrText>
+          <w:instrText xml:space="preserve"> PAGEREF _Toc238122941 \h </w:instrText>
         </w:r>
         <w:r>
           <w:rPr>
@@ -2579,7 +2579,7 @@
             <w:noProof/>
             <w:webHidden/>
           </w:rPr>
-          <w:t>16</w:t>
+          <w:t>18</w:t>
         </w:r>
         <w:r>
           <w:rPr>
@@ -2607,7 +2607,7 @@
           <w14:ligatures w14:val="standardContextual"/>
         </w:rPr>
       </w:pPr>
-      <w:hyperlink w:anchor="_Toc238122643" w:history="1">
+      <w:hyperlink w:anchor="_Toc238122942" w:history="1">
         <w:r>
           <w:rPr>
             <w:rStyle w:val="Hyperlink"/>
@@ -2634,7 +2634,7 @@
             <w:noProof/>
             <w:webHidden/>
           </w:rPr>
-          <w:instrText xml:space="preserve"> PAGEREF _Toc238122643 \h </w:instrText>
+          <w:instrText xml:space="preserve"> PAGEREF _Toc238122942 \h </w:instrText>
         </w:r>
         <w:r>
           <w:rPr>
@@ -2654,7 +2654,7 @@
             <w:noProof/>
             <w:webHidden/>
           </w:rPr>
-          <w:t>16</w:t>
+          <w:t>18</w:t>
         </w:r>
         <w:r>
           <w:rPr>
@@ -2682,7 +2682,7 @@
           <w14:ligatures w14:val="standardContextual"/>
         </w:rPr>
       </w:pPr>
-      <w:hyperlink w:anchor="_Toc238122644" w:history="1">
+      <w:hyperlink w:anchor="_Toc238122943" w:history="1">
         <w:r>
           <w:rPr>
             <w:rStyle w:val="Hyperlink"/>
@@ -2709,7 +2709,7 @@
             <w:noProof/>
             <w:webHidden/>
           </w:rPr>
-          <w:instrText xml:space="preserve"> PAGEREF _Toc238122644 \h </w:instrText>
+          <w:instrText xml:space="preserve"> PAGEREF _Toc238122943 \h </w:instrText>
         </w:r>
         <w:r>
           <w:rPr>
@@ -2729,7 +2729,7 @@
             <w:noProof/>
             <w:webHidden/>
           </w:rPr>
-          <w:t>17</w:t>
+          <w:t>19</w:t>
         </w:r>
         <w:r>
           <w:rPr>
@@ -2757,7 +2757,7 @@
           <w14:ligatures w14:val="standardContextual"/>
         </w:rPr>
       </w:pPr>
-      <w:hyperlink w:anchor="_Toc238122645" w:history="1">
+      <w:hyperlink w:anchor="_Toc238122944" w:history="1">
         <w:r>
           <w:rPr>
             <w:rStyle w:val="Hyperlink"/>
@@ -2784,7 +2784,7 @@
             <w:noProof/>
             <w:webHidden/>
           </w:rPr>
-          <w:instrText xml:space="preserve"> PAGEREF _Toc238122645 \h </w:instrText>
+          <w:instrText xml:space="preserve"> PAGEREF _Toc238122944 \h </w:instrText>
         </w:r>
         <w:r>
           <w:rPr>
@@ -2804,7 +2804,7 @@
             <w:noProof/>
             <w:webHidden/>
           </w:rPr>
-          <w:t>18</w:t>
+          <w:t>19</w:t>
         </w:r>
         <w:r>
           <w:rPr>
@@ -2832,7 +2832,7 @@
           <w14:ligatures w14:val="standardContextual"/>
         </w:rPr>
       </w:pPr>
-      <w:hyperlink w:anchor="_Toc238122646" w:history="1">
+      <w:hyperlink w:anchor="_Toc238122945" w:history="1">
         <w:r>
           <w:rPr>
             <w:rStyle w:val="Hyperlink"/>
@@ -2859,7 +2859,7 @@
             <w:noProof/>
             <w:webHidden/>
           </w:rPr>
-          <w:instrText xml:space="preserve"> PAGEREF _Toc238122646 \h </w:instrText>
+          <w:instrText xml:space="preserve"> PAGEREF _Toc238122945 \h </w:instrText>
         </w:r>
         <w:r>
           <w:rPr>
@@ -2879,7 +2879,7 @@
             <w:noProof/>
             <w:webHidden/>
           </w:rPr>
-          <w:t>18</w:t>
+          <w:t>20</w:t>
         </w:r>
         <w:r>
           <w:rPr>
@@ -2907,7 +2907,7 @@
           <w14:ligatures w14:val="standardContextual"/>
         </w:rPr>
       </w:pPr>
-      <w:hyperlink w:anchor="_Toc238122647" w:history="1">
+      <w:hyperlink w:anchor="_Toc238122946" w:history="1">
         <w:r>
           <w:rPr>
             <w:rStyle w:val="Hyperlink"/>
@@ -2934,7 +2934,7 @@
             <w:noProof/>
             <w:webHidden/>
           </w:rPr>
-          <w:instrText xml:space="preserve"> PAGEREF _Toc238122647 \h </w:instrText>
+          <w:instrText xml:space="preserve"> PAGEREF _Toc238122946 \h </w:instrText>
         </w:r>
         <w:r>
           <w:rPr>
@@ -2954,7 +2954,7 @@
             <w:noProof/>
             <w:webHidden/>
           </w:rPr>
-          <w:t>19</w:t>
+          <w:t>20</w:t>
         </w:r>
         <w:r>
           <w:rPr>
@@ -2982,7 +2982,7 @@
           <w14:ligatures w14:val="standardContextual"/>
         </w:rPr>
       </w:pPr>
-      <w:hyperlink w:anchor="_Toc238122648" w:history="1">
+      <w:hyperlink w:anchor="_Toc238122947" w:history="1">
         <w:r>
           <w:rPr>
             <w:rStyle w:val="Hyperlink"/>
@@ -3009,7 +3009,7 @@
             <w:noProof/>
             <w:webHidden/>
           </w:rPr>
-          <w:instrText xml:space="preserve"> PAGEREF _Toc238122648 \h </w:instrText>
+          <w:instrText xml:space="preserve"> PAGEREF _Toc238122947 \h </w:instrText>
         </w:r>
         <w:r>
           <w:rPr>
@@ -3029,7 +3029,7 @@
             <w:noProof/>
             <w:webHidden/>
           </w:rPr>
-          <w:t>19</w:t>
+          <w:t>21</w:t>
         </w:r>
         <w:r>
           <w:rPr>
@@ -3057,7 +3057,7 @@
           <w14:ligatures w14:val="standardContextual"/>
         </w:rPr>
       </w:pPr>
-      <w:hyperlink w:anchor="_Toc238122649" w:history="1">
+      <w:hyperlink w:anchor="_Toc238122948" w:history="1">
         <w:r>
           <w:rPr>
             <w:rStyle w:val="Hyperlink"/>
@@ -3084,7 +3084,7 @@
             <w:noProof/>
             <w:webHidden/>
           </w:rPr>
-          <w:instrText xml:space="preserve"> PAGEREF _Toc238122649 \h </w:instrText>
+          <w:instrText xml:space="preserve"> PAGEREF _Toc238122948 \h </w:instrText>
         </w:r>
         <w:r>
           <w:rPr>
@@ -3104,7 +3104,7 @@
             <w:noProof/>
             <w:webHidden/>
           </w:rPr>
-          <w:t>20</w:t>
+          <w:t>21</w:t>
         </w:r>
         <w:r>
           <w:rPr>
@@ -3132,7 +3132,7 @@
           <w14:ligatures w14:val="standardContextual"/>
         </w:rPr>
       </w:pPr>
-      <w:hyperlink w:anchor="_Toc238122650" w:history="1">
+      <w:hyperlink w:anchor="_Toc238122949" w:history="1">
         <w:r>
           <w:rPr>
             <w:rStyle w:val="Hyperlink"/>
@@ -3159,7 +3159,7 @@
             <w:noProof/>
             <w:webHidden/>
           </w:rPr>
-          <w:instrText xml:space="preserve"> PAGEREF _Toc238122650 \h </w:instrText>
+          <w:instrText xml:space="preserve"> PAGEREF _Toc238122949 \h </w:instrText>
         </w:r>
         <w:r>
           <w:rPr>
@@ -3179,7 +3179,7 @@
             <w:noProof/>
             <w:webHidden/>
           </w:rPr>
-          <w:t>20</w:t>
+          <w:t>21</w:t>
         </w:r>
         <w:r>
           <w:rPr>
@@ -3207,7 +3207,7 @@
           <w14:ligatures w14:val="standardContextual"/>
         </w:rPr>
       </w:pPr>
-      <w:hyperlink w:anchor="_Toc238122651" w:history="1">
+      <w:hyperlink w:anchor="_Toc238122950" w:history="1">
         <w:r>
           <w:rPr>
             <w:rStyle w:val="Hyperlink"/>
@@ -3234,7 +3234,7 @@
             <w:noProof/>
             <w:webHidden/>
           </w:rPr>
-          <w:instrText xml:space="preserve"> PAGEREF _Toc238122651 \h </w:instrText>
+          <w:instrText xml:space="preserve"> PAGEREF _Toc238122950 \h </w:instrText>
         </w:r>
         <w:r>
           <w:rPr>
@@ -3254,7 +3254,7 @@
             <w:noProof/>
             <w:webHidden/>
           </w:rPr>
-          <w:t>20</w:t>
+          <w:t>22</w:t>
         </w:r>
         <w:r>
           <w:rPr>
@@ -3282,7 +3282,7 @@
           <w14:ligatures w14:val="standardContextual"/>
         </w:rPr>
       </w:pPr>
-      <w:hyperlink w:anchor="_Toc238122652" w:history="1">
+      <w:hyperlink w:anchor="_Toc238122951" w:history="1">
         <w:r>
           <w:rPr>
             <w:rStyle w:val="Hyperlink"/>
@@ -3309,7 +3309,7 @@
             <w:noProof/>
             <w:webHidden/>
           </w:rPr>
-          <w:instrText xml:space="preserve"> PAGEREF _Toc238122652 \h </w:instrText>
+          <w:instrText xml:space="preserve"> PAGEREF _Toc238122951 \h </w:instrText>
         </w:r>
         <w:r>
           <w:rPr>
@@ -3329,7 +3329,7 @@
             <w:noProof/>
             <w:webHidden/>
           </w:rPr>
-          <w:t>20</w:t>
+          <w:t>22</w:t>
         </w:r>
         <w:r>
           <w:rPr>
@@ -3357,7 +3357,7 @@
           <w14:ligatures w14:val="standardContextual"/>
         </w:rPr>
       </w:pPr>
-      <w:hyperlink w:anchor="_Toc238122653" w:history="1">
+      <w:hyperlink w:anchor="_Toc238122952" w:history="1">
         <w:r>
           <w:rPr>
             <w:rStyle w:val="Hyperlink"/>
@@ -3384,7 +3384,7 @@
             <w:noProof/>
             <w:webHidden/>
           </w:rPr>
-          <w:instrText xml:space="preserve"> PAGEREF _Toc238122653 \h </w:instrText>
+          <w:instrText xml:space="preserve"> PAGEREF _Toc238122952 \h </w:instrText>
         </w:r>
         <w:r>
           <w:rPr>
@@ -3404,7 +3404,7 @@
             <w:noProof/>
             <w:webHidden/>
           </w:rPr>
-          <w:t>21</w:t>
+          <w:t>22</w:t>
         </w:r>
         <w:r>
           <w:rPr>
@@ -3432,7 +3432,7 @@
           <w14:ligatures w14:val="standardContextual"/>
         </w:rPr>
       </w:pPr>
-      <w:hyperlink w:anchor="_Toc238122654" w:history="1">
+      <w:hyperlink w:anchor="_Toc238122953" w:history="1">
         <w:r>
           <w:rPr>
             <w:rStyle w:val="Hyperlink"/>
@@ -3459,7 +3459,7 @@
             <w:noProof/>
             <w:webHidden/>
           </w:rPr>
-          <w:instrText xml:space="preserve"> PAGEREF _Toc238122654 \h </w:instrText>
+          <w:instrText xml:space="preserve"> PAGEREF _Toc238122953 \h </w:instrText>
         </w:r>
         <w:r>
           <w:rPr>
@@ -3479,7 +3479,7 @@
             <w:noProof/>
             <w:webHidden/>
           </w:rPr>
-          <w:t>21</w:t>
+          <w:t>23</w:t>
         </w:r>
         <w:r>
           <w:rPr>
@@ -3507,7 +3507,7 @@
           <w14:ligatures w14:val="standardContextual"/>
         </w:rPr>
       </w:pPr>
-      <w:hyperlink w:anchor="_Toc238122655" w:history="1">
+      <w:hyperlink w:anchor="_Toc238122954" w:history="1">
         <w:r>
           <w:rPr>
             <w:rStyle w:val="Hyperlink"/>
@@ -3534,7 +3534,7 @@
             <w:noProof/>
             <w:webHidden/>
           </w:rPr>
-          <w:instrText xml:space="preserve"> PAGEREF _Toc238122655 \h </w:instrText>
+          <w:instrText xml:space="preserve"> PAGEREF _Toc238122954 \h </w:instrText>
         </w:r>
         <w:r>
           <w:rPr>
@@ -3554,7 +3554,7 @@
             <w:noProof/>
             <w:webHidden/>
           </w:rPr>
-          <w:t>22</w:t>
+          <w:t>24</w:t>
         </w:r>
         <w:r>
           <w:rPr>
@@ -3582,7 +3582,7 @@
           <w14:ligatures w14:val="standardContextual"/>
         </w:rPr>
       </w:pPr>
-      <w:hyperlink w:anchor="_Toc238122656" w:history="1">
+      <w:hyperlink w:anchor="_Toc238122955" w:history="1">
         <w:r>
           <w:rPr>
             <w:rStyle w:val="Hyperlink"/>
@@ -3609,7 +3609,7 @@
             <w:noProof/>
             <w:webHidden/>
           </w:rPr>
-          <w:instrText xml:space="preserve"> PAGEREF _Toc238122656 \h </w:instrText>
+          <w:instrText xml:space="preserve"> PAGEREF _Toc238122955 \h </w:instrText>
         </w:r>
         <w:r>
           <w:rPr>
@@ -3629,7 +3629,7 @@
             <w:noProof/>
             <w:webHidden/>
           </w:rPr>
-          <w:t>22</w:t>
+          <w:t>24</w:t>
         </w:r>
         <w:r>
           <w:rPr>
@@ -3657,7 +3657,7 @@
           <w14:ligatures w14:val="standardContextual"/>
         </w:rPr>
       </w:pPr>
-      <w:hyperlink w:anchor="_Toc238122657" w:history="1">
+      <w:hyperlink w:anchor="_Toc238122956" w:history="1">
         <w:r>
           <w:rPr>
             <w:rStyle w:val="Hyperlink"/>
@@ -3684,7 +3684,7 @@
             <w:noProof/>
             <w:webHidden/>
           </w:rPr>
-          <w:instrText xml:space="preserve"> PAGEREF _Toc238122657 \h </w:instrText>
+          <w:instrText xml:space="preserve"> PAGEREF _Toc238122956 \h </w:instrText>
         </w:r>
         <w:r>
           <w:rPr>
@@ -3704,7 +3704,7 @@
             <w:noProof/>
             <w:webHidden/>
           </w:rPr>
-          <w:t>22</w:t>
+          <w:t>24</w:t>
         </w:r>
         <w:r>
           <w:rPr>
@@ -3732,7 +3732,7 @@
           <w14:ligatures w14:val="standardContextual"/>
         </w:rPr>
       </w:pPr>
-      <w:hyperlink w:anchor="_Toc238122658" w:history="1">
+      <w:hyperlink w:anchor="_Toc238122957" w:history="1">
         <w:r>
           <w:rPr>
             <w:rStyle w:val="Hyperlink"/>
@@ -3759,7 +3759,7 @@
             <w:noProof/>
             <w:webHidden/>
           </w:rPr>
-          <w:instrText xml:space="preserve"> PAGEREF _Toc238122658 \h </w:instrText>
+          <w:instrText xml:space="preserve"> PAGEREF _Toc238122957 \h </w:instrText>
         </w:r>
         <w:r>
           <w:rPr>
@@ -3779,7 +3779,7 @@
             <w:noProof/>
             <w:webHidden/>
           </w:rPr>
-          <w:t>22</w:t>
+          <w:t>24</w:t>
         </w:r>
         <w:r>
           <w:rPr>
@@ -3807,7 +3807,7 @@
           <w14:ligatures w14:val="standardContextual"/>
         </w:rPr>
       </w:pPr>
-      <w:hyperlink w:anchor="_Toc238122659" w:history="1">
+      <w:hyperlink w:anchor="_Toc238122958" w:history="1">
         <w:r>
           <w:rPr>
             <w:rStyle w:val="Hyperlink"/>
@@ -3834,7 +3834,7 @@
             <w:noProof/>
             <w:webHidden/>
           </w:rPr>
-          <w:instrText xml:space="preserve"> PAGEREF _Toc238122659 \h </w:instrText>
+          <w:instrText xml:space="preserve"> PAGEREF _Toc238122958 \h </w:instrText>
         </w:r>
         <w:r>
           <w:rPr>
@@ -3854,7 +3854,7 @@
             <w:noProof/>
             <w:webHidden/>
           </w:rPr>
-          <w:t>23</w:t>
+          <w:t>24</w:t>
         </w:r>
         <w:r>
           <w:rPr>
@@ -3882,7 +3882,7 @@
           <w14:ligatures w14:val="standardContextual"/>
         </w:rPr>
       </w:pPr>
-      <w:hyperlink w:anchor="_Toc238122660" w:history="1">
+      <w:hyperlink w:anchor="_Toc238122959" w:history="1">
         <w:r>
           <w:rPr>
             <w:rStyle w:val="Hyperlink"/>
@@ -3909,7 +3909,7 @@
             <w:noProof/>
             <w:webHidden/>
           </w:rPr>
-          <w:instrText xml:space="preserve"> PAGEREF _Toc238122660 \h </w:instrText>
+          <w:instrText xml:space="preserve"> PAGEREF _Toc238122959 \h </w:instrText>
         </w:r>
         <w:r>
           <w:rPr>
@@ -3929,7 +3929,7 @@
             <w:noProof/>
             <w:webHidden/>
           </w:rPr>
-          <w:t>23</w:t>
+          <w:t>25</w:t>
         </w:r>
         <w:r>
           <w:rPr>
@@ -3956,7 +3956,7 @@
       <w:pPr>
         <w:pStyle w:val="Heading1"/>
       </w:pPr>
-      <w:bookmarkStart w:id="1" w:name="_Toc238122612"/>
+      <w:bookmarkStart w:id="1" w:name="_Toc238122911"/>
       <w:r>
         <w:rPr>
           <w:rFonts w:ascii="Times New Roman" w:eastAsia="Times New Roman" w:hAnsi="Times New Roman"/>
@@ -4066,7 +4066,7 @@
       <w:pPr>
         <w:pStyle w:val="Heading1"/>
       </w:pPr>
-      <w:bookmarkStart w:id="2" w:name="_Toc238122613"/>
+      <w:bookmarkStart w:id="2" w:name="_Toc238122912"/>
       <w:r>
         <w:rPr>
           <w:rFonts w:ascii="Times New Roman" w:eastAsia="Times New Roman" w:hAnsi="Times New Roman"/>
@@ -4112,7 +4112,7 @@
       <w:pPr>
         <w:pStyle w:val="Heading1"/>
       </w:pPr>
-      <w:bookmarkStart w:id="3" w:name="_Toc238122614"/>
+      <w:bookmarkStart w:id="3" w:name="_Toc238122913"/>
       <w:r>
         <w:rPr>
           <w:rFonts w:ascii="Times New Roman" w:eastAsia="Times New Roman" w:hAnsi="Times New Roman"/>
@@ -4753,7 +4753,7 @@
       <w:pPr>
         <w:pStyle w:val="Heading1"/>
       </w:pPr>
-      <w:bookmarkStart w:id="4" w:name="_Toc238122615"/>
+      <w:bookmarkStart w:id="4" w:name="_Toc238122914"/>
       <w:r>
         <w:rPr>
           <w:rFonts w:ascii="Times New Roman" w:eastAsia="Times New Roman" w:hAnsi="Times New Roman"/>
@@ -4816,7 +4816,7 @@
       <w:pPr>
         <w:pStyle w:val="Heading1"/>
       </w:pPr>
-      <w:bookmarkStart w:id="5" w:name="_Toc238122616"/>
+      <w:bookmarkStart w:id="5" w:name="_Toc238122915"/>
       <w:r>
         <w:rPr>
           <w:rFonts w:ascii="Times New Roman" w:eastAsia="Times New Roman" w:hAnsi="Times New Roman"/>
@@ -4829,7 +4829,7 @@
       <w:pPr>
         <w:pStyle w:val="Heading2"/>
       </w:pPr>
-      <w:bookmarkStart w:id="6" w:name="_Toc238122617"/>
+      <w:bookmarkStart w:id="6" w:name="_Toc238122916"/>
       <w:r>
         <w:rPr>
           <w:rFonts w:ascii="Times New Roman" w:eastAsia="Times New Roman" w:hAnsi="Times New Roman"/>
@@ -4861,7 +4861,7 @@
       <w:pPr>
         <w:pStyle w:val="Heading2"/>
       </w:pPr>
-      <w:bookmarkStart w:id="7" w:name="_Toc238122618"/>
+      <w:bookmarkStart w:id="7" w:name="_Toc238122917"/>
       <w:r>
         <w:rPr>
           <w:rFonts w:ascii="Times New Roman" w:eastAsia="Times New Roman" w:hAnsi="Times New Roman"/>
@@ -4870,7 +4870,48 @@
       </w:r>
       <w:bookmarkEnd w:id="7"/>
     </w:p>
-    <w:p/>
+    <w:p>
+      <w:r>
+        <w:rPr>
+          <w:noProof/>
+        </w:rPr>
+        <w:drawing>
+          <wp:inline distT="0" distB="0" distL="0" distR="0" wp14:anchorId="2B54839B" wp14:editId="64498921">
+            <wp:extent cx="5760720" cy="2918765"/>
+            <wp:effectExtent l="0" t="0" r="0" b="0"/>
+            <wp:docPr id="1" name="Picture 1"/>
+            <wp:cNvGraphicFramePr>
+              <a:graphicFrameLocks xmlns:a="http://schemas.openxmlformats.org/drawingml/2006/main" noChangeAspect="1"/>
+            </wp:cNvGraphicFramePr>
+            <a:graphic xmlns:a="http://schemas.openxmlformats.org/drawingml/2006/main">
+              <a:graphicData uri="http://schemas.openxmlformats.org/drawingml/2006/picture">
+                <pic:pic xmlns:pic="http://schemas.openxmlformats.org/drawingml/2006/picture">
+                  <pic:nvPicPr>
+                    <pic:cNvPr id="0" name="example_logic.png"/>
+                    <pic:cNvPicPr/>
+                  </pic:nvPicPr>
+                  <pic:blipFill>
+                    <a:blip r:embed="rId9"/>
+                    <a:stretch>
+                      <a:fillRect/>
+                    </a:stretch>
+                  </pic:blipFill>
+                  <pic:spPr>
+                    <a:xfrm>
+                      <a:off x="0" y="0"/>
+                      <a:ext cx="5760720" cy="2918765"/>
+                    </a:xfrm>
+                    <a:prstGeom prst="rect">
+                      <a:avLst/>
+                    </a:prstGeom>
+                  </pic:spPr>
+                </pic:pic>
+              </a:graphicData>
+            </a:graphic>
+          </wp:inline>
+        </w:drawing>
+      </w:r>
+    </w:p>
     <w:p>
       <w:pPr>
         <w:pStyle w:val="Caption"/>
@@ -5042,6 +5083,7 @@
               <w:rPr>
                 <w:sz w:val="23"/>
               </w:rPr>
+              <w:lastRenderedPageBreak/>
               <w:t>Đọc mã OTP cho tôi.</w:t>
             </w:r>
           </w:p>
@@ -5334,18 +5376,14 @@
         <w:ind w:firstLine="567"/>
       </w:pPr>
       <w:r>
-        <w:t xml:space="preserve">Ba câu trên có phần từ vựng rất giống nhau. Nếu mô hình chỉ học sự đồng xuất hiện giữa “OTP” và “đọc”, cả ba câu có thể bị đẩy về cùng một nhãn. ScamGuard-VN </w:t>
-      </w:r>
-      <w:r>
-        <w:lastRenderedPageBreak/>
-        <w:t>tách “hành động được đề cập” khỏi “hành động có thực sự được yêu cầu hay không”. Cách tách này cho phép hệ thống ghi nhận rằng cả ba câu đều liên quan đến cung cấp thông tin bí mật, nhưng chỉ câu thứ nhất là yêu cầu trực tiếp ở thời điểm quan sát.</w:t>
+        <w:t>Ba câu trên có phần từ vựng rất giống nhau. Nếu mô hình chỉ học sự đồng xuất hiện giữa “OTP” và “đọc”, cả ba câu có thể bị đẩy về cùng một nhãn. ScamGuard-VN tách “hành động được đề cập” khỏi “hành động có thực sự được yêu cầu hay không”. Cách tách này cho phép hệ thống ghi nhận rằng cả ba câu đều liên quan đến cung cấp thông tin bí mật, nhưng chỉ câu thứ nhất là yêu cầu trực tiếp ở thời điểm quan sát.</w:t>
       </w:r>
     </w:p>
     <w:p>
       <w:pPr>
         <w:pStyle w:val="Heading2"/>
       </w:pPr>
-      <w:bookmarkStart w:id="8" w:name="_Toc238122619"/>
+      <w:bookmarkStart w:id="8" w:name="_Toc238122918"/>
       <w:r>
         <w:rPr>
           <w:rFonts w:ascii="Times New Roman" w:eastAsia="Times New Roman" w:hAnsi="Times New Roman"/>
@@ -5374,7 +5412,7 @@
       <w:pPr>
         <w:pStyle w:val="Heading2"/>
       </w:pPr>
-      <w:bookmarkStart w:id="9" w:name="_Toc238122620"/>
+      <w:bookmarkStart w:id="9" w:name="_Toc238122919"/>
       <w:r>
         <w:rPr>
           <w:rFonts w:ascii="Times New Roman" w:eastAsia="Times New Roman" w:hAnsi="Times New Roman"/>
@@ -5410,6 +5448,7 @@
         <w:ind w:left="425" w:hanging="198"/>
       </w:pPr>
       <w:r>
+        <w:lastRenderedPageBreak/>
         <w:t xml:space="preserve"> Giảm hiện tượng học dựa trên từ khóa bằng các cặp dữ liệu đối chứng tối thiểu và mẫu âm khó.</w:t>
       </w:r>
     </w:p>
@@ -5437,7 +5476,7 @@
       <w:pPr>
         <w:pStyle w:val="Heading2"/>
       </w:pPr>
-      <w:bookmarkStart w:id="10" w:name="_Toc238122621"/>
+      <w:bookmarkStart w:id="10" w:name="_Toc238122920"/>
       <w:r>
         <w:rPr>
           <w:rFonts w:ascii="Times New Roman" w:eastAsia="Times New Roman" w:hAnsi="Times New Roman"/>
@@ -5451,18 +5490,14 @@
         <w:ind w:firstLine="567"/>
       </w:pPr>
       <w:r>
-        <w:t xml:space="preserve">Công trình tập trung vào tiếng Việt dạng văn bản, gồm tin nhắn một chiều và hội thoại nhiều lượt. Ảnh và QR chỉ là kênh thu nhận: ảnh được chuyển thành văn bản bằng OCR, QR được giải mã thành chuỗi rồi mới đưa vào mô hình. Hệ thống chưa xác thực chủ sở hữu tên miền, danh tính người gửi, số điện thoại, tài khoản ngân hàng hoặc </w:t>
-      </w:r>
-      <w:r>
-        <w:lastRenderedPageBreak/>
-        <w:t>giao dịch thực tế. Vì vậy, kết quả chỉ phản ánh nội dung được cung cấp và phải được kết hợp với xác minh bên ngoài trong ứng dụng thực tế.</w:t>
+        <w:t>Công trình tập trung vào tiếng Việt dạng văn bản, gồm tin nhắn một chiều và hội thoại nhiều lượt. Ảnh và QR chỉ là kênh thu nhận: ảnh được chuyển thành văn bản bằng OCR, QR được giải mã thành chuỗi rồi mới đưa vào mô hình. Hệ thống chưa xác thực chủ sở hữu tên miền, danh tính người gửi, số điện thoại, tài khoản ngân hàng hoặc giao dịch thực tế. Vì vậy, kết quả chỉ phản ánh nội dung được cung cấp và phải được kết hợp với xác minh bên ngoài trong ứng dụng thực tế.</w:t>
       </w:r>
     </w:p>
     <w:p>
       <w:pPr>
         <w:pStyle w:val="Heading1"/>
       </w:pPr>
-      <w:bookmarkStart w:id="11" w:name="_Toc238122622"/>
+      <w:bookmarkStart w:id="11" w:name="_Toc238122921"/>
       <w:r>
         <w:rPr>
           <w:rFonts w:ascii="Times New Roman" w:eastAsia="Times New Roman" w:hAnsi="Times New Roman"/>
@@ -5475,7 +5510,7 @@
       <w:pPr>
         <w:pStyle w:val="Heading2"/>
       </w:pPr>
-      <w:bookmarkStart w:id="12" w:name="_Toc238122623"/>
+      <w:bookmarkStart w:id="12" w:name="_Toc238122922"/>
       <w:r>
         <w:rPr>
           <w:rFonts w:ascii="Times New Roman" w:eastAsia="Times New Roman" w:hAnsi="Times New Roman"/>
@@ -5499,7 +5534,7 @@
       <w:pPr>
         <w:pStyle w:val="Heading2"/>
       </w:pPr>
-      <w:bookmarkStart w:id="13" w:name="_Toc238122624"/>
+      <w:bookmarkStart w:id="13" w:name="_Toc238122923"/>
       <w:r>
         <w:rPr>
           <w:rFonts w:ascii="Times New Roman" w:eastAsia="Times New Roman" w:hAnsi="Times New Roman"/>
@@ -5520,7 +5555,7 @@
       <w:pPr>
         <w:pStyle w:val="Heading2"/>
       </w:pPr>
-      <w:bookmarkStart w:id="14" w:name="_Toc238122625"/>
+      <w:bookmarkStart w:id="14" w:name="_Toc238122924"/>
       <w:r>
         <w:rPr>
           <w:rFonts w:ascii="Times New Roman" w:eastAsia="Times New Roman" w:hAnsi="Times New Roman"/>
@@ -5534,10 +5569,11 @@
         <w:ind w:firstLine="567"/>
       </w:pPr>
       <w:r>
-        <w:t>Dữ liệu đối chứng (dữ liệu đối chứng) được tạo bằng cách thay đổi tối thiểu một mẫu để làm thay đổi nhãn hoặc thuộc tính mục tiêu [5]. Lợi ích chính không nằm ở việc tăng số lượng câu, mà ở khả năng chỉ ra yếu tố nào phải khiến mô hình thay đổi quyết định. Tuy nhiên, dữ liệu đối chứng có thể tạo thành phần nghiên cứu nếu hai phía khác nhau bởi một dấu hiệu máy móc hoặc mẫu câu lặp lại [6]. Vì vậy, công trình kiểm soát cặp theo tình huống, hành động và loại biến đổi; đồng thời đưa mẫu cùng cặp vào cùng một p</w:t>
-      </w:r>
-      <w:r>
-        <w:t>hân hoạch.</w:t>
+        <w:t xml:space="preserve">Dữ liệu đối chứng (dữ liệu đối chứng) được tạo bằng cách thay đổi tối thiểu một mẫu để làm thay đổi nhãn hoặc thuộc tính mục tiêu [5]. Lợi ích chính không nằm ở </w:t>
+      </w:r>
+      <w:r>
+        <w:lastRenderedPageBreak/>
+        <w:t>việc tăng số lượng câu, mà ở khả năng chỉ ra yếu tố nào phải khiến mô hình thay đổi quyết định. Tuy nhiên, dữ liệu đối chứng có thể tạo thành phần nghiên cứu nếu hai phía khác nhau bởi một dấu hiệu máy móc hoặc mẫu câu lặp lại [6]. Vì vậy, công trình kiểm soát cặp theo tình huống, hành động và loại biến đổi; đồng thời đưa mẫu cùng cặp vào cùng một phân hoạch.</w:t>
       </w:r>
     </w:p>
     <w:p>
@@ -5552,94 +5588,94 @@
       <w:pPr>
         <w:pStyle w:val="Heading2"/>
       </w:pPr>
-      <w:bookmarkStart w:id="15" w:name="_Toc238122626"/>
+      <w:bookmarkStart w:id="15" w:name="_Toc238122925"/>
+      <w:r>
+        <w:rPr>
+          <w:rFonts w:ascii="Times New Roman" w:eastAsia="Times New Roman" w:hAnsi="Times New Roman"/>
+        </w:rPr>
+        <w:t>2.4. Biểu diễn qua khái niệm trung gian</w:t>
+      </w:r>
+      <w:bookmarkEnd w:id="15"/>
+    </w:p>
+    <w:p>
+      <w:pPr>
+        <w:ind w:firstLine="567"/>
+      </w:pPr>
+      <w:r>
+        <w:t>mô hình nút thắt khái niệm dự đoán các khái niệm có ý nghĩa với con người trước hoặc cùng với nhãn cuối [7]. ScamGuard-VN kế thừa ý tưởng về khả năng quan sát đầu ra trung gian, nhưng không tuyên bố sử dụng một nút thắt khái niệm cứng. Mô hình mức độ rủi ro hiện tại kế thừa bộ mã hóa đã được huấn luyện ngữ nghĩa và sau đó tiếp tục tối ưu đầu cuối; mức độ rủi ro không bị buộc chỉ nhận năm điểm trước chuẩn hóa ngữ nghĩa làm đầu vào. Cách mô tả này phản ánh đúng kiến trúc đã cài đặt và tránh phóng đại mức độ c</w:t>
+      </w:r>
+      <w:r>
+        <w:t>an thiệp được của các khái niệm.</w:t>
+      </w:r>
+    </w:p>
+    <w:p>
+      <w:pPr>
+        <w:pStyle w:val="Heading2"/>
+      </w:pPr>
+      <w:bookmarkStart w:id="16" w:name="_Toc238122926"/>
+      <w:r>
+        <w:rPr>
+          <w:rFonts w:ascii="Times New Roman" w:eastAsia="Times New Roman" w:hAnsi="Times New Roman"/>
+        </w:rPr>
+        <w:t>2.5. Khoảng trống và định vị đóng góp</w:t>
+      </w:r>
+      <w:bookmarkEnd w:id="16"/>
+    </w:p>
+    <w:p>
+      <w:pPr>
+        <w:ind w:firstLine="567"/>
+      </w:pPr>
+      <w:r>
+        <w:t>Khoảng trống mà đề tài tập trung không phải là phát minh một mô hình nền mới. Đóng góp nằm ở việc kết hợp bốn thành phần cho tiếng Việt: hệ thống hành động và vai trò câu; dữ liệu đối chứng có kiểm soát; quy trình đánh giá độc lập có đóng băng thành phần nghiên cứu; và triển khai cục bộ trên Android. Trong phạm vi khảo sát, nhóm chưa tìm thấy công trình công khai cho tiếng Việt đồng thời mô tả đầy đủ bốn thành phần này. Nhận định này chỉ là kết quả khảo sát tài liệu hiện có, không phải tuyên bố tuyệt đối rằ</w:t>
+      </w:r>
+      <w:r>
+        <w:t>ng chưa từng tồn tại nghiên cứu tương tự.</w:t>
+      </w:r>
+    </w:p>
+    <w:p>
+      <w:pPr>
+        <w:pStyle w:val="Heading1"/>
+      </w:pPr>
+      <w:bookmarkStart w:id="17" w:name="_Toc238122927"/>
+      <w:r>
+        <w:rPr>
+          <w:rFonts w:ascii="Times New Roman" w:eastAsia="Times New Roman" w:hAnsi="Times New Roman"/>
+        </w:rPr>
+        <w:t>3. ĐỐI TƯỢNG, DỮ LIỆU VÀ PHƯƠNG PHÁP NGHIÊN CỨU</w:t>
+      </w:r>
+      <w:bookmarkEnd w:id="17"/>
+    </w:p>
+    <w:p>
+      <w:pPr>
+        <w:pStyle w:val="Heading2"/>
+      </w:pPr>
+      <w:bookmarkStart w:id="18" w:name="_Toc238122928"/>
+      <w:r>
+        <w:rPr>
+          <w:rFonts w:ascii="Times New Roman" w:eastAsia="Times New Roman" w:hAnsi="Times New Roman"/>
+        </w:rPr>
+        <w:t>3.1. Đối tượng nghiên cứu</w:t>
+      </w:r>
+      <w:bookmarkEnd w:id="18"/>
+    </w:p>
+    <w:p>
+      <w:pPr>
+        <w:ind w:firstLine="567"/>
+      </w:pPr>
+      <w:r>
+        <w:t>Đối tượng nghiên cứu là mối quan hệ giữa nội dung hội thoại, hành động được đề cập, vai trò giao tiếp của phát ngôn và mức rủi ro. Đơn vị đầu vào có thể là một tin nhắn hoặc nhiều lượt hội thoại. Mỗi lượt gồm chỉ số thứ tự, vai người nói và văn bản. Lượt quan sát là lượt cuối cùng mà mô hình được phép sử dụng khi đưa ra kết quả dự đoán; các lượt sau, nếu có trong nguồn dữ liệu, không được cung cấp cho mô hình.</w:t>
+      </w:r>
+    </w:p>
+    <w:p>
+      <w:pPr>
+        <w:pStyle w:val="Heading2"/>
+      </w:pPr>
+      <w:bookmarkStart w:id="19" w:name="_Toc238122929"/>
       <w:r>
         <w:rPr>
           <w:rFonts w:ascii="Times New Roman" w:eastAsia="Times New Roman" w:hAnsi="Times New Roman"/>
         </w:rPr>
         <w:lastRenderedPageBreak/>
-        <w:t>2.4. Biểu diễn qua khái niệm trung gian</w:t>
-      </w:r>
-      <w:bookmarkEnd w:id="15"/>
-    </w:p>
-    <w:p>
-      <w:pPr>
-        <w:ind w:firstLine="567"/>
-      </w:pPr>
-      <w:r>
-        <w:t>mô hình nút thắt khái niệm dự đoán các khái niệm có ý nghĩa với con người trước hoặc cùng với nhãn cuối [7]. ScamGuard-VN kế thừa ý tưởng về khả năng quan sát đầu ra trung gian, nhưng không tuyên bố sử dụng một nút thắt khái niệm cứng. Mô hình mức độ rủi ro hiện tại kế thừa bộ mã hóa đã được huấn luyện ngữ nghĩa và sau đó tiếp tục tối ưu đầu cuối; mức độ rủi ro không bị buộc chỉ nhận năm điểm trước chuẩn hóa ngữ nghĩa làm đầu vào. Cách mô tả này phản ánh đúng kiến trúc đã cài đặt và tránh phóng đại mức độ c</w:t>
-      </w:r>
-      <w:r>
-        <w:t>an thiệp được của các khái niệm.</w:t>
-      </w:r>
-    </w:p>
-    <w:p>
-      <w:pPr>
-        <w:pStyle w:val="Heading2"/>
-      </w:pPr>
-      <w:bookmarkStart w:id="16" w:name="_Toc238122627"/>
-      <w:r>
-        <w:rPr>
-          <w:rFonts w:ascii="Times New Roman" w:eastAsia="Times New Roman" w:hAnsi="Times New Roman"/>
-        </w:rPr>
-        <w:t>2.5. Khoảng trống và định vị đóng góp</w:t>
-      </w:r>
-      <w:bookmarkEnd w:id="16"/>
-    </w:p>
-    <w:p>
-      <w:pPr>
-        <w:ind w:firstLine="567"/>
-      </w:pPr>
-      <w:r>
-        <w:t>Khoảng trống mà đề tài tập trung không phải là phát minh một mô hình nền mới. Đóng góp nằm ở việc kết hợp bốn thành phần cho tiếng Việt: hệ thống hành động và vai trò câu; dữ liệu đối chứng có kiểm soát; quy trình đánh giá độc lập có đóng băng thành phần nghiên cứu; và triển khai cục bộ trên Android. Trong phạm vi khảo sát, nhóm chưa tìm thấy công trình công khai cho tiếng Việt đồng thời mô tả đầy đủ bốn thành phần này. Nhận định này chỉ là kết quả khảo sát tài liệu hiện có, không phải tuyên bố tuyệt đối rằ</w:t>
-      </w:r>
-      <w:r>
-        <w:t>ng chưa từng tồn tại nghiên cứu tương tự.</w:t>
-      </w:r>
-    </w:p>
-    <w:p>
-      <w:pPr>
-        <w:pStyle w:val="Heading1"/>
-      </w:pPr>
-      <w:bookmarkStart w:id="17" w:name="_Toc238122628"/>
-      <w:r>
-        <w:rPr>
-          <w:rFonts w:ascii="Times New Roman" w:eastAsia="Times New Roman" w:hAnsi="Times New Roman"/>
-        </w:rPr>
-        <w:t>3. ĐỐI TƯỢNG, DỮ LIỆU VÀ PHƯƠNG PHÁP NGHIÊN CỨU</w:t>
-      </w:r>
-      <w:bookmarkEnd w:id="17"/>
-    </w:p>
-    <w:p>
-      <w:pPr>
-        <w:pStyle w:val="Heading2"/>
-      </w:pPr>
-      <w:bookmarkStart w:id="18" w:name="_Toc238122629"/>
-      <w:r>
-        <w:rPr>
-          <w:rFonts w:ascii="Times New Roman" w:eastAsia="Times New Roman" w:hAnsi="Times New Roman"/>
-        </w:rPr>
-        <w:t>3.1. Đối tượng nghiên cứu</w:t>
-      </w:r>
-      <w:bookmarkEnd w:id="18"/>
-    </w:p>
-    <w:p>
-      <w:pPr>
-        <w:ind w:firstLine="567"/>
-      </w:pPr>
-      <w:r>
-        <w:t>Đối tượng nghiên cứu là mối quan hệ giữa nội dung hội thoại, hành động được đề cập, vai trò giao tiếp của phát ngôn và mức rủi ro. Đơn vị đầu vào có thể là một tin nhắn hoặc nhiều lượt hội thoại. Mỗi lượt gồm chỉ số thứ tự, vai người nói và văn bản. Lượt quan sát là lượt cuối cùng mà mô hình được phép sử dụng khi đưa ra kết quả dự đoán; các lượt sau, nếu có trong nguồn dữ liệu, không được cung cấp cho mô hình.</w:t>
-      </w:r>
-    </w:p>
-    <w:p>
-      <w:pPr>
-        <w:pStyle w:val="Heading2"/>
-      </w:pPr>
-      <w:bookmarkStart w:id="19" w:name="_Toc238122630"/>
-      <w:r>
-        <w:rPr>
-          <w:rFonts w:ascii="Times New Roman" w:eastAsia="Times New Roman" w:hAnsi="Times New Roman"/>
-        </w:rPr>
         <w:t>3.2. Hệ thống hành động được đề cập</w:t>
       </w:r>
       <w:bookmarkEnd w:id="19"/>
@@ -5862,7 +5898,6 @@
               <w:rPr>
                 <w:sz w:val="23"/>
               </w:rPr>
-              <w:lastRenderedPageBreak/>
               <w:t>TRANSFER_VALUE</w:t>
             </w:r>
           </w:p>
@@ -6558,11 +6593,12 @@
       <w:pPr>
         <w:pStyle w:val="Heading2"/>
       </w:pPr>
-      <w:bookmarkStart w:id="20" w:name="_Toc238122631"/>
+      <w:bookmarkStart w:id="20" w:name="_Toc238122930"/>
       <w:r>
         <w:rPr>
           <w:rFonts w:ascii="Times New Roman" w:eastAsia="Times New Roman" w:hAnsi="Times New Roman"/>
         </w:rPr>
+        <w:lastRenderedPageBreak/>
         <w:t>3.3. Các thuộc tính thể hiện vai trò của câu</w:t>
       </w:r>
       <w:bookmarkEnd w:id="20"/>
@@ -6733,7 +6769,6 @@
               <w:rPr>
                 <w:sz w:val="22"/>
               </w:rPr>
-              <w:lastRenderedPageBreak/>
               <w:t>trạng thái yêu cầu</w:t>
             </w:r>
           </w:p>
@@ -7135,7 +7170,7 @@
       <w:pPr>
         <w:pStyle w:val="Heading2"/>
       </w:pPr>
-      <w:bookmarkStart w:id="21" w:name="_Toc238122632"/>
+      <w:bookmarkStart w:id="21" w:name="_Toc238122931"/>
       <w:r>
         <w:rPr>
           <w:rFonts w:ascii="Times New Roman" w:eastAsia="Times New Roman" w:hAnsi="Times New Roman"/>
@@ -7506,6 +7541,7 @@
               <w:rPr>
                 <w:sz w:val="23"/>
               </w:rPr>
+              <w:lastRenderedPageBreak/>
               <w:t>HIGH_EVIDENCE</w:t>
             </w:r>
           </w:p>
@@ -7594,18 +7630,14 @@
         <w:ind w:firstLine="567"/>
       </w:pPr>
       <w:r>
-        <w:t xml:space="preserve">Tên mức được giữ nguyên trong dữ liệu để bảo đảm tương thích với mã nguồn. NO_EVIDENCE không đồng nghĩa “chắc chắn an toàn”, còn HIGH_EVIDENCE không phải phán quyết pháp lý. REVIEW là vùng hỗ trợ quyết định nhằm hấp thụ các </w:t>
-      </w:r>
-      <w:r>
-        <w:lastRenderedPageBreak/>
-        <w:t>trường hợp mô hình chưa chắc chắn hoặc nội dung cần thêm bằng chứng ngoài văn bản.</w:t>
+        <w:t>Tên mức được giữ nguyên trong dữ liệu để bảo đảm tương thích với mã nguồn. NO_EVIDENCE không đồng nghĩa “chắc chắn an toàn”, còn HIGH_EVIDENCE không phải phán quyết pháp lý. REVIEW là vùng hỗ trợ quyết định nhằm hấp thụ các trường hợp mô hình chưa chắc chắn hoặc nội dung cần thêm bằng chứng ngoài văn bản.</w:t>
       </w:r>
     </w:p>
     <w:p>
       <w:pPr>
         <w:pStyle w:val="Heading2"/>
       </w:pPr>
-      <w:bookmarkStart w:id="22" w:name="_Toc238122633"/>
+      <w:bookmarkStart w:id="22" w:name="_Toc238122932"/>
       <w:r>
         <w:rPr>
           <w:rFonts w:ascii="Times New Roman" w:eastAsia="Times New Roman" w:hAnsi="Times New Roman"/>
@@ -8079,16 +8111,58 @@
       <w:pPr>
         <w:pStyle w:val="Heading2"/>
       </w:pPr>
-      <w:bookmarkStart w:id="23" w:name="_Toc238122634"/>
+      <w:bookmarkStart w:id="23" w:name="_Toc238122933"/>
       <w:r>
         <w:rPr>
           <w:rFonts w:ascii="Times New Roman" w:eastAsia="Times New Roman" w:hAnsi="Times New Roman"/>
         </w:rPr>
+        <w:lastRenderedPageBreak/>
         <w:t>3.6. Quy trình xây dựng và kiểm soát dữ liệu</w:t>
       </w:r>
       <w:bookmarkEnd w:id="23"/>
     </w:p>
-    <w:p/>
+    <w:p>
+      <w:r>
+        <w:rPr>
+          <w:noProof/>
+        </w:rPr>
+        <w:drawing>
+          <wp:inline distT="0" distB="0" distL="0" distR="0" wp14:anchorId="741E9D30" wp14:editId="55813159">
+            <wp:extent cx="5760720" cy="2918765"/>
+            <wp:effectExtent l="0" t="0" r="0" b="0"/>
+            <wp:docPr id="2" name="Picture 2"/>
+            <wp:cNvGraphicFramePr>
+              <a:graphicFrameLocks xmlns:a="http://schemas.openxmlformats.org/drawingml/2006/main" noChangeAspect="1"/>
+            </wp:cNvGraphicFramePr>
+            <a:graphic xmlns:a="http://schemas.openxmlformats.org/drawingml/2006/main">
+              <a:graphicData uri="http://schemas.openxmlformats.org/drawingml/2006/picture">
+                <pic:pic xmlns:pic="http://schemas.openxmlformats.org/drawingml/2006/picture">
+                  <pic:nvPicPr>
+                    <pic:cNvPr id="0" name="data_pipeline.png"/>
+                    <pic:cNvPicPr/>
+                  </pic:nvPicPr>
+                  <pic:blipFill>
+                    <a:blip r:embed="rId10"/>
+                    <a:stretch>
+                      <a:fillRect/>
+                    </a:stretch>
+                  </pic:blipFill>
+                  <pic:spPr>
+                    <a:xfrm>
+                      <a:off x="0" y="0"/>
+                      <a:ext cx="5760720" cy="2918765"/>
+                    </a:xfrm>
+                    <a:prstGeom prst="rect">
+                      <a:avLst/>
+                    </a:prstGeom>
+                  </pic:spPr>
+                </pic:pic>
+              </a:graphicData>
+            </a:graphic>
+          </wp:inline>
+        </w:drawing>
+      </w:r>
+    </w:p>
     <w:p>
       <w:pPr>
         <w:pStyle w:val="Caption"/>
@@ -8124,7 +8198,6 @@
         <w:rPr>
           <w:b/>
         </w:rPr>
-        <w:lastRenderedPageBreak/>
         <w:t xml:space="preserve">Bước 2 - Chuẩn hóa hội thoại: </w:t>
       </w:r>
       <w:r>
@@ -8191,11 +8264,12 @@
       <w:pPr>
         <w:pStyle w:val="Heading2"/>
       </w:pPr>
-      <w:bookmarkStart w:id="24" w:name="_Toc238122635"/>
+      <w:bookmarkStart w:id="24" w:name="_Toc238122934"/>
       <w:r>
         <w:rPr>
           <w:rFonts w:ascii="Times New Roman" w:eastAsia="Times New Roman" w:hAnsi="Times New Roman"/>
         </w:rPr>
+        <w:lastRenderedPageBreak/>
         <w:t>3.7. Cặp dữ liệu đối chứng tối thiểu</w:t>
       </w:r>
       <w:bookmarkEnd w:id="24"/>
@@ -8882,7 +8956,6 @@
         <w:ind w:firstLine="567"/>
       </w:pPr>
       <w:r>
-        <w:lastRenderedPageBreak/>
         <w:t>Khác biệt trong cặp phải xuất phát từ ý nghĩa giao tiếp. Việc thêm “mã tham chiếu”, đổi tên người hoặc thay số tiền mà không thay đổi ý nghĩa chỉ tạo khác biệt giả và không giúp kiểm tra năng lực mong muốn. Vì vậy, các trường phụ không liên quan bị loại khỏi tiêu chí tạo cặp.</w:t>
       </w:r>
     </w:p>
@@ -8890,16 +8963,58 @@
       <w:pPr>
         <w:pStyle w:val="Heading2"/>
       </w:pPr>
-      <w:bookmarkStart w:id="25" w:name="_Toc238122636"/>
+      <w:bookmarkStart w:id="25" w:name="_Toc238122935"/>
       <w:r>
         <w:rPr>
           <w:rFonts w:ascii="Times New Roman" w:eastAsia="Times New Roman" w:hAnsi="Times New Roman"/>
         </w:rPr>
+        <w:lastRenderedPageBreak/>
         <w:t>3.8. Kiến trúc và quy trình suy luận</w:t>
       </w:r>
       <w:bookmarkEnd w:id="25"/>
     </w:p>
-    <w:p/>
+    <w:p>
+      <w:r>
+        <w:rPr>
+          <w:noProof/>
+        </w:rPr>
+        <w:drawing>
+          <wp:inline distT="0" distB="0" distL="0" distR="0" wp14:anchorId="584F075C" wp14:editId="6ADA4111">
+            <wp:extent cx="5760720" cy="2918765"/>
+            <wp:effectExtent l="0" t="0" r="0" b="0"/>
+            <wp:docPr id="3" name="Picture 3"/>
+            <wp:cNvGraphicFramePr>
+              <a:graphicFrameLocks xmlns:a="http://schemas.openxmlformats.org/drawingml/2006/main" noChangeAspect="1"/>
+            </wp:cNvGraphicFramePr>
+            <a:graphic xmlns:a="http://schemas.openxmlformats.org/drawingml/2006/main">
+              <a:graphicData uri="http://schemas.openxmlformats.org/drawingml/2006/picture">
+                <pic:pic xmlns:pic="http://schemas.openxmlformats.org/drawingml/2006/picture">
+                  <pic:nvPicPr>
+                    <pic:cNvPr id="0" name="model_pipeline.png"/>
+                    <pic:cNvPicPr/>
+                  </pic:nvPicPr>
+                  <pic:blipFill>
+                    <a:blip r:embed="rId11"/>
+                    <a:stretch>
+                      <a:fillRect/>
+                    </a:stretch>
+                  </pic:blipFill>
+                  <pic:spPr>
+                    <a:xfrm>
+                      <a:off x="0" y="0"/>
+                      <a:ext cx="5760720" cy="2918765"/>
+                    </a:xfrm>
+                    <a:prstGeom prst="rect">
+                      <a:avLst/>
+                    </a:prstGeom>
+                  </pic:spPr>
+                </pic:pic>
+              </a:graphicData>
+            </a:graphic>
+          </wp:inline>
+        </w:drawing>
+      </w:r>
+    </w:p>
     <w:p>
       <w:pPr>
         <w:pStyle w:val="Caption"/>
@@ -9015,11 +9130,12 @@
       <w:pPr>
         <w:pStyle w:val="Heading2"/>
       </w:pPr>
-      <w:bookmarkStart w:id="26" w:name="_Toc238122637"/>
+      <w:bookmarkStart w:id="26" w:name="_Toc238122936"/>
       <w:r>
         <w:rPr>
           <w:rFonts w:ascii="Times New Roman" w:eastAsia="Times New Roman" w:hAnsi="Times New Roman"/>
         </w:rPr>
+        <w:lastRenderedPageBreak/>
         <w:t>3.9. Thiết lập huấn luyện</w:t>
       </w:r>
       <w:bookmarkEnd w:id="26"/>
@@ -9156,7 +9272,6 @@
               <w:rPr>
                 <w:sz w:val="22"/>
               </w:rPr>
-              <w:lastRenderedPageBreak/>
               <w:t>Mô hình nền</w:t>
             </w:r>
           </w:p>
@@ -9704,16 +9819,58 @@
       <w:pPr>
         <w:pStyle w:val="Heading2"/>
       </w:pPr>
-      <w:bookmarkStart w:id="27" w:name="_Toc238122638"/>
+      <w:bookmarkStart w:id="27" w:name="_Toc238122937"/>
       <w:r>
         <w:rPr>
           <w:rFonts w:ascii="Times New Roman" w:eastAsia="Times New Roman" w:hAnsi="Times New Roman"/>
         </w:rPr>
+        <w:lastRenderedPageBreak/>
         <w:t>3.10. Quy trình kiểm thử độc lập</w:t>
       </w:r>
       <w:bookmarkEnd w:id="27"/>
     </w:p>
-    <w:p/>
+    <w:p>
+      <w:r>
+        <w:rPr>
+          <w:noProof/>
+        </w:rPr>
+        <w:drawing>
+          <wp:inline distT="0" distB="0" distL="0" distR="0" wp14:anchorId="51FF118D" wp14:editId="4151291C">
+            <wp:extent cx="5760720" cy="2918765"/>
+            <wp:effectExtent l="0" t="0" r="0" b="0"/>
+            <wp:docPr id="4" name="Picture 4"/>
+            <wp:cNvGraphicFramePr>
+              <a:graphicFrameLocks xmlns:a="http://schemas.openxmlformats.org/drawingml/2006/main" noChangeAspect="1"/>
+            </wp:cNvGraphicFramePr>
+            <a:graphic xmlns:a="http://schemas.openxmlformats.org/drawingml/2006/main">
+              <a:graphicData uri="http://schemas.openxmlformats.org/drawingml/2006/picture">
+                <pic:pic xmlns:pic="http://schemas.openxmlformats.org/drawingml/2006/picture">
+                  <pic:nvPicPr>
+                    <pic:cNvPr id="0" name="independent_protocol.png"/>
+                    <pic:cNvPicPr/>
+                  </pic:nvPicPr>
+                  <pic:blipFill>
+                    <a:blip r:embed="rId12"/>
+                    <a:stretch>
+                      <a:fillRect/>
+                    </a:stretch>
+                  </pic:blipFill>
+                  <pic:spPr>
+                    <a:xfrm>
+                      <a:off x="0" y="0"/>
+                      <a:ext cx="5760720" cy="2918765"/>
+                    </a:xfrm>
+                    <a:prstGeom prst="rect">
+                      <a:avLst/>
+                    </a:prstGeom>
+                  </pic:spPr>
+                </pic:pic>
+              </a:graphicData>
+            </a:graphic>
+          </wp:inline>
+        </w:drawing>
+      </w:r>
+    </w:p>
     <w:p>
       <w:pPr>
         <w:pStyle w:val="Caption"/>
@@ -9749,7 +9906,6 @@
         <w:rPr>
           <w:b/>
         </w:rPr>
-        <w:lastRenderedPageBreak/>
         <w:t xml:space="preserve">Tách đầu vào và nhãn chuẩn: </w:t>
       </w:r>
       <w:r>
@@ -9816,7 +9972,7 @@
       <w:pPr>
         <w:pStyle w:val="Heading2"/>
       </w:pPr>
-      <w:bookmarkStart w:id="28" w:name="_Toc238122639"/>
+      <w:bookmarkStart w:id="28" w:name="_Toc238122938"/>
       <w:r>
         <w:rPr>
           <w:rFonts w:ascii="Times New Roman" w:eastAsia="Times New Roman" w:hAnsi="Times New Roman"/>
@@ -9830,10 +9986,11 @@
         <w:ind w:firstLine="567"/>
       </w:pPr>
       <w:r>
-        <w:t>Accuracy là tỷ lệ kết quả dự đoán trùng nhãn chuẩn. Precision cho biết trong các mẫu mô hình dự đoán vào một lớp, bao nhiêu mẫu đúng. Recall cho biết trong các mẫu thật sự thuộc lớp đó, mô hình phát hiện được bao nhiêu. F1 là trung bình điều hòa giữa Precision và Recall. Macro-F1 tính F1 riêng cho từng lớp rồi lấy trung bình, vì vậy lớp ít mẫu không bị che lấp bởi lớp đông mẫu. độ tin cậy trong ứng dụng là điểm softmax của mô hình trên dữ liệu phát triển; nó chưa được xem là xác suất lừa đảo đã hiệu chỉnh n</w:t>
-      </w:r>
-      <w:r>
-        <w:t>goài thực tế.</w:t>
+        <w:t xml:space="preserve">Accuracy là tỷ lệ kết quả dự đoán trùng nhãn chuẩn. Precision cho biết trong các mẫu mô hình dự đoán vào một lớp, bao nhiêu mẫu đúng. Recall cho biết trong các mẫu thật sự thuộc lớp đó, mô hình phát hiện được bao nhiêu. F1 là trung bình điều hòa giữa Precision và Recall. Macro-F1 tính F1 riêng cho từng lớp rồi lấy trung bình, vì vậy lớp ít mẫu không bị che lấp bởi lớp đông mẫu. độ tin cậy trong ứng dụng là điểm softmax </w:t>
+      </w:r>
+      <w:r>
+        <w:lastRenderedPageBreak/>
+        <w:t>của mô hình trên dữ liệu phát triển; nó chưa được xem là xác suất lừa đảo đã hiệu chỉnh ngoài thực tế.</w:t>
       </w:r>
     </w:p>
     <w:p>
@@ -9848,7 +10005,7 @@
       <w:pPr>
         <w:pStyle w:val="Heading1"/>
       </w:pPr>
-      <w:bookmarkStart w:id="29" w:name="_Toc238122640"/>
+      <w:bookmarkStart w:id="29" w:name="_Toc238122939"/>
       <w:r>
         <w:rPr>
           <w:rFonts w:ascii="Times New Roman" w:eastAsia="Times New Roman" w:hAnsi="Times New Roman"/>
@@ -9861,7 +10018,7 @@
       <w:pPr>
         <w:pStyle w:val="Heading2"/>
       </w:pPr>
-      <w:bookmarkStart w:id="30" w:name="_Toc238122641"/>
+      <w:bookmarkStart w:id="30" w:name="_Toc238122940"/>
       <w:r>
         <w:rPr>
           <w:rFonts w:ascii="Times New Roman" w:eastAsia="Times New Roman" w:hAnsi="Times New Roman"/>
@@ -10158,7 +10315,6 @@
               <w:rPr>
                 <w:sz w:val="23"/>
               </w:rPr>
-              <w:lastRenderedPageBreak/>
               <w:t>trạng thái phủ định</w:t>
             </w:r>
           </w:p>
@@ -10472,11 +10628,12 @@
       <w:pPr>
         <w:pStyle w:val="Heading2"/>
       </w:pPr>
-      <w:bookmarkStart w:id="31" w:name="_Toc238122642"/>
+      <w:bookmarkStart w:id="31" w:name="_Toc238122941"/>
       <w:r>
         <w:rPr>
           <w:rFonts w:ascii="Times New Roman" w:eastAsia="Times New Roman" w:hAnsi="Times New Roman"/>
         </w:rPr>
+        <w:lastRenderedPageBreak/>
         <w:t>4.2. Kết quả mô hình mức độ rủi ro trên tập DEV</w:t>
       </w:r>
       <w:bookmarkEnd w:id="31"/>
@@ -10762,7 +10919,7 @@
       <w:pPr>
         <w:pStyle w:val="Heading2"/>
       </w:pPr>
-      <w:bookmarkStart w:id="32" w:name="_Toc238122643"/>
+      <w:bookmarkStart w:id="32" w:name="_Toc238122942"/>
       <w:r>
         <w:rPr>
           <w:rFonts w:ascii="Times New Roman" w:eastAsia="Times New Roman" w:hAnsi="Times New Roman"/>
@@ -10981,7 +11138,6 @@
               <w:rPr>
                 <w:sz w:val="22"/>
               </w:rPr>
-              <w:lastRenderedPageBreak/>
               <w:t>Macro-F1 trên các nhãn có trong nhãn chuẩn</w:t>
             </w:r>
           </w:p>
@@ -11436,7 +11592,11 @@
         <w:ind w:firstLine="567"/>
       </w:pPr>
       <w:r>
-        <w:t>Tập kiểm thử gồm 70 mẫu có lừa đảo, 65 mẫu âm khó và 65 mẫu âm dễ. nhãn chuẩn chỉ có hai nhãn đích NO_EVIDENCE và HIGH_EVIDENCE; REVIEW là vùng đầu ra thận trọng của hệ thống chứ không phải một loại dữ liệu bị bỏ sót. Do đó, Macro-F1 tính cả ba lớp sẽ bằng 54,53% vì lớp REVIEW không có mẫu nhãn chuẩn; báo cáo không dùng con số này làm kết luận chính nhưng vẫn công bố để bảo đảm minh bạch.</w:t>
+        <w:t xml:space="preserve">Tập kiểm thử gồm 70 mẫu có lừa đảo, 65 mẫu âm khó và 65 mẫu âm dễ. nhãn chuẩn chỉ có hai nhãn đích NO_EVIDENCE và HIGH_EVIDENCE; REVIEW là vùng đầu ra thận trọng của hệ thống chứ không phải một loại dữ liệu bị bỏ sót. Do đó, Macro-F1 tính cả ba lớp sẽ bằng 54,53% vì lớp REVIEW không có mẫu nhãn chuẩn; </w:t>
+      </w:r>
+      <w:r>
+        <w:lastRenderedPageBreak/>
+        <w:t>báo cáo không dùng con số này làm kết luận chính nhưng vẫn công bố để bảo đảm minh bạch.</w:t>
       </w:r>
     </w:p>
     <w:p>
@@ -11451,7 +11611,7 @@
       <w:pPr>
         <w:pStyle w:val="Heading2"/>
       </w:pPr>
-      <w:bookmarkStart w:id="33" w:name="_Toc238122644"/>
+      <w:bookmarkStart w:id="33" w:name="_Toc238122943"/>
       <w:r>
         <w:rPr>
           <w:rFonts w:ascii="Times New Roman" w:eastAsia="Times New Roman" w:hAnsi="Times New Roman"/>
@@ -12008,11 +12168,7 @@
         <w:ind w:firstLine="567"/>
       </w:pPr>
       <w:r>
-        <w:t xml:space="preserve">Nhóm có lừa đảo đạt tỷ lệ cảnh báo cao nhất. Những trường hợp còn bỏ sót thường biểu đạt rủi ro gián tiếp, thiếu vai người nói, dùng tên miền giả nhưng không </w:t>
-      </w:r>
-      <w:r>
-        <w:lastRenderedPageBreak/>
-        <w:t>có động từ yêu cầu rõ, hoặc chỉ hé lộ một phần chuỗi thao tác. Điều này cho thấy mô hình vẫn phụ thuộc đáng kể vào dấu hiệu hành động trong văn bản.</w:t>
+        <w:t>Nhóm có lừa đảo đạt tỷ lệ cảnh báo cao nhất. Những trường hợp còn bỏ sót thường biểu đạt rủi ro gián tiếp, thiếu vai người nói, dùng tên miền giả nhưng không có động từ yêu cầu rõ, hoặc chỉ hé lộ một phần chuỗi thao tác. Điều này cho thấy mô hình vẫn phụ thuộc đáng kể vào dấu hiệu hành động trong văn bản.</w:t>
       </w:r>
     </w:p>
     <w:p>
@@ -12035,7 +12191,7 @@
       <w:pPr>
         <w:pStyle w:val="Heading2"/>
       </w:pPr>
-      <w:bookmarkStart w:id="34" w:name="_Toc238122645"/>
+      <w:bookmarkStart w:id="34" w:name="_Toc238122944"/>
       <w:r>
         <w:rPr>
           <w:rFonts w:ascii="Times New Roman" w:eastAsia="Times New Roman" w:hAnsi="Times New Roman"/>
@@ -12049,7 +12205,11 @@
         <w:ind w:firstLine="567"/>
       </w:pPr>
       <w:r>
-        <w:t>Đối với câu hỏi thứ nhất, kết quả trạng thái yêu cầu và hành động được xác nhận trên DEV cho thấy phân tích thuộc tính ngữ nghĩa có khả năng học được khác biệt giữa “nhắc đến” và “thực sự yêu cầu”. Các cặp đối chứng góp phần làm ranh giới này rõ hơn, dù nghiên cứu hiện chưa có thí nghiệm loại bỏ thành phần trên cùng một tập test để định lượng riêng mức đóng góp.</w:t>
+        <w:t xml:space="preserve">Đối với câu hỏi thứ nhất, kết quả trạng thái yêu cầu và hành động được xác nhận trên DEV cho thấy phân tích thuộc tính ngữ nghĩa có khả năng học được khác biệt giữa “nhắc đến” và “thực sự yêu cầu”. Các cặp đối chứng góp phần làm ranh giới này </w:t>
+      </w:r>
+      <w:r>
+        <w:lastRenderedPageBreak/>
+        <w:t>rõ hơn, dù nghiên cứu hiện chưa có thí nghiệm loại bỏ thành phần trên cùng một tập test để định lượng riêng mức đóng góp.</w:t>
       </w:r>
     </w:p>
     <w:p>
@@ -12072,7 +12232,7 @@
       <w:pPr>
         <w:pStyle w:val="Heading2"/>
       </w:pPr>
-      <w:bookmarkStart w:id="35" w:name="_Toc238122646"/>
+      <w:bookmarkStart w:id="35" w:name="_Toc238122945"/>
       <w:r>
         <w:rPr>
           <w:rFonts w:ascii="Times New Roman" w:eastAsia="Times New Roman" w:hAnsi="Times New Roman"/>
@@ -12102,7 +12262,6 @@
         <w:ind w:firstLine="567"/>
       </w:pPr>
       <w:r>
-        <w:lastRenderedPageBreak/>
         <w:t>Đóng góp thứ ba là quy trình kiểm thử có khóa thành phần nghiên cứu và SHA256. kết quả dự đoán được đóng băng trước khi mở nhãn chuẩn, giúp phân biệt phép thử độc lập với việc đánh giá lại sau khi đã xem kết quả. Đây là đóng góp về tính kiểm chứng của quy trình nghiên cứu, đặc biệt cần thiết với mô hình được cải tiến lặp lại.</w:t>
       </w:r>
     </w:p>
@@ -12110,7 +12269,7 @@
       <w:pPr>
         <w:pStyle w:val="Heading2"/>
       </w:pPr>
-      <w:bookmarkStart w:id="36" w:name="_Toc238122647"/>
+      <w:bookmarkStart w:id="36" w:name="_Toc238122946"/>
       <w:r>
         <w:rPr>
           <w:rFonts w:ascii="Times New Roman" w:eastAsia="Times New Roman" w:hAnsi="Times New Roman"/>
@@ -12139,11 +12298,12 @@
       <w:pPr>
         <w:pStyle w:val="Heading2"/>
       </w:pPr>
-      <w:bookmarkStart w:id="37" w:name="_Toc238122648"/>
+      <w:bookmarkStart w:id="37" w:name="_Toc238122947"/>
       <w:r>
         <w:rPr>
           <w:rFonts w:ascii="Times New Roman" w:eastAsia="Times New Roman" w:hAnsi="Times New Roman"/>
         </w:rPr>
+        <w:lastRenderedPageBreak/>
         <w:t>4.8. Hạn chế</w:t>
       </w:r>
       <w:bookmarkEnd w:id="37"/>
@@ -12734,18 +12894,14 @@
         <w:ind w:firstLine="567"/>
       </w:pPr>
       <w:r>
-        <w:t xml:space="preserve">Vì các hạn chế trên, ScamGuard-VN được định vị là công cụ hỗ trợ cảnh báo. Người dùng vẫn cần xác minh qua ứng dụng, website hoặc số liên hệ chính thức; hệ </w:t>
-      </w:r>
-      <w:r>
-        <w:lastRenderedPageBreak/>
-        <w:t>thống không thay thế cơ quan chức năng, chuyên gia an toàn thông tin hoặc quyết định của con người.</w:t>
+        <w:t>Vì các hạn chế trên, ScamGuard-VN được định vị là công cụ hỗ trợ cảnh báo. Người dùng vẫn cần xác minh qua ứng dụng, website hoặc số liên hệ chính thức; hệ thống không thay thế cơ quan chức năng, chuyên gia an toàn thông tin hoặc quyết định của con người.</w:t>
       </w:r>
     </w:p>
     <w:p>
       <w:pPr>
         <w:pStyle w:val="Heading1"/>
       </w:pPr>
-      <w:bookmarkStart w:id="38" w:name="_Toc238122649"/>
+      <w:bookmarkStart w:id="38" w:name="_Toc238122948"/>
       <w:r>
         <w:rPr>
           <w:rFonts w:ascii="Times New Roman" w:eastAsia="Times New Roman" w:hAnsi="Times New Roman"/>
@@ -12758,7 +12914,7 @@
       <w:pPr>
         <w:pStyle w:val="Heading2"/>
       </w:pPr>
-      <w:bookmarkStart w:id="39" w:name="_Toc238122650"/>
+      <w:bookmarkStart w:id="39" w:name="_Toc238122949"/>
       <w:r>
         <w:rPr>
           <w:rFonts w:ascii="Times New Roman" w:eastAsia="Times New Roman" w:hAnsi="Times New Roman"/>
@@ -12780,14 +12936,18 @@
         <w:ind w:firstLine="567"/>
       </w:pPr>
       <w:r>
-        <w:t>Trên tập DEV, mô hình ngữ nghĩa đạt Macro-F1 96,14% cho hành động được đề cập và 99,13% cho hành động được xác nhận; mô hình mức độ rủi ro đạt Accuracy 96,73% và Macro-F1 96,72%. Trên 200 mẫu kiểm thử độc lập khó hơn, độ chính xác nghiêm ngặt đạt 76,50%, Macro-F1 trên hai nhãn có trong nhãn chuẩn đạt 81,79% và độ chính xác vận hành đạt 86,50%. Sự chênh lệch giữa DEV và kiểm thử độc lập được công bố như một bằng chứng về dịch chuyển miền và giới hạn khái quát, không bị che bằng chỉ số thuận lợi hơn.</w:t>
+        <w:t xml:space="preserve">Trên tập DEV, mô hình ngữ nghĩa đạt Macro-F1 96,14% cho hành động được đề cập và 99,13% cho hành động được xác nhận; mô hình mức độ rủi ro đạt Accuracy 96,73% và Macro-F1 96,72%. Trên 200 mẫu kiểm thử độc lập khó hơn, độ chính xác nghiêm ngặt đạt 76,50%, Macro-F1 trên hai nhãn có trong nhãn chuẩn đạt 81,79% và </w:t>
+      </w:r>
+      <w:r>
+        <w:lastRenderedPageBreak/>
+        <w:t>độ chính xác vận hành đạt 86,50%. Sự chênh lệch giữa DEV và kiểm thử độc lập được công bố như một bằng chứng về dịch chuyển miền và giới hạn khái quát, không bị che bằng chỉ số thuận lợi hơn.</w:t>
       </w:r>
     </w:p>
     <w:p>
       <w:pPr>
         <w:pStyle w:val="Heading2"/>
       </w:pPr>
-      <w:bookmarkStart w:id="40" w:name="_Toc238122651"/>
+      <w:bookmarkStart w:id="40" w:name="_Toc238122950"/>
       <w:r>
         <w:rPr>
           <w:rFonts w:ascii="Times New Roman" w:eastAsia="Times New Roman" w:hAnsi="Times New Roman"/>
@@ -12850,7 +13010,7 @@
       <w:pPr>
         <w:pStyle w:val="Heading2"/>
       </w:pPr>
-      <w:bookmarkStart w:id="41" w:name="_Toc238122652"/>
+      <w:bookmarkStart w:id="41" w:name="_Toc238122951"/>
       <w:r>
         <w:rPr>
           <w:rFonts w:ascii="Times New Roman" w:eastAsia="Times New Roman" w:hAnsi="Times New Roman"/>
@@ -12864,11 +13024,7 @@
         <w:ind w:firstLine="567"/>
       </w:pPr>
       <w:r>
-        <w:t xml:space="preserve">Nghiên cứu tiếp theo sẽ ưu tiên dữ liệu thật đã ẩn danh, có nhiều người gán nhãn và đo mức đồng thuận. Tập kiểm thử mới cần có đủ ba lớp, đặc biệt các trường hợp </w:t>
-      </w:r>
-      <w:r>
-        <w:lastRenderedPageBreak/>
-        <w:t>REVIEW thật sự mơ hồ, đồng thời phải được giữ kín cho đến khi điểm kiểm tra mô hình và ngưỡng đã khóa.</w:t>
+        <w:t>Nghiên cứu tiếp theo sẽ ưu tiên dữ liệu thật đã ẩn danh, có nhiều người gán nhãn và đo mức đồng thuận. Tập kiểm thử mới cần có đủ ba lớp, đặc biệt các trường hợp REVIEW thật sự mơ hồ, đồng thời phải được giữ kín cho đến khi điểm kiểm tra mô hình và ngưỡng đã khóa.</w:t>
       </w:r>
     </w:p>
     <w:p>
@@ -12891,7 +13047,7 @@
       <w:pPr>
         <w:pStyle w:val="Heading2"/>
       </w:pPr>
-      <w:bookmarkStart w:id="42" w:name="_Toc238122653"/>
+      <w:bookmarkStart w:id="42" w:name="_Toc238122952"/>
       <w:r>
         <w:rPr>
           <w:rFonts w:ascii="Times New Roman" w:eastAsia="Times New Roman" w:hAnsi="Times New Roman"/>
@@ -12904,7 +13060,7 @@
       <w:r>
         <w:t xml:space="preserve">Mã nguồn, cấu trúc dữ liệu, chương trình huấn luyện, đánh giá và hướng dẫn chạy được công bố tại: </w:t>
       </w:r>
-      <w:hyperlink r:id="rId9">
+      <w:hyperlink r:id="rId13">
         <w:r>
           <w:rPr>
             <w:rFonts w:cs="Times New Roman"/>
@@ -12919,6 +13075,7 @@
         <w:ind w:firstLine="567"/>
       </w:pPr>
       <w:r>
+        <w:lastRenderedPageBreak/>
         <w:t>Kho lưu trữ cung cấp điểm kiểm tra mô hình ngữ nghĩa và mức độ rủi ro qua bản phát hành, tệp kê khai SHA256, cấu hình môi trường và lệnh chạy máy chủ. Việc tái chạy có thể có sai khác nhỏ do phiên bản thư viện, phần cứng và phép toán GPU; các mã băm được dùng để xác nhận đúng thành phần nghiên cứu của kết quả đã báo cáo.</w:t>
       </w:r>
     </w:p>
@@ -12926,7 +13083,7 @@
       <w:pPr>
         <w:pStyle w:val="Heading1"/>
       </w:pPr>
-      <w:bookmarkStart w:id="43" w:name="_Toc238122654"/>
+      <w:bookmarkStart w:id="43" w:name="_Toc238122953"/>
       <w:r>
         <w:rPr>
           <w:rFonts w:ascii="Times New Roman" w:eastAsia="Times New Roman" w:hAnsi="Times New Roman"/>
@@ -12988,7 +13145,6 @@
         <w:spacing w:after="100"/>
       </w:pPr>
       <w:r>
-        <w:lastRenderedPageBreak/>
         <w:t>[7] D. P. Kingma và J. Ba, “Adam: A Method for Stochastic Optimization,” ICLR, 2015.</w:t>
       </w:r>
     </w:p>
@@ -13028,11 +13184,12 @@
       <w:pPr>
         <w:pStyle w:val="Heading1"/>
       </w:pPr>
-      <w:bookmarkStart w:id="44" w:name="_Toc238122655"/>
+      <w:bookmarkStart w:id="44" w:name="_Toc238122954"/>
       <w:r>
         <w:rPr>
           <w:rFonts w:ascii="Times New Roman" w:eastAsia="Times New Roman" w:hAnsi="Times New Roman"/>
         </w:rPr>
+        <w:lastRenderedPageBreak/>
         <w:t>PHỤ LỤC</w:t>
       </w:r>
       <w:bookmarkEnd w:id="44"/>
@@ -13041,7 +13198,7 @@
       <w:pPr>
         <w:pStyle w:val="Heading2"/>
       </w:pPr>
-      <w:bookmarkStart w:id="45" w:name="_Toc238122656"/>
+      <w:bookmarkStart w:id="45" w:name="_Toc238122955"/>
       <w:r>
         <w:rPr>
           <w:rFonts w:ascii="Times New Roman" w:eastAsia="Times New Roman" w:hAnsi="Times New Roman"/>
@@ -13147,7 +13304,7 @@
       <w:pPr>
         <w:pStyle w:val="Heading2"/>
       </w:pPr>
-      <w:bookmarkStart w:id="46" w:name="_Toc238122657"/>
+      <w:bookmarkStart w:id="46" w:name="_Toc238122956"/>
       <w:r>
         <w:rPr>
           <w:rFonts w:ascii="Times New Roman" w:eastAsia="Times New Roman" w:hAnsi="Times New Roman"/>
@@ -13225,7 +13382,7 @@
       <w:pPr>
         <w:pStyle w:val="Heading2"/>
       </w:pPr>
-      <w:bookmarkStart w:id="47" w:name="_Toc238122658"/>
+      <w:bookmarkStart w:id="47" w:name="_Toc238122957"/>
       <w:r>
         <w:rPr>
           <w:rFonts w:ascii="Times New Roman" w:eastAsia="Times New Roman" w:hAnsi="Times New Roman"/>
@@ -13394,7 +13551,6 @@
               <w:rPr>
                 <w:sz w:val="19"/>
               </w:rPr>
-              <w:lastRenderedPageBreak/>
               <w:t>Điểm kiểm tra mô hình mức độ rủi ro</w:t>
             </w:r>
           </w:p>
@@ -13596,7 +13752,7 @@
       <w:pPr>
         <w:pStyle w:val="Heading2"/>
       </w:pPr>
-      <w:bookmarkStart w:id="48" w:name="_Toc238122659"/>
+      <w:bookmarkStart w:id="48" w:name="_Toc238122958"/>
       <w:r>
         <w:rPr>
           <w:rFonts w:ascii="Times New Roman" w:eastAsia="Times New Roman" w:hAnsi="Times New Roman"/>
@@ -13622,6 +13778,7 @@
         <w:ind w:left="454" w:hanging="227"/>
       </w:pPr>
       <w:r>
+        <w:lastRenderedPageBreak/>
         <w:t>2. Ứng dụng chuẩn hóa đầu vào ở mức tối thiểu và gửi văn bản tới API trong mạng cục bộ.</w:t>
       </w:r>
     </w:p>
@@ -13659,7 +13816,7 @@
       <w:pPr>
         <w:pStyle w:val="Heading2"/>
       </w:pPr>
-      <w:bookmarkStart w:id="49" w:name="_Toc238122660"/>
+      <w:bookmarkStart w:id="49" w:name="_Toc238122959"/>
       <w:r>
         <w:rPr>
           <w:rFonts w:ascii="Times New Roman" w:eastAsia="Times New Roman" w:hAnsi="Times New Roman"/>
@@ -13677,7 +13834,7 @@
       </w:r>
     </w:p>
     <w:sectPr>
-      <w:headerReference w:type="default" r:id="rId10"/>
+      <w:headerReference w:type="default" r:id="rId14"/>
       <w:pgSz w:w="11906" w:h="16838"/>
       <w:pgMar w:top="1134" w:right="1134" w:bottom="1134" w:left="1701" w:header="397" w:footer="397" w:gutter="0"/>
       <w:pgNumType w:start="1"/>
@@ -13962,31 +14119,31 @@
       </w:rPr>
     </w:lvl>
   </w:abstractNum>
-  <w:num w:numId="1" w16cid:durableId="633608806">
+  <w:num w:numId="1" w16cid:durableId="217860824">
     <w:abstractNumId w:val="8"/>
   </w:num>
-  <w:num w:numId="2" w16cid:durableId="1120491747">
+  <w:num w:numId="2" w16cid:durableId="290403349">
     <w:abstractNumId w:val="6"/>
   </w:num>
-  <w:num w:numId="3" w16cid:durableId="40176552">
+  <w:num w:numId="3" w16cid:durableId="953513911">
     <w:abstractNumId w:val="5"/>
   </w:num>
-  <w:num w:numId="4" w16cid:durableId="1961254825">
+  <w:num w:numId="4" w16cid:durableId="817528192">
     <w:abstractNumId w:val="4"/>
   </w:num>
-  <w:num w:numId="5" w16cid:durableId="668485943">
+  <w:num w:numId="5" w16cid:durableId="100489421">
     <w:abstractNumId w:val="7"/>
   </w:num>
-  <w:num w:numId="6" w16cid:durableId="1245266821">
+  <w:num w:numId="6" w16cid:durableId="775250877">
     <w:abstractNumId w:val="3"/>
   </w:num>
-  <w:num w:numId="7" w16cid:durableId="645234050">
+  <w:num w:numId="7" w16cid:durableId="219171665">
     <w:abstractNumId w:val="2"/>
   </w:num>
-  <w:num w:numId="8" w16cid:durableId="194464747">
+  <w:num w:numId="8" w16cid:durableId="1685086743">
     <w:abstractNumId w:val="1"/>
   </w:num>
-  <w:num w:numId="9" w16cid:durableId="949052179">
+  <w:num w:numId="9" w16cid:durableId="1275939185">
     <w:abstractNumId w:val="0"/>
   </w:num>
 </w:numbering>
@@ -25376,7 +25533,7 @@
     <w:autoRedefine/>
     <w:uiPriority w:val="39"/>
     <w:unhideWhenUsed/>
-    <w:rsid w:val="002A15E2"/>
+    <w:rsid w:val="007705A4"/>
     <w:pPr>
       <w:spacing w:after="100"/>
     </w:pPr>
@@ -25388,7 +25545,7 @@
     <w:autoRedefine/>
     <w:uiPriority w:val="39"/>
     <w:unhideWhenUsed/>
-    <w:rsid w:val="002A15E2"/>
+    <w:rsid w:val="007705A4"/>
     <w:pPr>
       <w:spacing w:after="100"/>
       <w:ind w:left="260"/>
@@ -25399,7 +25556,7 @@
     <w:basedOn w:val="DefaultParagraphFont"/>
     <w:uiPriority w:val="99"/>
     <w:unhideWhenUsed/>
-    <w:rsid w:val="002A15E2"/>
+    <w:rsid w:val="007705A4"/>
     <w:rPr>
       <w:color w:val="0000FF" w:themeColor="hyperlink"/>
       <w:u w:val="single"/>

</xml_diff>

<commit_message>
docs: capitalize table cell text
</commit_message>
<xml_diff>
--- a/docs/SCAMGUARD_VN_THUYET_MINH_EUREKA_2026_BAN_VIET_HOA.docx
+++ b/docs/SCAMGUARD_VN_THUYET_MINH_EUREKA_2026_BAN_VIET_HOA.docx
@@ -162,7 +162,7 @@
       <w:pPr>
         <w:pStyle w:val="Heading1"/>
       </w:pPr>
-      <w:bookmarkStart w:id="0" w:name="_Toc238122910"/>
+      <w:bookmarkStart w:id="0" w:name="_Toc238123210"/>
       <w:r>
         <w:rPr>
           <w:rFonts w:ascii="Times New Roman" w:eastAsia="Times New Roman" w:hAnsi="Times New Roman"/>
@@ -207,7 +207,7 @@
         </w:rPr>
         <w:fldChar w:fldCharType="separate"/>
       </w:r>
-      <w:hyperlink w:anchor="_Toc238122910" w:history="1">
+      <w:hyperlink w:anchor="_Toc238123210" w:history="1">
         <w:r>
           <w:rPr>
             <w:rStyle w:val="Hyperlink"/>
@@ -234,7 +234,7 @@
             <w:noProof/>
             <w:webHidden/>
           </w:rPr>
-          <w:instrText xml:space="preserve"> PAGEREF _Toc238122910 \h </w:instrText>
+          <w:instrText xml:space="preserve"> PAGEREF _Toc238123210 \h </w:instrText>
         </w:r>
         <w:r>
           <w:rPr>
@@ -282,7 +282,7 @@
           <w14:ligatures w14:val="standardContextual"/>
         </w:rPr>
       </w:pPr>
-      <w:hyperlink w:anchor="_Toc238122911" w:history="1">
+      <w:hyperlink w:anchor="_Toc238123211" w:history="1">
         <w:r>
           <w:rPr>
             <w:rStyle w:val="Hyperlink"/>
@@ -309,7 +309,7 @@
             <w:noProof/>
             <w:webHidden/>
           </w:rPr>
-          <w:instrText xml:space="preserve"> PAGEREF _Toc238122911 \h </w:instrText>
+          <w:instrText xml:space="preserve"> PAGEREF _Toc238123211 \h </w:instrText>
         </w:r>
         <w:r>
           <w:rPr>
@@ -357,7 +357,7 @@
           <w14:ligatures w14:val="standardContextual"/>
         </w:rPr>
       </w:pPr>
-      <w:hyperlink w:anchor="_Toc238122912" w:history="1">
+      <w:hyperlink w:anchor="_Toc238123212" w:history="1">
         <w:r>
           <w:rPr>
             <w:rStyle w:val="Hyperlink"/>
@@ -384,7 +384,7 @@
             <w:noProof/>
             <w:webHidden/>
           </w:rPr>
-          <w:instrText xml:space="preserve"> PAGEREF _Toc238122912 \h </w:instrText>
+          <w:instrText xml:space="preserve"> PAGEREF _Toc238123212 \h </w:instrText>
         </w:r>
         <w:r>
           <w:rPr>
@@ -432,7 +432,7 @@
           <w14:ligatures w14:val="standardContextual"/>
         </w:rPr>
       </w:pPr>
-      <w:hyperlink w:anchor="_Toc238122913" w:history="1">
+      <w:hyperlink w:anchor="_Toc238123213" w:history="1">
         <w:r>
           <w:rPr>
             <w:rStyle w:val="Hyperlink"/>
@@ -459,7 +459,7 @@
             <w:noProof/>
             <w:webHidden/>
           </w:rPr>
-          <w:instrText xml:space="preserve"> PAGEREF _Toc238122913 \h </w:instrText>
+          <w:instrText xml:space="preserve"> PAGEREF _Toc238123213 \h </w:instrText>
         </w:r>
         <w:r>
           <w:rPr>
@@ -507,7 +507,7 @@
           <w14:ligatures w14:val="standardContextual"/>
         </w:rPr>
       </w:pPr>
-      <w:hyperlink w:anchor="_Toc238122914" w:history="1">
+      <w:hyperlink w:anchor="_Toc238123214" w:history="1">
         <w:r>
           <w:rPr>
             <w:rStyle w:val="Hyperlink"/>
@@ -534,7 +534,7 @@
             <w:noProof/>
             <w:webHidden/>
           </w:rPr>
-          <w:instrText xml:space="preserve"> PAGEREF _Toc238122914 \h </w:instrText>
+          <w:instrText xml:space="preserve"> PAGEREF _Toc238123214 \h </w:instrText>
         </w:r>
         <w:r>
           <w:rPr>
@@ -582,7 +582,7 @@
           <w14:ligatures w14:val="standardContextual"/>
         </w:rPr>
       </w:pPr>
-      <w:hyperlink w:anchor="_Toc238122915" w:history="1">
+      <w:hyperlink w:anchor="_Toc238123215" w:history="1">
         <w:r>
           <w:rPr>
             <w:rStyle w:val="Hyperlink"/>
@@ -609,7 +609,7 @@
             <w:noProof/>
             <w:webHidden/>
           </w:rPr>
-          <w:instrText xml:space="preserve"> PAGEREF _Toc238122915 \h </w:instrText>
+          <w:instrText xml:space="preserve"> PAGEREF _Toc238123215 \h </w:instrText>
         </w:r>
         <w:r>
           <w:rPr>
@@ -657,7 +657,7 @@
           <w14:ligatures w14:val="standardContextual"/>
         </w:rPr>
       </w:pPr>
-      <w:hyperlink w:anchor="_Toc238122916" w:history="1">
+      <w:hyperlink w:anchor="_Toc238123216" w:history="1">
         <w:r>
           <w:rPr>
             <w:rStyle w:val="Hyperlink"/>
@@ -684,7 +684,7 @@
             <w:noProof/>
             <w:webHidden/>
           </w:rPr>
-          <w:instrText xml:space="preserve"> PAGEREF _Toc238122916 \h </w:instrText>
+          <w:instrText xml:space="preserve"> PAGEREF _Toc238123216 \h </w:instrText>
         </w:r>
         <w:r>
           <w:rPr>
@@ -732,7 +732,7 @@
           <w14:ligatures w14:val="standardContextual"/>
         </w:rPr>
       </w:pPr>
-      <w:hyperlink w:anchor="_Toc238122917" w:history="1">
+      <w:hyperlink w:anchor="_Toc238123217" w:history="1">
         <w:r>
           <w:rPr>
             <w:rStyle w:val="Hyperlink"/>
@@ -759,7 +759,7 @@
             <w:noProof/>
             <w:webHidden/>
           </w:rPr>
-          <w:instrText xml:space="preserve"> PAGEREF _Toc238122917 \h </w:instrText>
+          <w:instrText xml:space="preserve"> PAGEREF _Toc238123217 \h </w:instrText>
         </w:r>
         <w:r>
           <w:rPr>
@@ -807,7 +807,7 @@
           <w14:ligatures w14:val="standardContextual"/>
         </w:rPr>
       </w:pPr>
-      <w:hyperlink w:anchor="_Toc238122918" w:history="1">
+      <w:hyperlink w:anchor="_Toc238123218" w:history="1">
         <w:r>
           <w:rPr>
             <w:rStyle w:val="Hyperlink"/>
@@ -834,7 +834,7 @@
             <w:noProof/>
             <w:webHidden/>
           </w:rPr>
-          <w:instrText xml:space="preserve"> PAGEREF _Toc238122918 \h </w:instrText>
+          <w:instrText xml:space="preserve"> PAGEREF _Toc238123218 \h </w:instrText>
         </w:r>
         <w:r>
           <w:rPr>
@@ -882,7 +882,7 @@
           <w14:ligatures w14:val="standardContextual"/>
         </w:rPr>
       </w:pPr>
-      <w:hyperlink w:anchor="_Toc238122919" w:history="1">
+      <w:hyperlink w:anchor="_Toc238123219" w:history="1">
         <w:r>
           <w:rPr>
             <w:rStyle w:val="Hyperlink"/>
@@ -909,7 +909,7 @@
             <w:noProof/>
             <w:webHidden/>
           </w:rPr>
-          <w:instrText xml:space="preserve"> PAGEREF _Toc238122919 \h </w:instrText>
+          <w:instrText xml:space="preserve"> PAGEREF _Toc238123219 \h </w:instrText>
         </w:r>
         <w:r>
           <w:rPr>
@@ -957,7 +957,7 @@
           <w14:ligatures w14:val="standardContextual"/>
         </w:rPr>
       </w:pPr>
-      <w:hyperlink w:anchor="_Toc238122920" w:history="1">
+      <w:hyperlink w:anchor="_Toc238123220" w:history="1">
         <w:r>
           <w:rPr>
             <w:rStyle w:val="Hyperlink"/>
@@ -984,7 +984,7 @@
             <w:noProof/>
             <w:webHidden/>
           </w:rPr>
-          <w:instrText xml:space="preserve"> PAGEREF _Toc238122920 \h </w:instrText>
+          <w:instrText xml:space="preserve"> PAGEREF _Toc238123220 \h </w:instrText>
         </w:r>
         <w:r>
           <w:rPr>
@@ -1032,7 +1032,7 @@
           <w14:ligatures w14:val="standardContextual"/>
         </w:rPr>
       </w:pPr>
-      <w:hyperlink w:anchor="_Toc238122921" w:history="1">
+      <w:hyperlink w:anchor="_Toc238123221" w:history="1">
         <w:r>
           <w:rPr>
             <w:rStyle w:val="Hyperlink"/>
@@ -1059,7 +1059,7 @@
             <w:noProof/>
             <w:webHidden/>
           </w:rPr>
-          <w:instrText xml:space="preserve"> PAGEREF _Toc238122921 \h </w:instrText>
+          <w:instrText xml:space="preserve"> PAGEREF _Toc238123221 \h </w:instrText>
         </w:r>
         <w:r>
           <w:rPr>
@@ -1107,7 +1107,7 @@
           <w14:ligatures w14:val="standardContextual"/>
         </w:rPr>
       </w:pPr>
-      <w:hyperlink w:anchor="_Toc238122922" w:history="1">
+      <w:hyperlink w:anchor="_Toc238123222" w:history="1">
         <w:r>
           <w:rPr>
             <w:rStyle w:val="Hyperlink"/>
@@ -1134,7 +1134,7 @@
             <w:noProof/>
             <w:webHidden/>
           </w:rPr>
-          <w:instrText xml:space="preserve"> PAGEREF _Toc238122922 \h </w:instrText>
+          <w:instrText xml:space="preserve"> PAGEREF _Toc238123222 \h </w:instrText>
         </w:r>
         <w:r>
           <w:rPr>
@@ -1182,7 +1182,7 @@
           <w14:ligatures w14:val="standardContextual"/>
         </w:rPr>
       </w:pPr>
-      <w:hyperlink w:anchor="_Toc238122923" w:history="1">
+      <w:hyperlink w:anchor="_Toc238123223" w:history="1">
         <w:r>
           <w:rPr>
             <w:rStyle w:val="Hyperlink"/>
@@ -1209,7 +1209,7 @@
             <w:noProof/>
             <w:webHidden/>
           </w:rPr>
-          <w:instrText xml:space="preserve"> PAGEREF _Toc238122923 \h </w:instrText>
+          <w:instrText xml:space="preserve"> PAGEREF _Toc238123223 \h </w:instrText>
         </w:r>
         <w:r>
           <w:rPr>
@@ -1257,7 +1257,7 @@
           <w14:ligatures w14:val="standardContextual"/>
         </w:rPr>
       </w:pPr>
-      <w:hyperlink w:anchor="_Toc238122924" w:history="1">
+      <w:hyperlink w:anchor="_Toc238123224" w:history="1">
         <w:r>
           <w:rPr>
             <w:rStyle w:val="Hyperlink"/>
@@ -1284,7 +1284,7 @@
             <w:noProof/>
             <w:webHidden/>
           </w:rPr>
-          <w:instrText xml:space="preserve"> PAGEREF _Toc238122924 \h </w:instrText>
+          <w:instrText xml:space="preserve"> PAGEREF _Toc238123224 \h </w:instrText>
         </w:r>
         <w:r>
           <w:rPr>
@@ -1332,7 +1332,7 @@
           <w14:ligatures w14:val="standardContextual"/>
         </w:rPr>
       </w:pPr>
-      <w:hyperlink w:anchor="_Toc238122925" w:history="1">
+      <w:hyperlink w:anchor="_Toc238123225" w:history="1">
         <w:r>
           <w:rPr>
             <w:rStyle w:val="Hyperlink"/>
@@ -1359,7 +1359,7 @@
             <w:noProof/>
             <w:webHidden/>
           </w:rPr>
-          <w:instrText xml:space="preserve"> PAGEREF _Toc238122925 \h </w:instrText>
+          <w:instrText xml:space="preserve"> PAGEREF _Toc238123225 \h </w:instrText>
         </w:r>
         <w:r>
           <w:rPr>
@@ -1407,7 +1407,7 @@
           <w14:ligatures w14:val="standardContextual"/>
         </w:rPr>
       </w:pPr>
-      <w:hyperlink w:anchor="_Toc238122926" w:history="1">
+      <w:hyperlink w:anchor="_Toc238123226" w:history="1">
         <w:r>
           <w:rPr>
             <w:rStyle w:val="Hyperlink"/>
@@ -1434,7 +1434,7 @@
             <w:noProof/>
             <w:webHidden/>
           </w:rPr>
-          <w:instrText xml:space="preserve"> PAGEREF _Toc238122926 \h </w:instrText>
+          <w:instrText xml:space="preserve"> PAGEREF _Toc238123226 \h </w:instrText>
         </w:r>
         <w:r>
           <w:rPr>
@@ -1482,7 +1482,7 @@
           <w14:ligatures w14:val="standardContextual"/>
         </w:rPr>
       </w:pPr>
-      <w:hyperlink w:anchor="_Toc238122927" w:history="1">
+      <w:hyperlink w:anchor="_Toc238123227" w:history="1">
         <w:r>
           <w:rPr>
             <w:rStyle w:val="Hyperlink"/>
@@ -1509,7 +1509,7 @@
             <w:noProof/>
             <w:webHidden/>
           </w:rPr>
-          <w:instrText xml:space="preserve"> PAGEREF _Toc238122927 \h </w:instrText>
+          <w:instrText xml:space="preserve"> PAGEREF _Toc238123227 \h </w:instrText>
         </w:r>
         <w:r>
           <w:rPr>
@@ -1557,7 +1557,7 @@
           <w14:ligatures w14:val="standardContextual"/>
         </w:rPr>
       </w:pPr>
-      <w:hyperlink w:anchor="_Toc238122928" w:history="1">
+      <w:hyperlink w:anchor="_Toc238123228" w:history="1">
         <w:r>
           <w:rPr>
             <w:rStyle w:val="Hyperlink"/>
@@ -1584,7 +1584,7 @@
             <w:noProof/>
             <w:webHidden/>
           </w:rPr>
-          <w:instrText xml:space="preserve"> PAGEREF _Toc238122928 \h </w:instrText>
+          <w:instrText xml:space="preserve"> PAGEREF _Toc238123228 \h </w:instrText>
         </w:r>
         <w:r>
           <w:rPr>
@@ -1632,7 +1632,7 @@
           <w14:ligatures w14:val="standardContextual"/>
         </w:rPr>
       </w:pPr>
-      <w:hyperlink w:anchor="_Toc238122929" w:history="1">
+      <w:hyperlink w:anchor="_Toc238123229" w:history="1">
         <w:r>
           <w:rPr>
             <w:rStyle w:val="Hyperlink"/>
@@ -1659,7 +1659,7 @@
             <w:noProof/>
             <w:webHidden/>
           </w:rPr>
-          <w:instrText xml:space="preserve"> PAGEREF _Toc238122929 \h </w:instrText>
+          <w:instrText xml:space="preserve"> PAGEREF _Toc238123229 \h </w:instrText>
         </w:r>
         <w:r>
           <w:rPr>
@@ -1707,7 +1707,7 @@
           <w14:ligatures w14:val="standardContextual"/>
         </w:rPr>
       </w:pPr>
-      <w:hyperlink w:anchor="_Toc238122930" w:history="1">
+      <w:hyperlink w:anchor="_Toc238123230" w:history="1">
         <w:r>
           <w:rPr>
             <w:rStyle w:val="Hyperlink"/>
@@ -1734,7 +1734,7 @@
             <w:noProof/>
             <w:webHidden/>
           </w:rPr>
-          <w:instrText xml:space="preserve"> PAGEREF _Toc238122930 \h </w:instrText>
+          <w:instrText xml:space="preserve"> PAGEREF _Toc238123230 \h </w:instrText>
         </w:r>
         <w:r>
           <w:rPr>
@@ -1782,7 +1782,7 @@
           <w14:ligatures w14:val="standardContextual"/>
         </w:rPr>
       </w:pPr>
-      <w:hyperlink w:anchor="_Toc238122931" w:history="1">
+      <w:hyperlink w:anchor="_Toc238123231" w:history="1">
         <w:r>
           <w:rPr>
             <w:rStyle w:val="Hyperlink"/>
@@ -1809,7 +1809,7 @@
             <w:noProof/>
             <w:webHidden/>
           </w:rPr>
-          <w:instrText xml:space="preserve"> PAGEREF _Toc238122931 \h </w:instrText>
+          <w:instrText xml:space="preserve"> PAGEREF _Toc238123231 \h </w:instrText>
         </w:r>
         <w:r>
           <w:rPr>
@@ -1857,7 +1857,7 @@
           <w14:ligatures w14:val="standardContextual"/>
         </w:rPr>
       </w:pPr>
-      <w:hyperlink w:anchor="_Toc238122932" w:history="1">
+      <w:hyperlink w:anchor="_Toc238123232" w:history="1">
         <w:r>
           <w:rPr>
             <w:rStyle w:val="Hyperlink"/>
@@ -1884,7 +1884,7 @@
             <w:noProof/>
             <w:webHidden/>
           </w:rPr>
-          <w:instrText xml:space="preserve"> PAGEREF _Toc238122932 \h </w:instrText>
+          <w:instrText xml:space="preserve"> PAGEREF _Toc238123232 \h </w:instrText>
         </w:r>
         <w:r>
           <w:rPr>
@@ -1932,7 +1932,7 @@
           <w14:ligatures w14:val="standardContextual"/>
         </w:rPr>
       </w:pPr>
-      <w:hyperlink w:anchor="_Toc238122933" w:history="1">
+      <w:hyperlink w:anchor="_Toc238123233" w:history="1">
         <w:r>
           <w:rPr>
             <w:rStyle w:val="Hyperlink"/>
@@ -1959,7 +1959,7 @@
             <w:noProof/>
             <w:webHidden/>
           </w:rPr>
-          <w:instrText xml:space="preserve"> PAGEREF _Toc238122933 \h </w:instrText>
+          <w:instrText xml:space="preserve"> PAGEREF _Toc238123233 \h </w:instrText>
         </w:r>
         <w:r>
           <w:rPr>
@@ -2007,7 +2007,7 @@
           <w14:ligatures w14:val="standardContextual"/>
         </w:rPr>
       </w:pPr>
-      <w:hyperlink w:anchor="_Toc238122934" w:history="1">
+      <w:hyperlink w:anchor="_Toc238123234" w:history="1">
         <w:r>
           <w:rPr>
             <w:rStyle w:val="Hyperlink"/>
@@ -2034,7 +2034,7 @@
             <w:noProof/>
             <w:webHidden/>
           </w:rPr>
-          <w:instrText xml:space="preserve"> PAGEREF _Toc238122934 \h </w:instrText>
+          <w:instrText xml:space="preserve"> PAGEREF _Toc238123234 \h </w:instrText>
         </w:r>
         <w:r>
           <w:rPr>
@@ -2082,7 +2082,7 @@
           <w14:ligatures w14:val="standardContextual"/>
         </w:rPr>
       </w:pPr>
-      <w:hyperlink w:anchor="_Toc238122935" w:history="1">
+      <w:hyperlink w:anchor="_Toc238123235" w:history="1">
         <w:r>
           <w:rPr>
             <w:rStyle w:val="Hyperlink"/>
@@ -2109,7 +2109,7 @@
             <w:noProof/>
             <w:webHidden/>
           </w:rPr>
-          <w:instrText xml:space="preserve"> PAGEREF _Toc238122935 \h </w:instrText>
+          <w:instrText xml:space="preserve"> PAGEREF _Toc238123235 \h </w:instrText>
         </w:r>
         <w:r>
           <w:rPr>
@@ -2157,7 +2157,7 @@
           <w14:ligatures w14:val="standardContextual"/>
         </w:rPr>
       </w:pPr>
-      <w:hyperlink w:anchor="_Toc238122936" w:history="1">
+      <w:hyperlink w:anchor="_Toc238123236" w:history="1">
         <w:r>
           <w:rPr>
             <w:rStyle w:val="Hyperlink"/>
@@ -2184,7 +2184,7 @@
             <w:noProof/>
             <w:webHidden/>
           </w:rPr>
-          <w:instrText xml:space="preserve"> PAGEREF _Toc238122936 \h </w:instrText>
+          <w:instrText xml:space="preserve"> PAGEREF _Toc238123236 \h </w:instrText>
         </w:r>
         <w:r>
           <w:rPr>
@@ -2232,7 +2232,7 @@
           <w14:ligatures w14:val="standardContextual"/>
         </w:rPr>
       </w:pPr>
-      <w:hyperlink w:anchor="_Toc238122937" w:history="1">
+      <w:hyperlink w:anchor="_Toc238123237" w:history="1">
         <w:r>
           <w:rPr>
             <w:rStyle w:val="Hyperlink"/>
@@ -2259,7 +2259,7 @@
             <w:noProof/>
             <w:webHidden/>
           </w:rPr>
-          <w:instrText xml:space="preserve"> PAGEREF _Toc238122937 \h </w:instrText>
+          <w:instrText xml:space="preserve"> PAGEREF _Toc238123237 \h </w:instrText>
         </w:r>
         <w:r>
           <w:rPr>
@@ -2307,7 +2307,7 @@
           <w14:ligatures w14:val="standardContextual"/>
         </w:rPr>
       </w:pPr>
-      <w:hyperlink w:anchor="_Toc238122938" w:history="1">
+      <w:hyperlink w:anchor="_Toc238123238" w:history="1">
         <w:r>
           <w:rPr>
             <w:rStyle w:val="Hyperlink"/>
@@ -2334,7 +2334,7 @@
             <w:noProof/>
             <w:webHidden/>
           </w:rPr>
-          <w:instrText xml:space="preserve"> PAGEREF _Toc238122938 \h </w:instrText>
+          <w:instrText xml:space="preserve"> PAGEREF _Toc238123238 \h </w:instrText>
         </w:r>
         <w:r>
           <w:rPr>
@@ -2382,7 +2382,7 @@
           <w14:ligatures w14:val="standardContextual"/>
         </w:rPr>
       </w:pPr>
-      <w:hyperlink w:anchor="_Toc238122939" w:history="1">
+      <w:hyperlink w:anchor="_Toc238123239" w:history="1">
         <w:r>
           <w:rPr>
             <w:rStyle w:val="Hyperlink"/>
@@ -2409,7 +2409,7 @@
             <w:noProof/>
             <w:webHidden/>
           </w:rPr>
-          <w:instrText xml:space="preserve"> PAGEREF _Toc238122939 \h </w:instrText>
+          <w:instrText xml:space="preserve"> PAGEREF _Toc238123239 \h </w:instrText>
         </w:r>
         <w:r>
           <w:rPr>
@@ -2457,7 +2457,7 @@
           <w14:ligatures w14:val="standardContextual"/>
         </w:rPr>
       </w:pPr>
-      <w:hyperlink w:anchor="_Toc238122940" w:history="1">
+      <w:hyperlink w:anchor="_Toc238123240" w:history="1">
         <w:r>
           <w:rPr>
             <w:rStyle w:val="Hyperlink"/>
@@ -2484,7 +2484,7 @@
             <w:noProof/>
             <w:webHidden/>
           </w:rPr>
-          <w:instrText xml:space="preserve"> PAGEREF _Toc238122940 \h </w:instrText>
+          <w:instrText xml:space="preserve"> PAGEREF _Toc238123240 \h </w:instrText>
         </w:r>
         <w:r>
           <w:rPr>
@@ -2532,7 +2532,7 @@
           <w14:ligatures w14:val="standardContextual"/>
         </w:rPr>
       </w:pPr>
-      <w:hyperlink w:anchor="_Toc238122941" w:history="1">
+      <w:hyperlink w:anchor="_Toc238123241" w:history="1">
         <w:r>
           <w:rPr>
             <w:rStyle w:val="Hyperlink"/>
@@ -2559,7 +2559,7 @@
             <w:noProof/>
             <w:webHidden/>
           </w:rPr>
-          <w:instrText xml:space="preserve"> PAGEREF _Toc238122941 \h </w:instrText>
+          <w:instrText xml:space="preserve"> PAGEREF _Toc238123241 \h </w:instrText>
         </w:r>
         <w:r>
           <w:rPr>
@@ -2607,7 +2607,7 @@
           <w14:ligatures w14:val="standardContextual"/>
         </w:rPr>
       </w:pPr>
-      <w:hyperlink w:anchor="_Toc238122942" w:history="1">
+      <w:hyperlink w:anchor="_Toc238123242" w:history="1">
         <w:r>
           <w:rPr>
             <w:rStyle w:val="Hyperlink"/>
@@ -2634,7 +2634,7 @@
             <w:noProof/>
             <w:webHidden/>
           </w:rPr>
-          <w:instrText xml:space="preserve"> PAGEREF _Toc238122942 \h </w:instrText>
+          <w:instrText xml:space="preserve"> PAGEREF _Toc238123242 \h </w:instrText>
         </w:r>
         <w:r>
           <w:rPr>
@@ -2682,7 +2682,7 @@
           <w14:ligatures w14:val="standardContextual"/>
         </w:rPr>
       </w:pPr>
-      <w:hyperlink w:anchor="_Toc238122943" w:history="1">
+      <w:hyperlink w:anchor="_Toc238123243" w:history="1">
         <w:r>
           <w:rPr>
             <w:rStyle w:val="Hyperlink"/>
@@ -2709,7 +2709,7 @@
             <w:noProof/>
             <w:webHidden/>
           </w:rPr>
-          <w:instrText xml:space="preserve"> PAGEREF _Toc238122943 \h </w:instrText>
+          <w:instrText xml:space="preserve"> PAGEREF _Toc238123243 \h </w:instrText>
         </w:r>
         <w:r>
           <w:rPr>
@@ -2757,7 +2757,7 @@
           <w14:ligatures w14:val="standardContextual"/>
         </w:rPr>
       </w:pPr>
-      <w:hyperlink w:anchor="_Toc238122944" w:history="1">
+      <w:hyperlink w:anchor="_Toc238123244" w:history="1">
         <w:r>
           <w:rPr>
             <w:rStyle w:val="Hyperlink"/>
@@ -2784,7 +2784,7 @@
             <w:noProof/>
             <w:webHidden/>
           </w:rPr>
-          <w:instrText xml:space="preserve"> PAGEREF _Toc238122944 \h </w:instrText>
+          <w:instrText xml:space="preserve"> PAGEREF _Toc238123244 \h </w:instrText>
         </w:r>
         <w:r>
           <w:rPr>
@@ -2832,7 +2832,7 @@
           <w14:ligatures w14:val="standardContextual"/>
         </w:rPr>
       </w:pPr>
-      <w:hyperlink w:anchor="_Toc238122945" w:history="1">
+      <w:hyperlink w:anchor="_Toc238123245" w:history="1">
         <w:r>
           <w:rPr>
             <w:rStyle w:val="Hyperlink"/>
@@ -2859,7 +2859,7 @@
             <w:noProof/>
             <w:webHidden/>
           </w:rPr>
-          <w:instrText xml:space="preserve"> PAGEREF _Toc238122945 \h </w:instrText>
+          <w:instrText xml:space="preserve"> PAGEREF _Toc238123245 \h </w:instrText>
         </w:r>
         <w:r>
           <w:rPr>
@@ -2907,7 +2907,7 @@
           <w14:ligatures w14:val="standardContextual"/>
         </w:rPr>
       </w:pPr>
-      <w:hyperlink w:anchor="_Toc238122946" w:history="1">
+      <w:hyperlink w:anchor="_Toc238123246" w:history="1">
         <w:r>
           <w:rPr>
             <w:rStyle w:val="Hyperlink"/>
@@ -2934,7 +2934,7 @@
             <w:noProof/>
             <w:webHidden/>
           </w:rPr>
-          <w:instrText xml:space="preserve"> PAGEREF _Toc238122946 \h </w:instrText>
+          <w:instrText xml:space="preserve"> PAGEREF _Toc238123246 \h </w:instrText>
         </w:r>
         <w:r>
           <w:rPr>
@@ -2982,7 +2982,7 @@
           <w14:ligatures w14:val="standardContextual"/>
         </w:rPr>
       </w:pPr>
-      <w:hyperlink w:anchor="_Toc238122947" w:history="1">
+      <w:hyperlink w:anchor="_Toc238123247" w:history="1">
         <w:r>
           <w:rPr>
             <w:rStyle w:val="Hyperlink"/>
@@ -3009,7 +3009,7 @@
             <w:noProof/>
             <w:webHidden/>
           </w:rPr>
-          <w:instrText xml:space="preserve"> PAGEREF _Toc238122947 \h </w:instrText>
+          <w:instrText xml:space="preserve"> PAGEREF _Toc238123247 \h </w:instrText>
         </w:r>
         <w:r>
           <w:rPr>
@@ -3057,7 +3057,7 @@
           <w14:ligatures w14:val="standardContextual"/>
         </w:rPr>
       </w:pPr>
-      <w:hyperlink w:anchor="_Toc238122948" w:history="1">
+      <w:hyperlink w:anchor="_Toc238123248" w:history="1">
         <w:r>
           <w:rPr>
             <w:rStyle w:val="Hyperlink"/>
@@ -3084,7 +3084,7 @@
             <w:noProof/>
             <w:webHidden/>
           </w:rPr>
-          <w:instrText xml:space="preserve"> PAGEREF _Toc238122948 \h </w:instrText>
+          <w:instrText xml:space="preserve"> PAGEREF _Toc238123248 \h </w:instrText>
         </w:r>
         <w:r>
           <w:rPr>
@@ -3132,7 +3132,7 @@
           <w14:ligatures w14:val="standardContextual"/>
         </w:rPr>
       </w:pPr>
-      <w:hyperlink w:anchor="_Toc238122949" w:history="1">
+      <w:hyperlink w:anchor="_Toc238123249" w:history="1">
         <w:r>
           <w:rPr>
             <w:rStyle w:val="Hyperlink"/>
@@ -3159,7 +3159,7 @@
             <w:noProof/>
             <w:webHidden/>
           </w:rPr>
-          <w:instrText xml:space="preserve"> PAGEREF _Toc238122949 \h </w:instrText>
+          <w:instrText xml:space="preserve"> PAGEREF _Toc238123249 \h </w:instrText>
         </w:r>
         <w:r>
           <w:rPr>
@@ -3207,7 +3207,7 @@
           <w14:ligatures w14:val="standardContextual"/>
         </w:rPr>
       </w:pPr>
-      <w:hyperlink w:anchor="_Toc238122950" w:history="1">
+      <w:hyperlink w:anchor="_Toc238123250" w:history="1">
         <w:r>
           <w:rPr>
             <w:rStyle w:val="Hyperlink"/>
@@ -3234,7 +3234,7 @@
             <w:noProof/>
             <w:webHidden/>
           </w:rPr>
-          <w:instrText xml:space="preserve"> PAGEREF _Toc238122950 \h </w:instrText>
+          <w:instrText xml:space="preserve"> PAGEREF _Toc238123250 \h </w:instrText>
         </w:r>
         <w:r>
           <w:rPr>
@@ -3282,7 +3282,7 @@
           <w14:ligatures w14:val="standardContextual"/>
         </w:rPr>
       </w:pPr>
-      <w:hyperlink w:anchor="_Toc238122951" w:history="1">
+      <w:hyperlink w:anchor="_Toc238123251" w:history="1">
         <w:r>
           <w:rPr>
             <w:rStyle w:val="Hyperlink"/>
@@ -3309,7 +3309,7 @@
             <w:noProof/>
             <w:webHidden/>
           </w:rPr>
-          <w:instrText xml:space="preserve"> PAGEREF _Toc238122951 \h </w:instrText>
+          <w:instrText xml:space="preserve"> PAGEREF _Toc238123251 \h </w:instrText>
         </w:r>
         <w:r>
           <w:rPr>
@@ -3357,7 +3357,7 @@
           <w14:ligatures w14:val="standardContextual"/>
         </w:rPr>
       </w:pPr>
-      <w:hyperlink w:anchor="_Toc238122952" w:history="1">
+      <w:hyperlink w:anchor="_Toc238123252" w:history="1">
         <w:r>
           <w:rPr>
             <w:rStyle w:val="Hyperlink"/>
@@ -3384,7 +3384,7 @@
             <w:noProof/>
             <w:webHidden/>
           </w:rPr>
-          <w:instrText xml:space="preserve"> PAGEREF _Toc238122952 \h </w:instrText>
+          <w:instrText xml:space="preserve"> PAGEREF _Toc238123252 \h </w:instrText>
         </w:r>
         <w:r>
           <w:rPr>
@@ -3432,7 +3432,7 @@
           <w14:ligatures w14:val="standardContextual"/>
         </w:rPr>
       </w:pPr>
-      <w:hyperlink w:anchor="_Toc238122953" w:history="1">
+      <w:hyperlink w:anchor="_Toc238123253" w:history="1">
         <w:r>
           <w:rPr>
             <w:rStyle w:val="Hyperlink"/>
@@ -3459,7 +3459,7 @@
             <w:noProof/>
             <w:webHidden/>
           </w:rPr>
-          <w:instrText xml:space="preserve"> PAGEREF _Toc238122953 \h </w:instrText>
+          <w:instrText xml:space="preserve"> PAGEREF _Toc238123253 \h </w:instrText>
         </w:r>
         <w:r>
           <w:rPr>
@@ -3507,7 +3507,7 @@
           <w14:ligatures w14:val="standardContextual"/>
         </w:rPr>
       </w:pPr>
-      <w:hyperlink w:anchor="_Toc238122954" w:history="1">
+      <w:hyperlink w:anchor="_Toc238123254" w:history="1">
         <w:r>
           <w:rPr>
             <w:rStyle w:val="Hyperlink"/>
@@ -3534,7 +3534,7 @@
             <w:noProof/>
             <w:webHidden/>
           </w:rPr>
-          <w:instrText xml:space="preserve"> PAGEREF _Toc238122954 \h </w:instrText>
+          <w:instrText xml:space="preserve"> PAGEREF _Toc238123254 \h </w:instrText>
         </w:r>
         <w:r>
           <w:rPr>
@@ -3582,7 +3582,7 @@
           <w14:ligatures w14:val="standardContextual"/>
         </w:rPr>
       </w:pPr>
-      <w:hyperlink w:anchor="_Toc238122955" w:history="1">
+      <w:hyperlink w:anchor="_Toc238123255" w:history="1">
         <w:r>
           <w:rPr>
             <w:rStyle w:val="Hyperlink"/>
@@ -3609,7 +3609,7 @@
             <w:noProof/>
             <w:webHidden/>
           </w:rPr>
-          <w:instrText xml:space="preserve"> PAGEREF _Toc238122955 \h </w:instrText>
+          <w:instrText xml:space="preserve"> PAGEREF _Toc238123255 \h </w:instrText>
         </w:r>
         <w:r>
           <w:rPr>
@@ -3657,7 +3657,7 @@
           <w14:ligatures w14:val="standardContextual"/>
         </w:rPr>
       </w:pPr>
-      <w:hyperlink w:anchor="_Toc238122956" w:history="1">
+      <w:hyperlink w:anchor="_Toc238123256" w:history="1">
         <w:r>
           <w:rPr>
             <w:rStyle w:val="Hyperlink"/>
@@ -3684,7 +3684,7 @@
             <w:noProof/>
             <w:webHidden/>
           </w:rPr>
-          <w:instrText xml:space="preserve"> PAGEREF _Toc238122956 \h </w:instrText>
+          <w:instrText xml:space="preserve"> PAGEREF _Toc238123256 \h </w:instrText>
         </w:r>
         <w:r>
           <w:rPr>
@@ -3732,7 +3732,7 @@
           <w14:ligatures w14:val="standardContextual"/>
         </w:rPr>
       </w:pPr>
-      <w:hyperlink w:anchor="_Toc238122957" w:history="1">
+      <w:hyperlink w:anchor="_Toc238123257" w:history="1">
         <w:r>
           <w:rPr>
             <w:rStyle w:val="Hyperlink"/>
@@ -3759,7 +3759,7 @@
             <w:noProof/>
             <w:webHidden/>
           </w:rPr>
-          <w:instrText xml:space="preserve"> PAGEREF _Toc238122957 \h </w:instrText>
+          <w:instrText xml:space="preserve"> PAGEREF _Toc238123257 \h </w:instrText>
         </w:r>
         <w:r>
           <w:rPr>
@@ -3807,7 +3807,7 @@
           <w14:ligatures w14:val="standardContextual"/>
         </w:rPr>
       </w:pPr>
-      <w:hyperlink w:anchor="_Toc238122958" w:history="1">
+      <w:hyperlink w:anchor="_Toc238123258" w:history="1">
         <w:r>
           <w:rPr>
             <w:rStyle w:val="Hyperlink"/>
@@ -3834,7 +3834,7 @@
             <w:noProof/>
             <w:webHidden/>
           </w:rPr>
-          <w:instrText xml:space="preserve"> PAGEREF _Toc238122958 \h </w:instrText>
+          <w:instrText xml:space="preserve"> PAGEREF _Toc238123258 \h </w:instrText>
         </w:r>
         <w:r>
           <w:rPr>
@@ -3882,7 +3882,7 @@
           <w14:ligatures w14:val="standardContextual"/>
         </w:rPr>
       </w:pPr>
-      <w:hyperlink w:anchor="_Toc238122959" w:history="1">
+      <w:hyperlink w:anchor="_Toc238123259" w:history="1">
         <w:r>
           <w:rPr>
             <w:rStyle w:val="Hyperlink"/>
@@ -3909,7 +3909,7 @@
             <w:noProof/>
             <w:webHidden/>
           </w:rPr>
-          <w:instrText xml:space="preserve"> PAGEREF _Toc238122959 \h </w:instrText>
+          <w:instrText xml:space="preserve"> PAGEREF _Toc238123259 \h </w:instrText>
         </w:r>
         <w:r>
           <w:rPr>
@@ -3956,7 +3956,7 @@
       <w:pPr>
         <w:pStyle w:val="Heading1"/>
       </w:pPr>
-      <w:bookmarkStart w:id="1" w:name="_Toc238122911"/>
+      <w:bookmarkStart w:id="1" w:name="_Toc238123211"/>
       <w:r>
         <w:rPr>
           <w:rFonts w:ascii="Times New Roman" w:eastAsia="Times New Roman" w:hAnsi="Times New Roman"/>
@@ -4066,7 +4066,7 @@
       <w:pPr>
         <w:pStyle w:val="Heading1"/>
       </w:pPr>
-      <w:bookmarkStart w:id="2" w:name="_Toc238122912"/>
+      <w:bookmarkStart w:id="2" w:name="_Toc238123212"/>
       <w:r>
         <w:rPr>
           <w:rFonts w:ascii="Times New Roman" w:eastAsia="Times New Roman" w:hAnsi="Times New Roman"/>
@@ -4112,7 +4112,7 @@
       <w:pPr>
         <w:pStyle w:val="Heading1"/>
       </w:pPr>
-      <w:bookmarkStart w:id="3" w:name="_Toc238122913"/>
+      <w:bookmarkStart w:id="3" w:name="_Toc238123213"/>
       <w:r>
         <w:rPr>
           <w:rFonts w:ascii="Times New Roman" w:eastAsia="Times New Roman" w:hAnsi="Times New Roman"/>
@@ -4389,7 +4389,7 @@
               <w:rPr>
                 <w:sz w:val="24"/>
               </w:rPr>
-              <w:t>nhãn chuẩn nhãn</w:t>
+              <w:t>Nhãn chuẩn nhãn</w:t>
             </w:r>
           </w:p>
         </w:tc>
@@ -4753,7 +4753,7 @@
       <w:pPr>
         <w:pStyle w:val="Heading1"/>
       </w:pPr>
-      <w:bookmarkStart w:id="4" w:name="_Toc238122914"/>
+      <w:bookmarkStart w:id="4" w:name="_Toc238123214"/>
       <w:r>
         <w:rPr>
           <w:rFonts w:ascii="Times New Roman" w:eastAsia="Times New Roman" w:hAnsi="Times New Roman"/>
@@ -4816,7 +4816,7 @@
       <w:pPr>
         <w:pStyle w:val="Heading1"/>
       </w:pPr>
-      <w:bookmarkStart w:id="5" w:name="_Toc238122915"/>
+      <w:bookmarkStart w:id="5" w:name="_Toc238123215"/>
       <w:r>
         <w:rPr>
           <w:rFonts w:ascii="Times New Roman" w:eastAsia="Times New Roman" w:hAnsi="Times New Roman"/>
@@ -4829,7 +4829,7 @@
       <w:pPr>
         <w:pStyle w:val="Heading2"/>
       </w:pPr>
-      <w:bookmarkStart w:id="6" w:name="_Toc238122916"/>
+      <w:bookmarkStart w:id="6" w:name="_Toc238123216"/>
       <w:r>
         <w:rPr>
           <w:rFonts w:ascii="Times New Roman" w:eastAsia="Times New Roman" w:hAnsi="Times New Roman"/>
@@ -4861,7 +4861,7 @@
       <w:pPr>
         <w:pStyle w:val="Heading2"/>
       </w:pPr>
-      <w:bookmarkStart w:id="7" w:name="_Toc238122917"/>
+      <w:bookmarkStart w:id="7" w:name="_Toc238123217"/>
       <w:r>
         <w:rPr>
           <w:rFonts w:ascii="Times New Roman" w:eastAsia="Times New Roman" w:hAnsi="Times New Roman"/>
@@ -4876,7 +4876,7 @@
           <w:noProof/>
         </w:rPr>
         <w:drawing>
-          <wp:inline distT="0" distB="0" distL="0" distR="0" wp14:anchorId="2B54839B" wp14:editId="64498921">
+          <wp:inline distT="0" distB="0" distL="0" distR="0" wp14:anchorId="622934DD" wp14:editId="61DDE4E4">
             <wp:extent cx="5760720" cy="2918765"/>
             <wp:effectExtent l="0" t="0" r="0" b="0"/>
             <wp:docPr id="1" name="Picture 1"/>
@@ -5383,7 +5383,7 @@
       <w:pPr>
         <w:pStyle w:val="Heading2"/>
       </w:pPr>
-      <w:bookmarkStart w:id="8" w:name="_Toc238122918"/>
+      <w:bookmarkStart w:id="8" w:name="_Toc238123218"/>
       <w:r>
         <w:rPr>
           <w:rFonts w:ascii="Times New Roman" w:eastAsia="Times New Roman" w:hAnsi="Times New Roman"/>
@@ -5412,7 +5412,7 @@
       <w:pPr>
         <w:pStyle w:val="Heading2"/>
       </w:pPr>
-      <w:bookmarkStart w:id="9" w:name="_Toc238122919"/>
+      <w:bookmarkStart w:id="9" w:name="_Toc238123219"/>
       <w:r>
         <w:rPr>
           <w:rFonts w:ascii="Times New Roman" w:eastAsia="Times New Roman" w:hAnsi="Times New Roman"/>
@@ -5476,7 +5476,7 @@
       <w:pPr>
         <w:pStyle w:val="Heading2"/>
       </w:pPr>
-      <w:bookmarkStart w:id="10" w:name="_Toc238122920"/>
+      <w:bookmarkStart w:id="10" w:name="_Toc238123220"/>
       <w:r>
         <w:rPr>
           <w:rFonts w:ascii="Times New Roman" w:eastAsia="Times New Roman" w:hAnsi="Times New Roman"/>
@@ -5497,7 +5497,7 @@
       <w:pPr>
         <w:pStyle w:val="Heading1"/>
       </w:pPr>
-      <w:bookmarkStart w:id="11" w:name="_Toc238122921"/>
+      <w:bookmarkStart w:id="11" w:name="_Toc238123221"/>
       <w:r>
         <w:rPr>
           <w:rFonts w:ascii="Times New Roman" w:eastAsia="Times New Roman" w:hAnsi="Times New Roman"/>
@@ -5510,7 +5510,7 @@
       <w:pPr>
         <w:pStyle w:val="Heading2"/>
       </w:pPr>
-      <w:bookmarkStart w:id="12" w:name="_Toc238122922"/>
+      <w:bookmarkStart w:id="12" w:name="_Toc238123222"/>
       <w:r>
         <w:rPr>
           <w:rFonts w:ascii="Times New Roman" w:eastAsia="Times New Roman" w:hAnsi="Times New Roman"/>
@@ -5534,7 +5534,7 @@
       <w:pPr>
         <w:pStyle w:val="Heading2"/>
       </w:pPr>
-      <w:bookmarkStart w:id="13" w:name="_Toc238122923"/>
+      <w:bookmarkStart w:id="13" w:name="_Toc238123223"/>
       <w:r>
         <w:rPr>
           <w:rFonts w:ascii="Times New Roman" w:eastAsia="Times New Roman" w:hAnsi="Times New Roman"/>
@@ -5555,7 +5555,7 @@
       <w:pPr>
         <w:pStyle w:val="Heading2"/>
       </w:pPr>
-      <w:bookmarkStart w:id="14" w:name="_Toc238122924"/>
+      <w:bookmarkStart w:id="14" w:name="_Toc238123224"/>
       <w:r>
         <w:rPr>
           <w:rFonts w:ascii="Times New Roman" w:eastAsia="Times New Roman" w:hAnsi="Times New Roman"/>
@@ -5588,7 +5588,7 @@
       <w:pPr>
         <w:pStyle w:val="Heading2"/>
       </w:pPr>
-      <w:bookmarkStart w:id="15" w:name="_Toc238122925"/>
+      <w:bookmarkStart w:id="15" w:name="_Toc238123225"/>
       <w:r>
         <w:rPr>
           <w:rFonts w:ascii="Times New Roman" w:eastAsia="Times New Roman" w:hAnsi="Times New Roman"/>
@@ -5612,7 +5612,7 @@
       <w:pPr>
         <w:pStyle w:val="Heading2"/>
       </w:pPr>
-      <w:bookmarkStart w:id="16" w:name="_Toc238122926"/>
+      <w:bookmarkStart w:id="16" w:name="_Toc238123226"/>
       <w:r>
         <w:rPr>
           <w:rFonts w:ascii="Times New Roman" w:eastAsia="Times New Roman" w:hAnsi="Times New Roman"/>
@@ -5636,7 +5636,7 @@
       <w:pPr>
         <w:pStyle w:val="Heading1"/>
       </w:pPr>
-      <w:bookmarkStart w:id="17" w:name="_Toc238122927"/>
+      <w:bookmarkStart w:id="17" w:name="_Toc238123227"/>
       <w:r>
         <w:rPr>
           <w:rFonts w:ascii="Times New Roman" w:eastAsia="Times New Roman" w:hAnsi="Times New Roman"/>
@@ -5649,7 +5649,7 @@
       <w:pPr>
         <w:pStyle w:val="Heading2"/>
       </w:pPr>
-      <w:bookmarkStart w:id="18" w:name="_Toc238122928"/>
+      <w:bookmarkStart w:id="18" w:name="_Toc238123228"/>
       <w:r>
         <w:rPr>
           <w:rFonts w:ascii="Times New Roman" w:eastAsia="Times New Roman" w:hAnsi="Times New Roman"/>
@@ -5670,7 +5670,7 @@
       <w:pPr>
         <w:pStyle w:val="Heading2"/>
       </w:pPr>
-      <w:bookmarkStart w:id="19" w:name="_Toc238122929"/>
+      <w:bookmarkStart w:id="19" w:name="_Toc238123229"/>
       <w:r>
         <w:rPr>
           <w:rFonts w:ascii="Times New Roman" w:eastAsia="Times New Roman" w:hAnsi="Times New Roman"/>
@@ -6593,7 +6593,7 @@
       <w:pPr>
         <w:pStyle w:val="Heading2"/>
       </w:pPr>
-      <w:bookmarkStart w:id="20" w:name="_Toc238122930"/>
+      <w:bookmarkStart w:id="20" w:name="_Toc238123230"/>
       <w:r>
         <w:rPr>
           <w:rFonts w:ascii="Times New Roman" w:eastAsia="Times New Roman" w:hAnsi="Times New Roman"/>
@@ -6769,7 +6769,7 @@
               <w:rPr>
                 <w:sz w:val="22"/>
               </w:rPr>
-              <w:t>trạng thái yêu cầu</w:t>
+              <w:t>Trạng thái yêu cầu</w:t>
             </w:r>
           </w:p>
         </w:tc>
@@ -6871,7 +6871,7 @@
               <w:rPr>
                 <w:sz w:val="22"/>
               </w:rPr>
-              <w:t>trạng thái phủ định</w:t>
+              <w:t>Trạng thái phủ định</w:t>
             </w:r>
           </w:p>
         </w:tc>
@@ -6973,7 +6973,7 @@
               <w:rPr>
                 <w:sz w:val="22"/>
               </w:rPr>
-              <w:t>trạng thái trích dẫn</w:t>
+              <w:t>Trạng thái trích dẫn</w:t>
             </w:r>
           </w:p>
         </w:tc>
@@ -7075,7 +7075,7 @@
               <w:rPr>
                 <w:sz w:val="22"/>
               </w:rPr>
-              <w:t>trạng thái kể lại</w:t>
+              <w:t>Trạng thái kể lại</w:t>
             </w:r>
           </w:p>
         </w:tc>
@@ -7170,7 +7170,7 @@
       <w:pPr>
         <w:pStyle w:val="Heading2"/>
       </w:pPr>
-      <w:bookmarkStart w:id="21" w:name="_Toc238122931"/>
+      <w:bookmarkStart w:id="21" w:name="_Toc238123231"/>
       <w:r>
         <w:rPr>
           <w:rFonts w:ascii="Times New Roman" w:eastAsia="Times New Roman" w:hAnsi="Times New Roman"/>
@@ -7637,7 +7637,7 @@
       <w:pPr>
         <w:pStyle w:val="Heading2"/>
       </w:pPr>
-      <w:bookmarkStart w:id="22" w:name="_Toc238122932"/>
+      <w:bookmarkStart w:id="22" w:name="_Toc238123232"/>
       <w:r>
         <w:rPr>
           <w:rFonts w:ascii="Times New Roman" w:eastAsia="Times New Roman" w:hAnsi="Times New Roman"/>
@@ -7732,7 +7732,7 @@
                 <w:b/>
                 <w:sz w:val="24"/>
               </w:rPr>
-              <w:t>huấn luyện</w:t>
+              <w:t>Huấn luyện</w:t>
             </w:r>
           </w:p>
         </w:tc>
@@ -7812,7 +7812,7 @@
               <w:rPr>
                 <w:sz w:val="24"/>
               </w:rPr>
-              <w:t>ngữ nghĩa</w:t>
+              <w:t>Ngữ nghĩa</w:t>
             </w:r>
           </w:p>
         </w:tc>
@@ -7914,7 +7914,7 @@
               <w:rPr>
                 <w:sz w:val="24"/>
               </w:rPr>
-              <w:t>mức độ rủi ro</w:t>
+              <w:t>Mức độ rủi ro</w:t>
             </w:r>
           </w:p>
         </w:tc>
@@ -8088,7 +8088,7 @@
               <w:rPr>
                 <w:sz w:val="24"/>
               </w:rPr>
-              <w:t>200 trường hợp khóa riêng, không thuộc huấn luyện/DEV</w:t>
+              <w:t>200 Trường hợp khóa riêng, không thuộc huấn luyện/DEV</w:t>
             </w:r>
           </w:p>
         </w:tc>
@@ -8111,7 +8111,7 @@
       <w:pPr>
         <w:pStyle w:val="Heading2"/>
       </w:pPr>
-      <w:bookmarkStart w:id="23" w:name="_Toc238122933"/>
+      <w:bookmarkStart w:id="23" w:name="_Toc238123233"/>
       <w:r>
         <w:rPr>
           <w:rFonts w:ascii="Times New Roman" w:eastAsia="Times New Roman" w:hAnsi="Times New Roman"/>
@@ -8127,7 +8127,7 @@
           <w:noProof/>
         </w:rPr>
         <w:drawing>
-          <wp:inline distT="0" distB="0" distL="0" distR="0" wp14:anchorId="741E9D30" wp14:editId="55813159">
+          <wp:inline distT="0" distB="0" distL="0" distR="0" wp14:anchorId="18A2DA2B" wp14:editId="3A986735">
             <wp:extent cx="5760720" cy="2918765"/>
             <wp:effectExtent l="0" t="0" r="0" b="0"/>
             <wp:docPr id="2" name="Picture 2"/>
@@ -8264,7 +8264,7 @@
       <w:pPr>
         <w:pStyle w:val="Heading2"/>
       </w:pPr>
-      <w:bookmarkStart w:id="24" w:name="_Toc238122934"/>
+      <w:bookmarkStart w:id="24" w:name="_Toc238123234"/>
       <w:r>
         <w:rPr>
           <w:rFonts w:ascii="Times New Roman" w:eastAsia="Times New Roman" w:hAnsi="Times New Roman"/>
@@ -8378,7 +8378,7 @@
                 <w:b/>
                 <w:sz w:val="23"/>
               </w:rPr>
-              <w:t>trạng thái yêu cầu</w:t>
+              <w:t>Trạng thái yêu cầu</w:t>
             </w:r>
           </w:p>
         </w:tc>
@@ -8403,7 +8403,7 @@
                 <w:b/>
                 <w:sz w:val="23"/>
               </w:rPr>
-              <w:t>trạng thái phủ định</w:t>
+              <w:t>Trạng thái phủ định</w:t>
             </w:r>
           </w:p>
         </w:tc>
@@ -8963,7 +8963,7 @@
       <w:pPr>
         <w:pStyle w:val="Heading2"/>
       </w:pPr>
-      <w:bookmarkStart w:id="25" w:name="_Toc238122935"/>
+      <w:bookmarkStart w:id="25" w:name="_Toc238123235"/>
       <w:r>
         <w:rPr>
           <w:rFonts w:ascii="Times New Roman" w:eastAsia="Times New Roman" w:hAnsi="Times New Roman"/>
@@ -8979,7 +8979,7 @@
           <w:noProof/>
         </w:rPr>
         <w:drawing>
-          <wp:inline distT="0" distB="0" distL="0" distR="0" wp14:anchorId="584F075C" wp14:editId="6ADA4111">
+          <wp:inline distT="0" distB="0" distL="0" distR="0" wp14:anchorId="03BC2FF4" wp14:editId="658852FE">
             <wp:extent cx="5760720" cy="2918765"/>
             <wp:effectExtent l="0" t="0" r="0" b="0"/>
             <wp:docPr id="3" name="Picture 3"/>
@@ -9130,7 +9130,7 @@
       <w:pPr>
         <w:pStyle w:val="Heading2"/>
       </w:pPr>
-      <w:bookmarkStart w:id="26" w:name="_Toc238122936"/>
+      <w:bookmarkStart w:id="26" w:name="_Toc238123236"/>
       <w:r>
         <w:rPr>
           <w:rFonts w:ascii="Times New Roman" w:eastAsia="Times New Roman" w:hAnsi="Times New Roman"/>
@@ -9428,7 +9428,7 @@
               <w:rPr>
                 <w:sz w:val="22"/>
               </w:rPr>
-              <w:t>lô dữ liệu</w:t>
+              <w:t>Lô dữ liệu</w:t>
             </w:r>
           </w:p>
         </w:tc>
@@ -9452,7 +9452,7 @@
               <w:rPr>
                 <w:sz w:val="22"/>
               </w:rPr>
-              <w:t>lô dữ liệu 2; gradient accumulation 8</w:t>
+              <w:t>Lô dữ liệu 2; gradient accumulation 8</w:t>
             </w:r>
           </w:p>
         </w:tc>
@@ -9506,7 +9506,7 @@
               <w:rPr>
                 <w:sz w:val="22"/>
               </w:rPr>
-              <w:t>vòng huấn luyện</w:t>
+              <w:t>Vòng huấn luyện</w:t>
             </w:r>
           </w:p>
         </w:tc>
@@ -9608,7 +9608,7 @@
               <w:rPr>
                 <w:sz w:val="22"/>
               </w:rPr>
-              <w:t>bfloat16 trên CUDA</w:t>
+              <w:t>Bfloat16 trên CUDA</w:t>
             </w:r>
           </w:p>
         </w:tc>
@@ -9764,7 +9764,7 @@
               <w:rPr>
                 <w:sz w:val="22"/>
               </w:rPr>
-              <w:t>40417 cho ngữ nghĩa; 11019 cho rủi ro</w:t>
+              <w:t>40417 Cho ngữ nghĩa; 11019 cho rủi ro</w:t>
             </w:r>
           </w:p>
         </w:tc>
@@ -9819,7 +9819,7 @@
       <w:pPr>
         <w:pStyle w:val="Heading2"/>
       </w:pPr>
-      <w:bookmarkStart w:id="27" w:name="_Toc238122937"/>
+      <w:bookmarkStart w:id="27" w:name="_Toc238123237"/>
       <w:r>
         <w:rPr>
           <w:rFonts w:ascii="Times New Roman" w:eastAsia="Times New Roman" w:hAnsi="Times New Roman"/>
@@ -9835,7 +9835,7 @@
           <w:noProof/>
         </w:rPr>
         <w:drawing>
-          <wp:inline distT="0" distB="0" distL="0" distR="0" wp14:anchorId="51FF118D" wp14:editId="4151291C">
+          <wp:inline distT="0" distB="0" distL="0" distR="0" wp14:anchorId="39E4D2AF" wp14:editId="1A735972">
             <wp:extent cx="5760720" cy="2918765"/>
             <wp:effectExtent l="0" t="0" r="0" b="0"/>
             <wp:docPr id="4" name="Picture 4"/>
@@ -9972,7 +9972,7 @@
       <w:pPr>
         <w:pStyle w:val="Heading2"/>
       </w:pPr>
-      <w:bookmarkStart w:id="28" w:name="_Toc238122938"/>
+      <w:bookmarkStart w:id="28" w:name="_Toc238123238"/>
       <w:r>
         <w:rPr>
           <w:rFonts w:ascii="Times New Roman" w:eastAsia="Times New Roman" w:hAnsi="Times New Roman"/>
@@ -10005,7 +10005,7 @@
       <w:pPr>
         <w:pStyle w:val="Heading1"/>
       </w:pPr>
-      <w:bookmarkStart w:id="29" w:name="_Toc238122939"/>
+      <w:bookmarkStart w:id="29" w:name="_Toc238123239"/>
       <w:r>
         <w:rPr>
           <w:rFonts w:ascii="Times New Roman" w:eastAsia="Times New Roman" w:hAnsi="Times New Roman"/>
@@ -10018,7 +10018,7 @@
       <w:pPr>
         <w:pStyle w:val="Heading2"/>
       </w:pPr>
-      <w:bookmarkStart w:id="30" w:name="_Toc238122940"/>
+      <w:bookmarkStart w:id="30" w:name="_Toc238123240"/>
       <w:r>
         <w:rPr>
           <w:rFonts w:ascii="Times New Roman" w:eastAsia="Times New Roman" w:hAnsi="Times New Roman"/>
@@ -10159,7 +10159,7 @@
               <w:rPr>
                 <w:sz w:val="23"/>
               </w:rPr>
-              <w:t>hành động được đề cập</w:t>
+              <w:t>Hành động được đề cập</w:t>
             </w:r>
           </w:p>
         </w:tc>
@@ -10237,7 +10237,7 @@
               <w:rPr>
                 <w:sz w:val="23"/>
               </w:rPr>
-              <w:t>trạng thái yêu cầu</w:t>
+              <w:t>Trạng thái yêu cầu</w:t>
             </w:r>
           </w:p>
         </w:tc>
@@ -10315,7 +10315,7 @@
               <w:rPr>
                 <w:sz w:val="23"/>
               </w:rPr>
-              <w:t>trạng thái phủ định</w:t>
+              <w:t>Trạng thái phủ định</w:t>
             </w:r>
           </w:p>
         </w:tc>
@@ -10393,7 +10393,7 @@
               <w:rPr>
                 <w:sz w:val="23"/>
               </w:rPr>
-              <w:t>trạng thái trích dẫn</w:t>
+              <w:t>Trạng thái trích dẫn</w:t>
             </w:r>
           </w:p>
         </w:tc>
@@ -10471,7 +10471,7 @@
               <w:rPr>
                 <w:sz w:val="23"/>
               </w:rPr>
-              <w:t>trạng thái kể lại</w:t>
+              <w:t>Trạng thái kể lại</w:t>
             </w:r>
           </w:p>
         </w:tc>
@@ -10549,7 +10549,7 @@
               <w:rPr>
                 <w:sz w:val="23"/>
               </w:rPr>
-              <w:t>hành động được xác nhận</w:t>
+              <w:t>Hành động được xác nhận</w:t>
             </w:r>
           </w:p>
         </w:tc>
@@ -10628,7 +10628,7 @@
       <w:pPr>
         <w:pStyle w:val="Heading2"/>
       </w:pPr>
-      <w:bookmarkStart w:id="31" w:name="_Toc238122941"/>
+      <w:bookmarkStart w:id="31" w:name="_Toc238123241"/>
       <w:r>
         <w:rPr>
           <w:rFonts w:ascii="Times New Roman" w:eastAsia="Times New Roman" w:hAnsi="Times New Roman"/>
@@ -10919,7 +10919,7 @@
       <w:pPr>
         <w:pStyle w:val="Heading2"/>
       </w:pPr>
-      <w:bookmarkStart w:id="32" w:name="_Toc238122942"/>
+      <w:bookmarkStart w:id="32" w:name="_Toc238123242"/>
       <w:r>
         <w:rPr>
           <w:rFonts w:ascii="Times New Roman" w:eastAsia="Times New Roman" w:hAnsi="Times New Roman"/>
@@ -11060,7 +11060,7 @@
               <w:rPr>
                 <w:sz w:val="22"/>
               </w:rPr>
-              <w:t>độ chính xác nghiêm ngặt</w:t>
+              <w:t>Độ chính xác nghiêm ngặt</w:t>
             </w:r>
           </w:p>
         </w:tc>
@@ -11294,7 +11294,7 @@
               <w:rPr>
                 <w:sz w:val="22"/>
               </w:rPr>
-              <w:t>độ chính xác vận hành</w:t>
+              <w:t>Độ chính xác vận hành</w:t>
             </w:r>
           </w:p>
         </w:tc>
@@ -11611,7 +11611,7 @@
       <w:pPr>
         <w:pStyle w:val="Heading2"/>
       </w:pPr>
-      <w:bookmarkStart w:id="33" w:name="_Toc238122943"/>
+      <w:bookmarkStart w:id="33" w:name="_Toc238123243"/>
       <w:r>
         <w:rPr>
           <w:rFonts w:ascii="Times New Roman" w:eastAsia="Times New Roman" w:hAnsi="Times New Roman"/>
@@ -12191,7 +12191,7 @@
       <w:pPr>
         <w:pStyle w:val="Heading2"/>
       </w:pPr>
-      <w:bookmarkStart w:id="34" w:name="_Toc238122944"/>
+      <w:bookmarkStart w:id="34" w:name="_Toc238123244"/>
       <w:r>
         <w:rPr>
           <w:rFonts w:ascii="Times New Roman" w:eastAsia="Times New Roman" w:hAnsi="Times New Roman"/>
@@ -12232,7 +12232,7 @@
       <w:pPr>
         <w:pStyle w:val="Heading2"/>
       </w:pPr>
-      <w:bookmarkStart w:id="35" w:name="_Toc238122945"/>
+      <w:bookmarkStart w:id="35" w:name="_Toc238123245"/>
       <w:r>
         <w:rPr>
           <w:rFonts w:ascii="Times New Roman" w:eastAsia="Times New Roman" w:hAnsi="Times New Roman"/>
@@ -12269,7 +12269,7 @@
       <w:pPr>
         <w:pStyle w:val="Heading2"/>
       </w:pPr>
-      <w:bookmarkStart w:id="36" w:name="_Toc238122946"/>
+      <w:bookmarkStart w:id="36" w:name="_Toc238123246"/>
       <w:r>
         <w:rPr>
           <w:rFonts w:ascii="Times New Roman" w:eastAsia="Times New Roman" w:hAnsi="Times New Roman"/>
@@ -12298,7 +12298,7 @@
       <w:pPr>
         <w:pStyle w:val="Heading2"/>
       </w:pPr>
-      <w:bookmarkStart w:id="37" w:name="_Toc238122947"/>
+      <w:bookmarkStart w:id="37" w:name="_Toc238123247"/>
       <w:r>
         <w:rPr>
           <w:rFonts w:ascii="Times New Roman" w:eastAsia="Times New Roman" w:hAnsi="Times New Roman"/>
@@ -12518,7 +12518,7 @@
               <w:rPr>
                 <w:sz w:val="21"/>
               </w:rPr>
-              <w:t>nhãn chuẩn độc lập không có lớp REVIEW</w:t>
+              <w:t>Nhãn chuẩn độc lập không có lớp REVIEW</w:t>
             </w:r>
           </w:p>
         </w:tc>
@@ -12674,7 +12674,7 @@
               <w:rPr>
                 <w:sz w:val="21"/>
               </w:rPr>
-              <w:t>độ tin cậy chưa hiệu chỉnh</w:t>
+              <w:t>Độ tin cậy chưa hiệu chỉnh</w:t>
             </w:r>
           </w:p>
         </w:tc>
@@ -12901,7 +12901,7 @@
       <w:pPr>
         <w:pStyle w:val="Heading1"/>
       </w:pPr>
-      <w:bookmarkStart w:id="38" w:name="_Toc238122948"/>
+      <w:bookmarkStart w:id="38" w:name="_Toc238123248"/>
       <w:r>
         <w:rPr>
           <w:rFonts w:ascii="Times New Roman" w:eastAsia="Times New Roman" w:hAnsi="Times New Roman"/>
@@ -12914,7 +12914,7 @@
       <w:pPr>
         <w:pStyle w:val="Heading2"/>
       </w:pPr>
-      <w:bookmarkStart w:id="39" w:name="_Toc238122949"/>
+      <w:bookmarkStart w:id="39" w:name="_Toc238123249"/>
       <w:r>
         <w:rPr>
           <w:rFonts w:ascii="Times New Roman" w:eastAsia="Times New Roman" w:hAnsi="Times New Roman"/>
@@ -12947,7 +12947,7 @@
       <w:pPr>
         <w:pStyle w:val="Heading2"/>
       </w:pPr>
-      <w:bookmarkStart w:id="40" w:name="_Toc238122950"/>
+      <w:bookmarkStart w:id="40" w:name="_Toc238123250"/>
       <w:r>
         <w:rPr>
           <w:rFonts w:ascii="Times New Roman" w:eastAsia="Times New Roman" w:hAnsi="Times New Roman"/>
@@ -13010,7 +13010,7 @@
       <w:pPr>
         <w:pStyle w:val="Heading2"/>
       </w:pPr>
-      <w:bookmarkStart w:id="41" w:name="_Toc238122951"/>
+      <w:bookmarkStart w:id="41" w:name="_Toc238123251"/>
       <w:r>
         <w:rPr>
           <w:rFonts w:ascii="Times New Roman" w:eastAsia="Times New Roman" w:hAnsi="Times New Roman"/>
@@ -13047,7 +13047,7 @@
       <w:pPr>
         <w:pStyle w:val="Heading2"/>
       </w:pPr>
-      <w:bookmarkStart w:id="42" w:name="_Toc238122952"/>
+      <w:bookmarkStart w:id="42" w:name="_Toc238123252"/>
       <w:r>
         <w:rPr>
           <w:rFonts w:ascii="Times New Roman" w:eastAsia="Times New Roman" w:hAnsi="Times New Roman"/>
@@ -13083,7 +13083,7 @@
       <w:pPr>
         <w:pStyle w:val="Heading1"/>
       </w:pPr>
-      <w:bookmarkStart w:id="43" w:name="_Toc238122953"/>
+      <w:bookmarkStart w:id="43" w:name="_Toc238123253"/>
       <w:r>
         <w:rPr>
           <w:rFonts w:ascii="Times New Roman" w:eastAsia="Times New Roman" w:hAnsi="Times New Roman"/>
@@ -13184,7 +13184,7 @@
       <w:pPr>
         <w:pStyle w:val="Heading1"/>
       </w:pPr>
-      <w:bookmarkStart w:id="44" w:name="_Toc238122954"/>
+      <w:bookmarkStart w:id="44" w:name="_Toc238123254"/>
       <w:r>
         <w:rPr>
           <w:rFonts w:ascii="Times New Roman" w:eastAsia="Times New Roman" w:hAnsi="Times New Roman"/>
@@ -13198,7 +13198,7 @@
       <w:pPr>
         <w:pStyle w:val="Heading2"/>
       </w:pPr>
-      <w:bookmarkStart w:id="45" w:name="_Toc238122955"/>
+      <w:bookmarkStart w:id="45" w:name="_Toc238123255"/>
       <w:r>
         <w:rPr>
           <w:rFonts w:ascii="Times New Roman" w:eastAsia="Times New Roman" w:hAnsi="Times New Roman"/>
@@ -13304,7 +13304,7 @@
       <w:pPr>
         <w:pStyle w:val="Heading2"/>
       </w:pPr>
-      <w:bookmarkStart w:id="46" w:name="_Toc238122956"/>
+      <w:bookmarkStart w:id="46" w:name="_Toc238123256"/>
       <w:r>
         <w:rPr>
           <w:rFonts w:ascii="Times New Roman" w:eastAsia="Times New Roman" w:hAnsi="Times New Roman"/>
@@ -13382,7 +13382,7 @@
       <w:pPr>
         <w:pStyle w:val="Heading2"/>
       </w:pPr>
-      <w:bookmarkStart w:id="47" w:name="_Toc238122957"/>
+      <w:bookmarkStart w:id="47" w:name="_Toc238123257"/>
       <w:r>
         <w:rPr>
           <w:rFonts w:ascii="Times New Roman" w:eastAsia="Times New Roman" w:hAnsi="Times New Roman"/>
@@ -13521,7 +13521,7 @@
               <w:rPr>
                 <w:sz w:val="19"/>
               </w:rPr>
-              <w:t>ae0420e7efbdbe791b71907131c480e6fcb9d7cef9f1e4f6382cdc392eb66019</w:t>
+              <w:t>Ae0420e7efbdbe791b71907131c480e6fcb9d7cef9f1e4f6382cdc392eb66019</w:t>
             </w:r>
           </w:p>
         </w:tc>
@@ -13575,7 +13575,7 @@
               <w:rPr>
                 <w:sz w:val="19"/>
               </w:rPr>
-              <w:t>824b58d32366d746adc32b4350c73cad49054f538d365f6661da4036535c8328</w:t>
+              <w:t>824B58d32366d746adc32b4350c73cad49054f538d365f6661da4036535c8328</w:t>
             </w:r>
           </w:p>
         </w:tc>
@@ -13629,7 +13629,7 @@
               <w:rPr>
                 <w:sz w:val="19"/>
               </w:rPr>
-              <w:t>bf28821ad7a00fdecdbf323a6fe4db26a74ecf21c7a4a63f9194f25682bc3d87</w:t>
+              <w:t>Bf28821ad7a00fdecdbf323a6fe4db26a74ecf21c7a4a63f9194f25682bc3d87</w:t>
             </w:r>
           </w:p>
         </w:tc>
@@ -13683,7 +13683,7 @@
               <w:rPr>
                 <w:sz w:val="19"/>
               </w:rPr>
-              <w:t>67aba49b6fb118d6b5c5ba4e335442a6bba7e5842706fe3477609bddf2c311cf</w:t>
+              <w:t>67Aba49b6fb118d6b5c5ba4e335442a6bba7e5842706fe3477609bddf2c311cf</w:t>
             </w:r>
           </w:p>
         </w:tc>
@@ -13737,7 +13737,7 @@
               <w:rPr>
                 <w:sz w:val="19"/>
               </w:rPr>
-              <w:t>40807e46939000a487e5975b5b51942a11ffffb1a4ced3e66a5fa62b5fa7d2ef</w:t>
+              <w:t>40807E46939000a487e5975b5b51942a11ffffb1a4ced3e66a5fa62b5fa7d2ef</w:t>
             </w:r>
           </w:p>
         </w:tc>
@@ -13752,7 +13752,7 @@
       <w:pPr>
         <w:pStyle w:val="Heading2"/>
       </w:pPr>
-      <w:bookmarkStart w:id="48" w:name="_Toc238122958"/>
+      <w:bookmarkStart w:id="48" w:name="_Toc238123258"/>
       <w:r>
         <w:rPr>
           <w:rFonts w:ascii="Times New Roman" w:eastAsia="Times New Roman" w:hAnsi="Times New Roman"/>
@@ -13816,7 +13816,7 @@
       <w:pPr>
         <w:pStyle w:val="Heading2"/>
       </w:pPr>
-      <w:bookmarkStart w:id="49" w:name="_Toc238122959"/>
+      <w:bookmarkStart w:id="49" w:name="_Toc238123259"/>
       <w:r>
         <w:rPr>
           <w:rFonts w:ascii="Times New Roman" w:eastAsia="Times New Roman" w:hAnsi="Times New Roman"/>
@@ -14119,31 +14119,31 @@
       </w:rPr>
     </w:lvl>
   </w:abstractNum>
-  <w:num w:numId="1" w16cid:durableId="217860824">
+  <w:num w:numId="1" w16cid:durableId="2091192201">
     <w:abstractNumId w:val="8"/>
   </w:num>
-  <w:num w:numId="2" w16cid:durableId="290403349">
+  <w:num w:numId="2" w16cid:durableId="1910769960">
     <w:abstractNumId w:val="6"/>
   </w:num>
-  <w:num w:numId="3" w16cid:durableId="953513911">
+  <w:num w:numId="3" w16cid:durableId="2052682905">
     <w:abstractNumId w:val="5"/>
   </w:num>
-  <w:num w:numId="4" w16cid:durableId="817528192">
+  <w:num w:numId="4" w16cid:durableId="986399380">
     <w:abstractNumId w:val="4"/>
   </w:num>
-  <w:num w:numId="5" w16cid:durableId="100489421">
+  <w:num w:numId="5" w16cid:durableId="806969116">
     <w:abstractNumId w:val="7"/>
   </w:num>
-  <w:num w:numId="6" w16cid:durableId="775250877">
+  <w:num w:numId="6" w16cid:durableId="329140257">
     <w:abstractNumId w:val="3"/>
   </w:num>
-  <w:num w:numId="7" w16cid:durableId="219171665">
+  <w:num w:numId="7" w16cid:durableId="412169680">
     <w:abstractNumId w:val="2"/>
   </w:num>
-  <w:num w:numId="8" w16cid:durableId="1685086743">
+  <w:num w:numId="8" w16cid:durableId="381563247">
     <w:abstractNumId w:val="1"/>
   </w:num>
-  <w:num w:numId="9" w16cid:durableId="1275939185">
+  <w:num w:numId="9" w16cid:durableId="613362650">
     <w:abstractNumId w:val="0"/>
   </w:num>
 </w:numbering>
@@ -25533,7 +25533,7 @@
     <w:autoRedefine/>
     <w:uiPriority w:val="39"/>
     <w:unhideWhenUsed/>
-    <w:rsid w:val="007705A4"/>
+    <w:rsid w:val="00462AE7"/>
     <w:pPr>
       <w:spacing w:after="100"/>
     </w:pPr>
@@ -25545,7 +25545,7 @@
     <w:autoRedefine/>
     <w:uiPriority w:val="39"/>
     <w:unhideWhenUsed/>
-    <w:rsid w:val="007705A4"/>
+    <w:rsid w:val="00462AE7"/>
     <w:pPr>
       <w:spacing w:after="100"/>
       <w:ind w:left="260"/>
@@ -25556,7 +25556,7 @@
     <w:basedOn w:val="DefaultParagraphFont"/>
     <w:uiPriority w:val="99"/>
     <w:unhideWhenUsed/>
-    <w:rsid w:val="007705A4"/>
+    <w:rsid w:val="00462AE7"/>
     <w:rPr>
       <w:color w:val="0000FF" w:themeColor="hyperlink"/>
       <w:u w:val="single"/>

</xml_diff>

<commit_message>
docs: refine Vietnamese scientific terminology
</commit_message>
<xml_diff>
--- a/docs/SCAMGUARD_VN_THUYET_MINH_EUREKA_2026_BAN_VIET_HOA.docx
+++ b/docs/SCAMGUARD_VN_THUYET_MINH_EUREKA_2026_BAN_VIET_HOA.docx
@@ -162,7 +162,7 @@
       <w:pPr>
         <w:pStyle w:val="Heading1"/>
       </w:pPr>
-      <w:bookmarkStart w:id="0" w:name="_Toc238123210"/>
+      <w:bookmarkStart w:id="0" w:name="_Toc238123724"/>
       <w:r>
         <w:rPr>
           <w:rFonts w:ascii="Times New Roman" w:eastAsia="Times New Roman" w:hAnsi="Times New Roman"/>
@@ -207,7 +207,7 @@
         </w:rPr>
         <w:fldChar w:fldCharType="separate"/>
       </w:r>
-      <w:hyperlink w:anchor="_Toc238123210" w:history="1">
+      <w:hyperlink w:anchor="_Toc238123724" w:history="1">
         <w:r>
           <w:rPr>
             <w:rStyle w:val="Hyperlink"/>
@@ -234,7 +234,7 @@
             <w:noProof/>
             <w:webHidden/>
           </w:rPr>
-          <w:instrText xml:space="preserve"> PAGEREF _Toc238123210 \h </w:instrText>
+          <w:instrText xml:space="preserve"> PAGEREF _Toc238123724 \h </w:instrText>
         </w:r>
         <w:r>
           <w:rPr>
@@ -282,7 +282,7 @@
           <w14:ligatures w14:val="standardContextual"/>
         </w:rPr>
       </w:pPr>
-      <w:hyperlink w:anchor="_Toc238123211" w:history="1">
+      <w:hyperlink w:anchor="_Toc238123725" w:history="1">
         <w:r>
           <w:rPr>
             <w:rStyle w:val="Hyperlink"/>
@@ -309,7 +309,7 @@
             <w:noProof/>
             <w:webHidden/>
           </w:rPr>
-          <w:instrText xml:space="preserve"> PAGEREF _Toc238123211 \h </w:instrText>
+          <w:instrText xml:space="preserve"> PAGEREF _Toc238123725 \h </w:instrText>
         </w:r>
         <w:r>
           <w:rPr>
@@ -357,7 +357,7 @@
           <w14:ligatures w14:val="standardContextual"/>
         </w:rPr>
       </w:pPr>
-      <w:hyperlink w:anchor="_Toc238123212" w:history="1">
+      <w:hyperlink w:anchor="_Toc238123726" w:history="1">
         <w:r>
           <w:rPr>
             <w:rStyle w:val="Hyperlink"/>
@@ -384,7 +384,7 @@
             <w:noProof/>
             <w:webHidden/>
           </w:rPr>
-          <w:instrText xml:space="preserve"> PAGEREF _Toc238123212 \h </w:instrText>
+          <w:instrText xml:space="preserve"> PAGEREF _Toc238123726 \h </w:instrText>
         </w:r>
         <w:r>
           <w:rPr>
@@ -432,7 +432,7 @@
           <w14:ligatures w14:val="standardContextual"/>
         </w:rPr>
       </w:pPr>
-      <w:hyperlink w:anchor="_Toc238123213" w:history="1">
+      <w:hyperlink w:anchor="_Toc238123727" w:history="1">
         <w:r>
           <w:rPr>
             <w:rStyle w:val="Hyperlink"/>
@@ -459,7 +459,7 @@
             <w:noProof/>
             <w:webHidden/>
           </w:rPr>
-          <w:instrText xml:space="preserve"> PAGEREF _Toc238123213 \h </w:instrText>
+          <w:instrText xml:space="preserve"> PAGEREF _Toc238123727 \h </w:instrText>
         </w:r>
         <w:r>
           <w:rPr>
@@ -507,7 +507,7 @@
           <w14:ligatures w14:val="standardContextual"/>
         </w:rPr>
       </w:pPr>
-      <w:hyperlink w:anchor="_Toc238123214" w:history="1">
+      <w:hyperlink w:anchor="_Toc238123728" w:history="1">
         <w:r>
           <w:rPr>
             <w:rStyle w:val="Hyperlink"/>
@@ -534,7 +534,7 @@
             <w:noProof/>
             <w:webHidden/>
           </w:rPr>
-          <w:instrText xml:space="preserve"> PAGEREF _Toc238123214 \h </w:instrText>
+          <w:instrText xml:space="preserve"> PAGEREF _Toc238123728 \h </w:instrText>
         </w:r>
         <w:r>
           <w:rPr>
@@ -582,7 +582,7 @@
           <w14:ligatures w14:val="standardContextual"/>
         </w:rPr>
       </w:pPr>
-      <w:hyperlink w:anchor="_Toc238123215" w:history="1">
+      <w:hyperlink w:anchor="_Toc238123729" w:history="1">
         <w:r>
           <w:rPr>
             <w:rStyle w:val="Hyperlink"/>
@@ -609,7 +609,7 @@
             <w:noProof/>
             <w:webHidden/>
           </w:rPr>
-          <w:instrText xml:space="preserve"> PAGEREF _Toc238123215 \h </w:instrText>
+          <w:instrText xml:space="preserve"> PAGEREF _Toc238123729 \h </w:instrText>
         </w:r>
         <w:r>
           <w:rPr>
@@ -657,7 +657,7 @@
           <w14:ligatures w14:val="standardContextual"/>
         </w:rPr>
       </w:pPr>
-      <w:hyperlink w:anchor="_Toc238123216" w:history="1">
+      <w:hyperlink w:anchor="_Toc238123730" w:history="1">
         <w:r>
           <w:rPr>
             <w:rStyle w:val="Hyperlink"/>
@@ -684,7 +684,7 @@
             <w:noProof/>
             <w:webHidden/>
           </w:rPr>
-          <w:instrText xml:space="preserve"> PAGEREF _Toc238123216 \h </w:instrText>
+          <w:instrText xml:space="preserve"> PAGEREF _Toc238123730 \h </w:instrText>
         </w:r>
         <w:r>
           <w:rPr>
@@ -732,7 +732,7 @@
           <w14:ligatures w14:val="standardContextual"/>
         </w:rPr>
       </w:pPr>
-      <w:hyperlink w:anchor="_Toc238123217" w:history="1">
+      <w:hyperlink w:anchor="_Toc238123731" w:history="1">
         <w:r>
           <w:rPr>
             <w:rStyle w:val="Hyperlink"/>
@@ -759,7 +759,7 @@
             <w:noProof/>
             <w:webHidden/>
           </w:rPr>
-          <w:instrText xml:space="preserve"> PAGEREF _Toc238123217 \h </w:instrText>
+          <w:instrText xml:space="preserve"> PAGEREF _Toc238123731 \h </w:instrText>
         </w:r>
         <w:r>
           <w:rPr>
@@ -807,7 +807,7 @@
           <w14:ligatures w14:val="standardContextual"/>
         </w:rPr>
       </w:pPr>
-      <w:hyperlink w:anchor="_Toc238123218" w:history="1">
+      <w:hyperlink w:anchor="_Toc238123732" w:history="1">
         <w:r>
           <w:rPr>
             <w:rStyle w:val="Hyperlink"/>
@@ -834,7 +834,7 @@
             <w:noProof/>
             <w:webHidden/>
           </w:rPr>
-          <w:instrText xml:space="preserve"> PAGEREF _Toc238123218 \h </w:instrText>
+          <w:instrText xml:space="preserve"> PAGEREF _Toc238123732 \h </w:instrText>
         </w:r>
         <w:r>
           <w:rPr>
@@ -882,7 +882,7 @@
           <w14:ligatures w14:val="standardContextual"/>
         </w:rPr>
       </w:pPr>
-      <w:hyperlink w:anchor="_Toc238123219" w:history="1">
+      <w:hyperlink w:anchor="_Toc238123733" w:history="1">
         <w:r>
           <w:rPr>
             <w:rStyle w:val="Hyperlink"/>
@@ -909,7 +909,7 @@
             <w:noProof/>
             <w:webHidden/>
           </w:rPr>
-          <w:instrText xml:space="preserve"> PAGEREF _Toc238123219 \h </w:instrText>
+          <w:instrText xml:space="preserve"> PAGEREF _Toc238123733 \h </w:instrText>
         </w:r>
         <w:r>
           <w:rPr>
@@ -957,7 +957,7 @@
           <w14:ligatures w14:val="standardContextual"/>
         </w:rPr>
       </w:pPr>
-      <w:hyperlink w:anchor="_Toc238123220" w:history="1">
+      <w:hyperlink w:anchor="_Toc238123734" w:history="1">
         <w:r>
           <w:rPr>
             <w:rStyle w:val="Hyperlink"/>
@@ -984,7 +984,7 @@
             <w:noProof/>
             <w:webHidden/>
           </w:rPr>
-          <w:instrText xml:space="preserve"> PAGEREF _Toc238123220 \h </w:instrText>
+          <w:instrText xml:space="preserve"> PAGEREF _Toc238123734 \h </w:instrText>
         </w:r>
         <w:r>
           <w:rPr>
@@ -1032,7 +1032,7 @@
           <w14:ligatures w14:val="standardContextual"/>
         </w:rPr>
       </w:pPr>
-      <w:hyperlink w:anchor="_Toc238123221" w:history="1">
+      <w:hyperlink w:anchor="_Toc238123735" w:history="1">
         <w:r>
           <w:rPr>
             <w:rStyle w:val="Hyperlink"/>
@@ -1059,7 +1059,7 @@
             <w:noProof/>
             <w:webHidden/>
           </w:rPr>
-          <w:instrText xml:space="preserve"> PAGEREF _Toc238123221 \h </w:instrText>
+          <w:instrText xml:space="preserve"> PAGEREF _Toc238123735 \h </w:instrText>
         </w:r>
         <w:r>
           <w:rPr>
@@ -1107,7 +1107,7 @@
           <w14:ligatures w14:val="standardContextual"/>
         </w:rPr>
       </w:pPr>
-      <w:hyperlink w:anchor="_Toc238123222" w:history="1">
+      <w:hyperlink w:anchor="_Toc238123736" w:history="1">
         <w:r>
           <w:rPr>
             <w:rStyle w:val="Hyperlink"/>
@@ -1134,7 +1134,7 @@
             <w:noProof/>
             <w:webHidden/>
           </w:rPr>
-          <w:instrText xml:space="preserve"> PAGEREF _Toc238123222 \h </w:instrText>
+          <w:instrText xml:space="preserve"> PAGEREF _Toc238123736 \h </w:instrText>
         </w:r>
         <w:r>
           <w:rPr>
@@ -1182,7 +1182,7 @@
           <w14:ligatures w14:val="standardContextual"/>
         </w:rPr>
       </w:pPr>
-      <w:hyperlink w:anchor="_Toc238123223" w:history="1">
+      <w:hyperlink w:anchor="_Toc238123737" w:history="1">
         <w:r>
           <w:rPr>
             <w:rStyle w:val="Hyperlink"/>
@@ -1209,7 +1209,7 @@
             <w:noProof/>
             <w:webHidden/>
           </w:rPr>
-          <w:instrText xml:space="preserve"> PAGEREF _Toc238123223 \h </w:instrText>
+          <w:instrText xml:space="preserve"> PAGEREF _Toc238123737 \h </w:instrText>
         </w:r>
         <w:r>
           <w:rPr>
@@ -1257,7 +1257,7 @@
           <w14:ligatures w14:val="standardContextual"/>
         </w:rPr>
       </w:pPr>
-      <w:hyperlink w:anchor="_Toc238123224" w:history="1">
+      <w:hyperlink w:anchor="_Toc238123738" w:history="1">
         <w:r>
           <w:rPr>
             <w:rStyle w:val="Hyperlink"/>
@@ -1284,7 +1284,7 @@
             <w:noProof/>
             <w:webHidden/>
           </w:rPr>
-          <w:instrText xml:space="preserve"> PAGEREF _Toc238123224 \h </w:instrText>
+          <w:instrText xml:space="preserve"> PAGEREF _Toc238123738 \h </w:instrText>
         </w:r>
         <w:r>
           <w:rPr>
@@ -1304,7 +1304,7 @@
             <w:noProof/>
             <w:webHidden/>
           </w:rPr>
-          <w:t>7</w:t>
+          <w:t>8</w:t>
         </w:r>
         <w:r>
           <w:rPr>
@@ -1332,7 +1332,7 @@
           <w14:ligatures w14:val="standardContextual"/>
         </w:rPr>
       </w:pPr>
-      <w:hyperlink w:anchor="_Toc238123225" w:history="1">
+      <w:hyperlink w:anchor="_Toc238123739" w:history="1">
         <w:r>
           <w:rPr>
             <w:rStyle w:val="Hyperlink"/>
@@ -1359,7 +1359,7 @@
             <w:noProof/>
             <w:webHidden/>
           </w:rPr>
-          <w:instrText xml:space="preserve"> PAGEREF _Toc238123225 \h </w:instrText>
+          <w:instrText xml:space="preserve"> PAGEREF _Toc238123739 \h </w:instrText>
         </w:r>
         <w:r>
           <w:rPr>
@@ -1407,7 +1407,7 @@
           <w14:ligatures w14:val="standardContextual"/>
         </w:rPr>
       </w:pPr>
-      <w:hyperlink w:anchor="_Toc238123226" w:history="1">
+      <w:hyperlink w:anchor="_Toc238123740" w:history="1">
         <w:r>
           <w:rPr>
             <w:rStyle w:val="Hyperlink"/>
@@ -1434,7 +1434,7 @@
             <w:noProof/>
             <w:webHidden/>
           </w:rPr>
-          <w:instrText xml:space="preserve"> PAGEREF _Toc238123226 \h </w:instrText>
+          <w:instrText xml:space="preserve"> PAGEREF _Toc238123740 \h </w:instrText>
         </w:r>
         <w:r>
           <w:rPr>
@@ -1482,7 +1482,7 @@
           <w14:ligatures w14:val="standardContextual"/>
         </w:rPr>
       </w:pPr>
-      <w:hyperlink w:anchor="_Toc238123227" w:history="1">
+      <w:hyperlink w:anchor="_Toc238123741" w:history="1">
         <w:r>
           <w:rPr>
             <w:rStyle w:val="Hyperlink"/>
@@ -1509,7 +1509,7 @@
             <w:noProof/>
             <w:webHidden/>
           </w:rPr>
-          <w:instrText xml:space="preserve"> PAGEREF _Toc238123227 \h </w:instrText>
+          <w:instrText xml:space="preserve"> PAGEREF _Toc238123741 \h </w:instrText>
         </w:r>
         <w:r>
           <w:rPr>
@@ -1557,7 +1557,7 @@
           <w14:ligatures w14:val="standardContextual"/>
         </w:rPr>
       </w:pPr>
-      <w:hyperlink w:anchor="_Toc238123228" w:history="1">
+      <w:hyperlink w:anchor="_Toc238123742" w:history="1">
         <w:r>
           <w:rPr>
             <w:rStyle w:val="Hyperlink"/>
@@ -1584,7 +1584,7 @@
             <w:noProof/>
             <w:webHidden/>
           </w:rPr>
-          <w:instrText xml:space="preserve"> PAGEREF _Toc238123228 \h </w:instrText>
+          <w:instrText xml:space="preserve"> PAGEREF _Toc238123742 \h </w:instrText>
         </w:r>
         <w:r>
           <w:rPr>
@@ -1632,13 +1632,13 @@
           <w14:ligatures w14:val="standardContextual"/>
         </w:rPr>
       </w:pPr>
-      <w:hyperlink w:anchor="_Toc238123229" w:history="1">
+      <w:hyperlink w:anchor="_Toc238123743" w:history="1">
         <w:r>
           <w:rPr>
             <w:rStyle w:val="Hyperlink"/>
             <w:noProof/>
           </w:rPr>
-          <w:t>3.2. Hệ thống hành động được đề cập</w:t>
+          <w:t>3.2. Hệ thống CandidateAction</w:t>
         </w:r>
         <w:r>
           <w:rPr>
@@ -1659,7 +1659,7 @@
             <w:noProof/>
             <w:webHidden/>
           </w:rPr>
-          <w:instrText xml:space="preserve"> PAGEREF _Toc238123229 \h </w:instrText>
+          <w:instrText xml:space="preserve"> PAGEREF _Toc238123743 \h </w:instrText>
         </w:r>
         <w:r>
           <w:rPr>
@@ -1707,7 +1707,7 @@
           <w14:ligatures w14:val="standardContextual"/>
         </w:rPr>
       </w:pPr>
-      <w:hyperlink w:anchor="_Toc238123230" w:history="1">
+      <w:hyperlink w:anchor="_Toc238123744" w:history="1">
         <w:r>
           <w:rPr>
             <w:rStyle w:val="Hyperlink"/>
@@ -1734,7 +1734,7 @@
             <w:noProof/>
             <w:webHidden/>
           </w:rPr>
-          <w:instrText xml:space="preserve"> PAGEREF _Toc238123230 \h </w:instrText>
+          <w:instrText xml:space="preserve"> PAGEREF _Toc238123744 \h </w:instrText>
         </w:r>
         <w:r>
           <w:rPr>
@@ -1782,7 +1782,7 @@
           <w14:ligatures w14:val="standardContextual"/>
         </w:rPr>
       </w:pPr>
-      <w:hyperlink w:anchor="_Toc238123231" w:history="1">
+      <w:hyperlink w:anchor="_Toc238123745" w:history="1">
         <w:r>
           <w:rPr>
             <w:rStyle w:val="Hyperlink"/>
@@ -1809,7 +1809,7 @@
             <w:noProof/>
             <w:webHidden/>
           </w:rPr>
-          <w:instrText xml:space="preserve"> PAGEREF _Toc238123231 \h </w:instrText>
+          <w:instrText xml:space="preserve"> PAGEREF _Toc238123745 \h </w:instrText>
         </w:r>
         <w:r>
           <w:rPr>
@@ -1857,7 +1857,7 @@
           <w14:ligatures w14:val="standardContextual"/>
         </w:rPr>
       </w:pPr>
-      <w:hyperlink w:anchor="_Toc238123232" w:history="1">
+      <w:hyperlink w:anchor="_Toc238123746" w:history="1">
         <w:r>
           <w:rPr>
             <w:rStyle w:val="Hyperlink"/>
@@ -1884,7 +1884,7 @@
             <w:noProof/>
             <w:webHidden/>
           </w:rPr>
-          <w:instrText xml:space="preserve"> PAGEREF _Toc238123232 \h </w:instrText>
+          <w:instrText xml:space="preserve"> PAGEREF _Toc238123746 \h </w:instrText>
         </w:r>
         <w:r>
           <w:rPr>
@@ -1932,7 +1932,7 @@
           <w14:ligatures w14:val="standardContextual"/>
         </w:rPr>
       </w:pPr>
-      <w:hyperlink w:anchor="_Toc238123233" w:history="1">
+      <w:hyperlink w:anchor="_Toc238123747" w:history="1">
         <w:r>
           <w:rPr>
             <w:rStyle w:val="Hyperlink"/>
@@ -1959,7 +1959,7 @@
             <w:noProof/>
             <w:webHidden/>
           </w:rPr>
-          <w:instrText xml:space="preserve"> PAGEREF _Toc238123233 \h </w:instrText>
+          <w:instrText xml:space="preserve"> PAGEREF _Toc238123747 \h </w:instrText>
         </w:r>
         <w:r>
           <w:rPr>
@@ -2007,7 +2007,7 @@
           <w14:ligatures w14:val="standardContextual"/>
         </w:rPr>
       </w:pPr>
-      <w:hyperlink w:anchor="_Toc238123234" w:history="1">
+      <w:hyperlink w:anchor="_Toc238123748" w:history="1">
         <w:r>
           <w:rPr>
             <w:rStyle w:val="Hyperlink"/>
@@ -2034,7 +2034,7 @@
             <w:noProof/>
             <w:webHidden/>
           </w:rPr>
-          <w:instrText xml:space="preserve"> PAGEREF _Toc238123234 \h </w:instrText>
+          <w:instrText xml:space="preserve"> PAGEREF _Toc238123748 \h </w:instrText>
         </w:r>
         <w:r>
           <w:rPr>
@@ -2082,7 +2082,7 @@
           <w14:ligatures w14:val="standardContextual"/>
         </w:rPr>
       </w:pPr>
-      <w:hyperlink w:anchor="_Toc238123235" w:history="1">
+      <w:hyperlink w:anchor="_Toc238123749" w:history="1">
         <w:r>
           <w:rPr>
             <w:rStyle w:val="Hyperlink"/>
@@ -2109,7 +2109,7 @@
             <w:noProof/>
             <w:webHidden/>
           </w:rPr>
-          <w:instrText xml:space="preserve"> PAGEREF _Toc238123235 \h </w:instrText>
+          <w:instrText xml:space="preserve"> PAGEREF _Toc238123749 \h </w:instrText>
         </w:r>
         <w:r>
           <w:rPr>
@@ -2157,7 +2157,7 @@
           <w14:ligatures w14:val="standardContextual"/>
         </w:rPr>
       </w:pPr>
-      <w:hyperlink w:anchor="_Toc238123236" w:history="1">
+      <w:hyperlink w:anchor="_Toc238123750" w:history="1">
         <w:r>
           <w:rPr>
             <w:rStyle w:val="Hyperlink"/>
@@ -2184,7 +2184,7 @@
             <w:noProof/>
             <w:webHidden/>
           </w:rPr>
-          <w:instrText xml:space="preserve"> PAGEREF _Toc238123236 \h </w:instrText>
+          <w:instrText xml:space="preserve"> PAGEREF _Toc238123750 \h </w:instrText>
         </w:r>
         <w:r>
           <w:rPr>
@@ -2232,7 +2232,7 @@
           <w14:ligatures w14:val="standardContextual"/>
         </w:rPr>
       </w:pPr>
-      <w:hyperlink w:anchor="_Toc238123237" w:history="1">
+      <w:hyperlink w:anchor="_Toc238123751" w:history="1">
         <w:r>
           <w:rPr>
             <w:rStyle w:val="Hyperlink"/>
@@ -2259,7 +2259,7 @@
             <w:noProof/>
             <w:webHidden/>
           </w:rPr>
-          <w:instrText xml:space="preserve"> PAGEREF _Toc238123237 \h </w:instrText>
+          <w:instrText xml:space="preserve"> PAGEREF _Toc238123751 \h </w:instrText>
         </w:r>
         <w:r>
           <w:rPr>
@@ -2307,7 +2307,7 @@
           <w14:ligatures w14:val="standardContextual"/>
         </w:rPr>
       </w:pPr>
-      <w:hyperlink w:anchor="_Toc238123238" w:history="1">
+      <w:hyperlink w:anchor="_Toc238123752" w:history="1">
         <w:r>
           <w:rPr>
             <w:rStyle w:val="Hyperlink"/>
@@ -2334,7 +2334,7 @@
             <w:noProof/>
             <w:webHidden/>
           </w:rPr>
-          <w:instrText xml:space="preserve"> PAGEREF _Toc238123238 \h </w:instrText>
+          <w:instrText xml:space="preserve"> PAGEREF _Toc238123752 \h </w:instrText>
         </w:r>
         <w:r>
           <w:rPr>
@@ -2382,7 +2382,7 @@
           <w14:ligatures w14:val="standardContextual"/>
         </w:rPr>
       </w:pPr>
-      <w:hyperlink w:anchor="_Toc238123239" w:history="1">
+      <w:hyperlink w:anchor="_Toc238123753" w:history="1">
         <w:r>
           <w:rPr>
             <w:rStyle w:val="Hyperlink"/>
@@ -2409,7 +2409,7 @@
             <w:noProof/>
             <w:webHidden/>
           </w:rPr>
-          <w:instrText xml:space="preserve"> PAGEREF _Toc238123239 \h </w:instrText>
+          <w:instrText xml:space="preserve"> PAGEREF _Toc238123753 \h </w:instrText>
         </w:r>
         <w:r>
           <w:rPr>
@@ -2457,7 +2457,7 @@
           <w14:ligatures w14:val="standardContextual"/>
         </w:rPr>
       </w:pPr>
-      <w:hyperlink w:anchor="_Toc238123240" w:history="1">
+      <w:hyperlink w:anchor="_Toc238123754" w:history="1">
         <w:r>
           <w:rPr>
             <w:rStyle w:val="Hyperlink"/>
@@ -2484,7 +2484,7 @@
             <w:noProof/>
             <w:webHidden/>
           </w:rPr>
-          <w:instrText xml:space="preserve"> PAGEREF _Toc238123240 \h </w:instrText>
+          <w:instrText xml:space="preserve"> PAGEREF _Toc238123754 \h </w:instrText>
         </w:r>
         <w:r>
           <w:rPr>
@@ -2532,7 +2532,7 @@
           <w14:ligatures w14:val="standardContextual"/>
         </w:rPr>
       </w:pPr>
-      <w:hyperlink w:anchor="_Toc238123241" w:history="1">
+      <w:hyperlink w:anchor="_Toc238123755" w:history="1">
         <w:r>
           <w:rPr>
             <w:rStyle w:val="Hyperlink"/>
@@ -2559,7 +2559,7 @@
             <w:noProof/>
             <w:webHidden/>
           </w:rPr>
-          <w:instrText xml:space="preserve"> PAGEREF _Toc238123241 \h </w:instrText>
+          <w:instrText xml:space="preserve"> PAGEREF _Toc238123755 \h </w:instrText>
         </w:r>
         <w:r>
           <w:rPr>
@@ -2607,7 +2607,7 @@
           <w14:ligatures w14:val="standardContextual"/>
         </w:rPr>
       </w:pPr>
-      <w:hyperlink w:anchor="_Toc238123242" w:history="1">
+      <w:hyperlink w:anchor="_Toc238123756" w:history="1">
         <w:r>
           <w:rPr>
             <w:rStyle w:val="Hyperlink"/>
@@ -2634,7 +2634,7 @@
             <w:noProof/>
             <w:webHidden/>
           </w:rPr>
-          <w:instrText xml:space="preserve"> PAGEREF _Toc238123242 \h </w:instrText>
+          <w:instrText xml:space="preserve"> PAGEREF _Toc238123756 \h </w:instrText>
         </w:r>
         <w:r>
           <w:rPr>
@@ -2682,7 +2682,7 @@
           <w14:ligatures w14:val="standardContextual"/>
         </w:rPr>
       </w:pPr>
-      <w:hyperlink w:anchor="_Toc238123243" w:history="1">
+      <w:hyperlink w:anchor="_Toc238123757" w:history="1">
         <w:r>
           <w:rPr>
             <w:rStyle w:val="Hyperlink"/>
@@ -2709,7 +2709,7 @@
             <w:noProof/>
             <w:webHidden/>
           </w:rPr>
-          <w:instrText xml:space="preserve"> PAGEREF _Toc238123243 \h </w:instrText>
+          <w:instrText xml:space="preserve"> PAGEREF _Toc238123757 \h </w:instrText>
         </w:r>
         <w:r>
           <w:rPr>
@@ -2757,7 +2757,7 @@
           <w14:ligatures w14:val="standardContextual"/>
         </w:rPr>
       </w:pPr>
-      <w:hyperlink w:anchor="_Toc238123244" w:history="1">
+      <w:hyperlink w:anchor="_Toc238123758" w:history="1">
         <w:r>
           <w:rPr>
             <w:rStyle w:val="Hyperlink"/>
@@ -2784,7 +2784,7 @@
             <w:noProof/>
             <w:webHidden/>
           </w:rPr>
-          <w:instrText xml:space="preserve"> PAGEREF _Toc238123244 \h </w:instrText>
+          <w:instrText xml:space="preserve"> PAGEREF _Toc238123758 \h </w:instrText>
         </w:r>
         <w:r>
           <w:rPr>
@@ -2832,7 +2832,7 @@
           <w14:ligatures w14:val="standardContextual"/>
         </w:rPr>
       </w:pPr>
-      <w:hyperlink w:anchor="_Toc238123245" w:history="1">
+      <w:hyperlink w:anchor="_Toc238123759" w:history="1">
         <w:r>
           <w:rPr>
             <w:rStyle w:val="Hyperlink"/>
@@ -2859,7 +2859,7 @@
             <w:noProof/>
             <w:webHidden/>
           </w:rPr>
-          <w:instrText xml:space="preserve"> PAGEREF _Toc238123245 \h </w:instrText>
+          <w:instrText xml:space="preserve"> PAGEREF _Toc238123759 \h </w:instrText>
         </w:r>
         <w:r>
           <w:rPr>
@@ -2907,7 +2907,7 @@
           <w14:ligatures w14:val="standardContextual"/>
         </w:rPr>
       </w:pPr>
-      <w:hyperlink w:anchor="_Toc238123246" w:history="1">
+      <w:hyperlink w:anchor="_Toc238123760" w:history="1">
         <w:r>
           <w:rPr>
             <w:rStyle w:val="Hyperlink"/>
@@ -2934,7 +2934,7 @@
             <w:noProof/>
             <w:webHidden/>
           </w:rPr>
-          <w:instrText xml:space="preserve"> PAGEREF _Toc238123246 \h </w:instrText>
+          <w:instrText xml:space="preserve"> PAGEREF _Toc238123760 \h </w:instrText>
         </w:r>
         <w:r>
           <w:rPr>
@@ -2982,7 +2982,7 @@
           <w14:ligatures w14:val="standardContextual"/>
         </w:rPr>
       </w:pPr>
-      <w:hyperlink w:anchor="_Toc238123247" w:history="1">
+      <w:hyperlink w:anchor="_Toc238123761" w:history="1">
         <w:r>
           <w:rPr>
             <w:rStyle w:val="Hyperlink"/>
@@ -3009,7 +3009,7 @@
             <w:noProof/>
             <w:webHidden/>
           </w:rPr>
-          <w:instrText xml:space="preserve"> PAGEREF _Toc238123247 \h </w:instrText>
+          <w:instrText xml:space="preserve"> PAGEREF _Toc238123761 \h </w:instrText>
         </w:r>
         <w:r>
           <w:rPr>
@@ -3057,7 +3057,7 @@
           <w14:ligatures w14:val="standardContextual"/>
         </w:rPr>
       </w:pPr>
-      <w:hyperlink w:anchor="_Toc238123248" w:history="1">
+      <w:hyperlink w:anchor="_Toc238123762" w:history="1">
         <w:r>
           <w:rPr>
             <w:rStyle w:val="Hyperlink"/>
@@ -3084,7 +3084,7 @@
             <w:noProof/>
             <w:webHidden/>
           </w:rPr>
-          <w:instrText xml:space="preserve"> PAGEREF _Toc238123248 \h </w:instrText>
+          <w:instrText xml:space="preserve"> PAGEREF _Toc238123762 \h </w:instrText>
         </w:r>
         <w:r>
           <w:rPr>
@@ -3132,7 +3132,7 @@
           <w14:ligatures w14:val="standardContextual"/>
         </w:rPr>
       </w:pPr>
-      <w:hyperlink w:anchor="_Toc238123249" w:history="1">
+      <w:hyperlink w:anchor="_Toc238123763" w:history="1">
         <w:r>
           <w:rPr>
             <w:rStyle w:val="Hyperlink"/>
@@ -3159,7 +3159,7 @@
             <w:noProof/>
             <w:webHidden/>
           </w:rPr>
-          <w:instrText xml:space="preserve"> PAGEREF _Toc238123249 \h </w:instrText>
+          <w:instrText xml:space="preserve"> PAGEREF _Toc238123763 \h </w:instrText>
         </w:r>
         <w:r>
           <w:rPr>
@@ -3207,7 +3207,7 @@
           <w14:ligatures w14:val="standardContextual"/>
         </w:rPr>
       </w:pPr>
-      <w:hyperlink w:anchor="_Toc238123250" w:history="1">
+      <w:hyperlink w:anchor="_Toc238123764" w:history="1">
         <w:r>
           <w:rPr>
             <w:rStyle w:val="Hyperlink"/>
@@ -3234,7 +3234,7 @@
             <w:noProof/>
             <w:webHidden/>
           </w:rPr>
-          <w:instrText xml:space="preserve"> PAGEREF _Toc238123250 \h </w:instrText>
+          <w:instrText xml:space="preserve"> PAGEREF _Toc238123764 \h </w:instrText>
         </w:r>
         <w:r>
           <w:rPr>
@@ -3282,7 +3282,7 @@
           <w14:ligatures w14:val="standardContextual"/>
         </w:rPr>
       </w:pPr>
-      <w:hyperlink w:anchor="_Toc238123251" w:history="1">
+      <w:hyperlink w:anchor="_Toc238123765" w:history="1">
         <w:r>
           <w:rPr>
             <w:rStyle w:val="Hyperlink"/>
@@ -3309,7 +3309,7 @@
             <w:noProof/>
             <w:webHidden/>
           </w:rPr>
-          <w:instrText xml:space="preserve"> PAGEREF _Toc238123251 \h </w:instrText>
+          <w:instrText xml:space="preserve"> PAGEREF _Toc238123765 \h </w:instrText>
         </w:r>
         <w:r>
           <w:rPr>
@@ -3357,7 +3357,7 @@
           <w14:ligatures w14:val="standardContextual"/>
         </w:rPr>
       </w:pPr>
-      <w:hyperlink w:anchor="_Toc238123252" w:history="1">
+      <w:hyperlink w:anchor="_Toc238123766" w:history="1">
         <w:r>
           <w:rPr>
             <w:rStyle w:val="Hyperlink"/>
@@ -3384,7 +3384,7 @@
             <w:noProof/>
             <w:webHidden/>
           </w:rPr>
-          <w:instrText xml:space="preserve"> PAGEREF _Toc238123252 \h </w:instrText>
+          <w:instrText xml:space="preserve"> PAGEREF _Toc238123766 \h </w:instrText>
         </w:r>
         <w:r>
           <w:rPr>
@@ -3432,7 +3432,7 @@
           <w14:ligatures w14:val="standardContextual"/>
         </w:rPr>
       </w:pPr>
-      <w:hyperlink w:anchor="_Toc238123253" w:history="1">
+      <w:hyperlink w:anchor="_Toc238123767" w:history="1">
         <w:r>
           <w:rPr>
             <w:rStyle w:val="Hyperlink"/>
@@ -3459,7 +3459,7 @@
             <w:noProof/>
             <w:webHidden/>
           </w:rPr>
-          <w:instrText xml:space="preserve"> PAGEREF _Toc238123253 \h </w:instrText>
+          <w:instrText xml:space="preserve"> PAGEREF _Toc238123767 \h </w:instrText>
         </w:r>
         <w:r>
           <w:rPr>
@@ -3507,7 +3507,7 @@
           <w14:ligatures w14:val="standardContextual"/>
         </w:rPr>
       </w:pPr>
-      <w:hyperlink w:anchor="_Toc238123254" w:history="1">
+      <w:hyperlink w:anchor="_Toc238123768" w:history="1">
         <w:r>
           <w:rPr>
             <w:rStyle w:val="Hyperlink"/>
@@ -3534,7 +3534,7 @@
             <w:noProof/>
             <w:webHidden/>
           </w:rPr>
-          <w:instrText xml:space="preserve"> PAGEREF _Toc238123254 \h </w:instrText>
+          <w:instrText xml:space="preserve"> PAGEREF _Toc238123768 \h </w:instrText>
         </w:r>
         <w:r>
           <w:rPr>
@@ -3582,7 +3582,7 @@
           <w14:ligatures w14:val="standardContextual"/>
         </w:rPr>
       </w:pPr>
-      <w:hyperlink w:anchor="_Toc238123255" w:history="1">
+      <w:hyperlink w:anchor="_Toc238123769" w:history="1">
         <w:r>
           <w:rPr>
             <w:rStyle w:val="Hyperlink"/>
@@ -3609,7 +3609,7 @@
             <w:noProof/>
             <w:webHidden/>
           </w:rPr>
-          <w:instrText xml:space="preserve"> PAGEREF _Toc238123255 \h </w:instrText>
+          <w:instrText xml:space="preserve"> PAGEREF _Toc238123769 \h </w:instrText>
         </w:r>
         <w:r>
           <w:rPr>
@@ -3657,7 +3657,7 @@
           <w14:ligatures w14:val="standardContextual"/>
         </w:rPr>
       </w:pPr>
-      <w:hyperlink w:anchor="_Toc238123256" w:history="1">
+      <w:hyperlink w:anchor="_Toc238123770" w:history="1">
         <w:r>
           <w:rPr>
             <w:rStyle w:val="Hyperlink"/>
@@ -3684,7 +3684,7 @@
             <w:noProof/>
             <w:webHidden/>
           </w:rPr>
-          <w:instrText xml:space="preserve"> PAGEREF _Toc238123256 \h </w:instrText>
+          <w:instrText xml:space="preserve"> PAGEREF _Toc238123770 \h </w:instrText>
         </w:r>
         <w:r>
           <w:rPr>
@@ -3732,7 +3732,7 @@
           <w14:ligatures w14:val="standardContextual"/>
         </w:rPr>
       </w:pPr>
-      <w:hyperlink w:anchor="_Toc238123257" w:history="1">
+      <w:hyperlink w:anchor="_Toc238123771" w:history="1">
         <w:r>
           <w:rPr>
             <w:rStyle w:val="Hyperlink"/>
@@ -3759,7 +3759,7 @@
             <w:noProof/>
             <w:webHidden/>
           </w:rPr>
-          <w:instrText xml:space="preserve"> PAGEREF _Toc238123257 \h </w:instrText>
+          <w:instrText xml:space="preserve"> PAGEREF _Toc238123771 \h </w:instrText>
         </w:r>
         <w:r>
           <w:rPr>
@@ -3807,7 +3807,7 @@
           <w14:ligatures w14:val="standardContextual"/>
         </w:rPr>
       </w:pPr>
-      <w:hyperlink w:anchor="_Toc238123258" w:history="1">
+      <w:hyperlink w:anchor="_Toc238123772" w:history="1">
         <w:r>
           <w:rPr>
             <w:rStyle w:val="Hyperlink"/>
@@ -3834,7 +3834,7 @@
             <w:noProof/>
             <w:webHidden/>
           </w:rPr>
-          <w:instrText xml:space="preserve"> PAGEREF _Toc238123258 \h </w:instrText>
+          <w:instrText xml:space="preserve"> PAGEREF _Toc238123772 \h </w:instrText>
         </w:r>
         <w:r>
           <w:rPr>
@@ -3882,7 +3882,7 @@
           <w14:ligatures w14:val="standardContextual"/>
         </w:rPr>
       </w:pPr>
-      <w:hyperlink w:anchor="_Toc238123259" w:history="1">
+      <w:hyperlink w:anchor="_Toc238123773" w:history="1">
         <w:r>
           <w:rPr>
             <w:rStyle w:val="Hyperlink"/>
@@ -3909,7 +3909,7 @@
             <w:noProof/>
             <w:webHidden/>
           </w:rPr>
-          <w:instrText xml:space="preserve"> PAGEREF _Toc238123259 \h </w:instrText>
+          <w:instrText xml:space="preserve"> PAGEREF _Toc238123773 \h </w:instrText>
         </w:r>
         <w:r>
           <w:rPr>
@@ -3956,7 +3956,7 @@
       <w:pPr>
         <w:pStyle w:val="Heading1"/>
       </w:pPr>
-      <w:bookmarkStart w:id="1" w:name="_Toc238123211"/>
+      <w:bookmarkStart w:id="1" w:name="_Toc238123725"/>
       <w:r>
         <w:rPr>
           <w:rFonts w:ascii="Times New Roman" w:eastAsia="Times New Roman" w:hAnsi="Times New Roman"/>
@@ -3978,7 +3978,7 @@
         <w:spacing w:after="80"/>
       </w:pPr>
       <w:r>
-        <w:t>Bảng 2. Hệ thống hành động được đề cập của ScamGuard-VN</w:t>
+        <w:t>Bảng 2. Hệ thống CandidateAction của ScamGuard-VN</w:t>
       </w:r>
     </w:p>
     <w:p>
@@ -4066,7 +4066,7 @@
       <w:pPr>
         <w:pStyle w:val="Heading1"/>
       </w:pPr>
-      <w:bookmarkStart w:id="2" w:name="_Toc238123212"/>
+      <w:bookmarkStart w:id="2" w:name="_Toc238123726"/>
       <w:r>
         <w:rPr>
           <w:rFonts w:ascii="Times New Roman" w:eastAsia="Times New Roman" w:hAnsi="Times New Roman"/>
@@ -4112,7 +4112,7 @@
       <w:pPr>
         <w:pStyle w:val="Heading1"/>
       </w:pPr>
-      <w:bookmarkStart w:id="3" w:name="_Toc238123213"/>
+      <w:bookmarkStart w:id="3" w:name="_Toc238123727"/>
       <w:r>
         <w:rPr>
           <w:rFonts w:ascii="Times New Roman" w:eastAsia="Times New Roman" w:hAnsi="Times New Roman"/>
@@ -4359,7 +4359,7 @@
               <w:rPr>
                 <w:sz w:val="24"/>
               </w:rPr>
-              <w:t>Tập phát triển dùng để chọn điểm kiểm tra mô hình và phân tích lỗi</w:t>
+              <w:t>Tập phát triển dùng để chọn bản mô hình đã lưu và phân tích lỗi</w:t>
             </w:r>
           </w:p>
         </w:tc>
@@ -4753,7 +4753,7 @@
       <w:pPr>
         <w:pStyle w:val="Heading1"/>
       </w:pPr>
-      <w:bookmarkStart w:id="4" w:name="_Toc238123214"/>
+      <w:bookmarkStart w:id="4" w:name="_Toc238123728"/>
       <w:r>
         <w:rPr>
           <w:rFonts w:ascii="Times New Roman" w:eastAsia="Times New Roman" w:hAnsi="Times New Roman"/>
@@ -4786,10 +4786,10 @@
         <w:ind w:firstLine="567"/>
       </w:pPr>
       <w:r>
-        <w:t>Dữ liệu ngữ nghĩa gồm 4.717 mẫu huấn luyện và 486 mẫu DEV; dữ liệu mức độ rủi ro gồm 3.805 mẫu huấn luyện và 398 mẫu DEV. Trên DEV, hành động được đề cập đạt Macro-F1 96,14%, hành động được xác nhận đạt 99,13% và mô hình mức độ rủi ro đạt Macro-F1 96,72%. Trên bộ kiểm thử độc lập 200 trường hợp chưa xuất hiện trong huấn luyện/DEV, độ chính xác nghiêm ngặt đạt 76,50%, Macro-F1 trên hai nhãn có nhãn chuẩn đạt 81,79% và độ chính xác vận hành đạt 86,50%. Trong 70 trường hợp dương, 90% được cảnh báo vàng hoặc đỏ</w:t>
-      </w:r>
-      <w:r>
-        <w:t>. Kết quả độc lập thấp hơn DEV cho thấy hệ thống đã học được tín hiệu hữu ích nhưng vẫn chịu ảnh hưởng của sự khác biệt giữa dữ liệu huấn luyện và tình huống mới.</w:t>
+        <w:t>Dữ liệu ngữ nghĩa gồm 4.717 mẫu huấn luyện và 486 mẫu DEV; dữ liệu mức độ rủi ro gồm 3.805 mẫu huấn luyện và 398 mẫu DEV. Trên DEV, CandidateAction đạt Macro-F1 96,14%, Supported-action đạt 99,13% và mô hình mức độ rủi ro đạt Macro-F1 96,72%. Trên bộ kiểm thử độc lập 200 trường hợp chưa xuất hiện trong huấn luyện/DEV, độ chính xác nghiêm ngặt đạt 76,50%, Macro-F1 trên hai nhãn có nhãn chuẩn đạt 81,79% và độ chính xác vận hành đạt 86,50%. Trong 70 trường hợp dương, 90% được cảnh báo vàng hoặc đỏ. Kết quả độc</w:t>
+      </w:r>
+      <w:r>
+        <w:t xml:space="preserve"> lập thấp hơn DEV cho thấy hệ thống đã học được tín hiệu hữu ích nhưng vẫn chịu ảnh hưởng của sự khác biệt giữa dữ liệu huấn luyện và tình huống mới.</w:t>
       </w:r>
     </w:p>
     <w:p>
@@ -4797,10 +4797,10 @@
         <w:ind w:firstLine="567"/>
       </w:pPr>
       <w:r>
-        <w:t xml:space="preserve">Đóng góp của công trình gồm: hệ thống biểu diễn hành động và vai trò câu cho miền lừa đảo tiếng Việt; phương pháp xây dựng dữ liệu đối chứng có kiểm soát; quy trình kiểm thử độc lập đóng băng điểm kiểm tra mô hình, đầu vào và kết quả dự đoán bằng SHA256; cùng ứng dụng Android nhận văn bản, ảnh và QR rồi gọi mô hình chạy cục bộ trên laptop. Tầng sinh hướng dẫn là thành phần tùy chọn, hoạt động sau phân loại và không được phép thay đổi nhãn. Công trình được xác định là công cụ hỗ trợ cảnh báo, không thay thế </w:t>
-      </w:r>
-      <w:r>
-        <w:t>việc xác minh qua cơ quan hoặc tổ chức có thẩm quyền.</w:t>
+        <w:t>Đóng góp của công trình gồm: hệ thống biểu diễn hành động và vai trò câu cho miền lừa đảo tiếng Việt; phương pháp xây dựng dữ liệu đối chứng có kiểm soát; quy trình kiểm thử độc lập đóng băng bản mô hình đã lưu, đầu vào và kết quả dự đoán bằng SHA256; cùng ứng dụng Android nhận văn bản, ảnh và QR rồi gọi mô hình chạy cục bộ trên máy tính xách tay. Tầng sinh hướng dẫn là thành phần tùy chọn, hoạt động sau phân loại và không được phép thay đổi nhãn. Công trình được xác định là công cụ hỗ trợ cảnh báo, không t</w:t>
+      </w:r>
+      <w:r>
+        <w:t>hay thế việc xác minh qua cơ quan hoặc tổ chức có thẩm quyền.</w:t>
       </w:r>
     </w:p>
     <w:p>
@@ -4816,7 +4816,7 @@
       <w:pPr>
         <w:pStyle w:val="Heading1"/>
       </w:pPr>
-      <w:bookmarkStart w:id="5" w:name="_Toc238123215"/>
+      <w:bookmarkStart w:id="5" w:name="_Toc238123729"/>
       <w:r>
         <w:rPr>
           <w:rFonts w:ascii="Times New Roman" w:eastAsia="Times New Roman" w:hAnsi="Times New Roman"/>
@@ -4829,7 +4829,7 @@
       <w:pPr>
         <w:pStyle w:val="Heading2"/>
       </w:pPr>
-      <w:bookmarkStart w:id="6" w:name="_Toc238123216"/>
+      <w:bookmarkStart w:id="6" w:name="_Toc238123730"/>
       <w:r>
         <w:rPr>
           <w:rFonts w:ascii="Times New Roman" w:eastAsia="Times New Roman" w:hAnsi="Times New Roman"/>
@@ -4861,7 +4861,7 @@
       <w:pPr>
         <w:pStyle w:val="Heading2"/>
       </w:pPr>
-      <w:bookmarkStart w:id="7" w:name="_Toc238123217"/>
+      <w:bookmarkStart w:id="7" w:name="_Toc238123731"/>
       <w:r>
         <w:rPr>
           <w:rFonts w:ascii="Times New Roman" w:eastAsia="Times New Roman" w:hAnsi="Times New Roman"/>
@@ -4876,7 +4876,7 @@
           <w:noProof/>
         </w:rPr>
         <w:drawing>
-          <wp:inline distT="0" distB="0" distL="0" distR="0" wp14:anchorId="622934DD" wp14:editId="61DDE4E4">
+          <wp:inline distT="0" distB="0" distL="0" distR="0" wp14:anchorId="0AB76788" wp14:editId="390B87FA">
             <wp:extent cx="5760720" cy="2918765"/>
             <wp:effectExtent l="0" t="0" r="0" b="0"/>
             <wp:docPr id="1" name="Picture 1"/>
@@ -5383,7 +5383,7 @@
       <w:pPr>
         <w:pStyle w:val="Heading2"/>
       </w:pPr>
-      <w:bookmarkStart w:id="8" w:name="_Toc238123218"/>
+      <w:bookmarkStart w:id="8" w:name="_Toc238123732"/>
       <w:r>
         <w:rPr>
           <w:rFonts w:ascii="Times New Roman" w:eastAsia="Times New Roman" w:hAnsi="Times New Roman"/>
@@ -5397,7 +5397,7 @@
         <w:ind w:firstLine="567"/>
       </w:pPr>
       <w:r>
-        <w:t>Đầu vào của hệ thống là một tin nhắn hoặc chuỗi lượt hội thoại tiếng Việt. Với mỗi đầu vào, hệ thống cần dự đoán hành động được đề cập, bốn thuộc tính trạng thái yêu cầu, trạng thái phủ định, trạng thái trích dẫn, trạng thái kể lại và mức mức độ rủi ro. hành động được đề cập là hành động mà nội dung đang đề cập. hành động được xác nhận là kết luận trung gian cho biết hành động khác NONE có được yêu cầu trực tiếp, không bị phủ định, không chỉ nằm trong trích dẫn và không chỉ được thuật lại hay không.</w:t>
+        <w:t>Đầu vào của hệ thống là một tin nhắn hoặc chuỗi lượt hội thoại tiếng Việt. Với mỗi đầu vào, hệ thống cần dự đoán CandidateAction, bốn thuộc tính trạng thái yêu cầu, trạng thái phủ định, trạng thái trích dẫn, trạng thái kể lại và mức độ rủi ro. CandidateAction là trường kỹ thuật biểu thị hành động được đề cập. Supported-action biểu thị hành động thực sự được yêu cầu: hành động phải khác NONE, được yêu cầu trực tiếp, không bị phủ định, không chỉ nằm trong trích dẫn và không chỉ được thuật lại.</w:t>
       </w:r>
     </w:p>
     <w:p>
@@ -5412,7 +5412,7 @@
       <w:pPr>
         <w:pStyle w:val="Heading2"/>
       </w:pPr>
-      <w:bookmarkStart w:id="9" w:name="_Toc238123219"/>
+      <w:bookmarkStart w:id="9" w:name="_Toc238123733"/>
       <w:r>
         <w:rPr>
           <w:rFonts w:ascii="Times New Roman" w:eastAsia="Times New Roman" w:hAnsi="Times New Roman"/>
@@ -5476,7 +5476,7 @@
       <w:pPr>
         <w:pStyle w:val="Heading2"/>
       </w:pPr>
-      <w:bookmarkStart w:id="10" w:name="_Toc238123220"/>
+      <w:bookmarkStart w:id="10" w:name="_Toc238123734"/>
       <w:r>
         <w:rPr>
           <w:rFonts w:ascii="Times New Roman" w:eastAsia="Times New Roman" w:hAnsi="Times New Roman"/>
@@ -5497,7 +5497,7 @@
       <w:pPr>
         <w:pStyle w:val="Heading1"/>
       </w:pPr>
-      <w:bookmarkStart w:id="11" w:name="_Toc238123221"/>
+      <w:bookmarkStart w:id="11" w:name="_Toc238123735"/>
       <w:r>
         <w:rPr>
           <w:rFonts w:ascii="Times New Roman" w:eastAsia="Times New Roman" w:hAnsi="Times New Roman"/>
@@ -5510,7 +5510,7 @@
       <w:pPr>
         <w:pStyle w:val="Heading2"/>
       </w:pPr>
-      <w:bookmarkStart w:id="12" w:name="_Toc238123222"/>
+      <w:bookmarkStart w:id="12" w:name="_Toc238123736"/>
       <w:r>
         <w:rPr>
           <w:rFonts w:ascii="Times New Roman" w:eastAsia="Times New Roman" w:hAnsi="Times New Roman"/>
@@ -5524,17 +5524,17 @@
         <w:ind w:firstLine="567"/>
       </w:pPr>
       <w:r>
-        <w:t>Transformer tạo nền tảng cho các mô hình ngôn ngữ hiện đại nhờ cơ chế cơ chế chú ý, cho phép mỗi từ tham chiếu đến các vị trí liên quan trong chuỗi [1]. BERT mở rộng khả năng học biểu diễn hai chiều và tinh chỉnh theo tác vụ [2]. XLM-R được tiền huấn luyện trên nhiều ngôn ngữ và có khả năng chuyển tri thức giữa các ngôn ngữ [3]. PhoBERT là mô hình tối ưu riêng cho tiếng Việt [4]. Công trình chọn XLM-R vì quy trình nghiên cứu ban đầu, bộ tách đơn vị từ và điểm kiểm tra mô hình nền đã được xây dựng trên mô hì</w:t>
-      </w:r>
-      <w:r>
-        <w:t>nh nền này; lựa chọn đó giúp kế thừa kết quả có sẵn và giữ khả năng xử lý biến thể đa ngữ, ký hiệu hoặc tên riêng trong tin nhắn.</w:t>
+        <w:t>Transformer tạo nền tảng cho các mô hình ngôn ngữ hiện đại nhờ cơ chế chú ý (attention), cho phép mỗi từ tham chiếu đến các vị trí liên quan trong chuỗi [1]. BERT mở rộng khả năng học biểu diễn hai chiều và tinh chỉnh theo tác vụ [2]. XLM-R được tiền huấn luyện trên nhiều ngôn ngữ và có khả năng chuyển tri thức giữa các ngôn ngữ [3]. PhoBERT là mô hình tối ưu riêng cho tiếng Việt [4]. Công trình chọn XLM-R vì quy trình nghiên cứu ban đầu, bộ phân tách văn bản (tokenizer) và bản mô hình nền đã lưu (checkpoin</w:t>
+      </w:r>
+      <w:r>
+        <w:t>t) đã được xây dựng trên mô hình nền này; lựa chọn đó giúp kế thừa kết quả có sẵn và giữ khả năng xử lý biến thể đa ngữ, ký hiệu hoặc tên riêng trong tin nhắn.</w:t>
       </w:r>
     </w:p>
     <w:p>
       <w:pPr>
         <w:pStyle w:val="Heading2"/>
       </w:pPr>
-      <w:bookmarkStart w:id="13" w:name="_Toc238123223"/>
+      <w:bookmarkStart w:id="13" w:name="_Toc238123737"/>
       <w:r>
         <w:rPr>
           <w:rFonts w:ascii="Times New Roman" w:eastAsia="Times New Roman" w:hAnsi="Times New Roman"/>
@@ -5548,18 +5548,19 @@
         <w:ind w:firstLine="567"/>
       </w:pPr>
       <w:r>
-        <w:t>học lối tắt là hiện tượng mô hình dựa vào dấu hiệu dễ thấy nhưng không phản ánh bản chất của nhiệm vụ. Trong nhận diện lừa đảo, mô hình có thể gắn “OTP”, “chuyển khoản” hoặc “đường link” với nguy hiểm mà không xét ai đang nói, câu có phủ định hay không và hành động có thật sự được yêu cầu không. Cách học này có thể tạo kết quả tốt trên dữ liệu phát triển nếu huấn luyện và DEV có cùng kiểu diễn đạt, nhưng giảm mạnh khi gặp hội thoại mới.</w:t>
+        <w:t>Học lối tắt là hiện tượng mô hình dựa vào dấu hiệu dễ thấy nhưng không phản ánh bản chất của nhiệm vụ. Trong nhận diện lừa đảo, mô hình có thể gắn “OTP”, “chuyển khoản” hoặc “đường link” với nguy hiểm mà không xét ai đang nói, câu có phủ định hay không và hành động có thật sự được yêu cầu không. Cách học này có thể tạo kết quả tốt trên dữ liệu phát triển nếu huấn luyện và DEV có cùng kiểu diễn đạt, nhưng giảm mạnh khi gặp hội thoại mới.</w:t>
       </w:r>
     </w:p>
     <w:p>
       <w:pPr>
         <w:pStyle w:val="Heading2"/>
       </w:pPr>
-      <w:bookmarkStart w:id="14" w:name="_Toc238123224"/>
+      <w:bookmarkStart w:id="14" w:name="_Toc238123738"/>
       <w:r>
         <w:rPr>
           <w:rFonts w:ascii="Times New Roman" w:eastAsia="Times New Roman" w:hAnsi="Times New Roman"/>
         </w:rPr>
+        <w:lastRenderedPageBreak/>
         <w:t>2.3. Dữ liệu đối chứng và kiểm tra hành vi</w:t>
       </w:r>
       <w:bookmarkEnd w:id="14"/>
@@ -5569,11 +5570,10 @@
         <w:ind w:firstLine="567"/>
       </w:pPr>
       <w:r>
-        <w:t xml:space="preserve">Dữ liệu đối chứng (dữ liệu đối chứng) được tạo bằng cách thay đổi tối thiểu một mẫu để làm thay đổi nhãn hoặc thuộc tính mục tiêu [5]. Lợi ích chính không nằm ở </w:t>
-      </w:r>
-      <w:r>
-        <w:lastRenderedPageBreak/>
-        <w:t>việc tăng số lượng câu, mà ở khả năng chỉ ra yếu tố nào phải khiến mô hình thay đổi quyết định. Tuy nhiên, dữ liệu đối chứng có thể tạo thành phần nghiên cứu nếu hai phía khác nhau bởi một dấu hiệu máy móc hoặc mẫu câu lặp lại [6]. Vì vậy, công trình kiểm soát cặp theo tình huống, hành động và loại biến đổi; đồng thời đưa mẫu cùng cặp vào cùng một phân hoạch.</w:t>
+        <w:t>Dữ liệu đối chứng (dữ liệu đối chứng) được tạo bằng cách thay đổi tối thiểu một mẫu để làm thay đổi nhãn hoặc thuộc tính mục tiêu [5]. Lợi ích chính không nằm ở việc tăng số lượng câu, mà ở khả năng chỉ ra yếu tố nào phải khiến mô hình thay đổi quyết định. Tuy nhiên, dữ liệu đối chứng có thể tạo thành phần nghiên cứu nếu hai phía khác nhau bởi một dấu hiệu máy móc hoặc mẫu câu lặp lại [6]. Vì vậy, công trình kiểm soát cặp theo tình huống, hành động và loại biến đổi; đồng thời đưa mẫu cùng cặp vào cùng một p</w:t>
+      </w:r>
+      <w:r>
+        <w:t>hân hoạch.</w:t>
       </w:r>
     </w:p>
     <w:p>
@@ -5581,14 +5581,14 @@
         <w:ind w:firstLine="567"/>
       </w:pPr>
       <w:r>
-        <w:t>CheckList đề xuất đánh giá mô hình theo các năng lực cụ thể thay vì chỉ dựa vào một con số tổng hợp [8]. Tập đối sánh (contrast set) kiểm tra tính ổn định trước các biến đổi nhỏ nhưng có ý nghĩa [9]. ScamGuard-VN vận dụng tinh thần này bằng cách đo riêng hành động được đề cập, trạng thái yêu cầu, trạng thái phủ định, trạng thái trích dẫn, trạng thái kể lại, hành động được xác nhận và các nhóm có lừa đảo, mẫu âm khó, mẫu âm dễ trên tập độc lập.</w:t>
+        <w:t>CheckList [8] là khung đánh giá hành vi của mô hình theo từng năng lực cụ thể, thay vì chỉ dựa vào một chỉ số tổng hợp. Tập đối sánh (contrast set) kiểm tra tính ổn định trước các biến đổi nhỏ nhưng có ý nghĩa [9]. ScamGuard-VN vận dụng tinh thần này bằng cách đo riêng CandidateAction, trạng thái yêu cầu, trạng thái phủ định, trạng thái trích dẫn, trạng thái kể lại, Supported-action và các nhóm có lừa đảo, mẫu âm khó, mẫu âm dễ trên tập độc lập.</w:t>
       </w:r>
     </w:p>
     <w:p>
       <w:pPr>
         <w:pStyle w:val="Heading2"/>
       </w:pPr>
-      <w:bookmarkStart w:id="15" w:name="_Toc238123225"/>
+      <w:bookmarkStart w:id="15" w:name="_Toc238123739"/>
       <w:r>
         <w:rPr>
           <w:rFonts w:ascii="Times New Roman" w:eastAsia="Times New Roman" w:hAnsi="Times New Roman"/>
@@ -5602,7 +5602,7 @@
         <w:ind w:firstLine="567"/>
       </w:pPr>
       <w:r>
-        <w:t>mô hình nút thắt khái niệm dự đoán các khái niệm có ý nghĩa với con người trước hoặc cùng với nhãn cuối [7]. ScamGuard-VN kế thừa ý tưởng về khả năng quan sát đầu ra trung gian, nhưng không tuyên bố sử dụng một nút thắt khái niệm cứng. Mô hình mức độ rủi ro hiện tại kế thừa bộ mã hóa đã được huấn luyện ngữ nghĩa và sau đó tiếp tục tối ưu đầu cuối; mức độ rủi ro không bị buộc chỉ nhận năm điểm trước chuẩn hóa ngữ nghĩa làm đầu vào. Cách mô tả này phản ánh đúng kiến trúc đã cài đặt và tránh phóng đại mức độ c</w:t>
+        <w:t>Mô hình nút thắt khái niệm dự đoán các khái niệm có ý nghĩa với con người trước hoặc cùng với nhãn cuối [7]. ScamGuard-VN kế thừa ý tưởng về khả năng quan sát đầu ra trung gian, nhưng không tuyên bố sử dụng một nút thắt khái niệm cứng. Mô hình mức độ rủi ro hiện tại kế thừa bộ mã hóa đã được huấn luyện ngữ nghĩa và sau đó tiếp tục tối ưu đầu cuối; mức độ rủi ro không bị buộc chỉ nhận năm điểm trước chuẩn hóa ngữ nghĩa làm đầu vào. Cách mô tả này phản ánh đúng kiến trúc đã cài đặt và tránh phóng đại mức độ c</w:t>
       </w:r>
       <w:r>
         <w:t>an thiệp được của các khái niệm.</w:t>
@@ -5612,7 +5612,7 @@
       <w:pPr>
         <w:pStyle w:val="Heading2"/>
       </w:pPr>
-      <w:bookmarkStart w:id="16" w:name="_Toc238123226"/>
+      <w:bookmarkStart w:id="16" w:name="_Toc238123740"/>
       <w:r>
         <w:rPr>
           <w:rFonts w:ascii="Times New Roman" w:eastAsia="Times New Roman" w:hAnsi="Times New Roman"/>
@@ -5636,7 +5636,7 @@
       <w:pPr>
         <w:pStyle w:val="Heading1"/>
       </w:pPr>
-      <w:bookmarkStart w:id="17" w:name="_Toc238123227"/>
+      <w:bookmarkStart w:id="17" w:name="_Toc238123741"/>
       <w:r>
         <w:rPr>
           <w:rFonts w:ascii="Times New Roman" w:eastAsia="Times New Roman" w:hAnsi="Times New Roman"/>
@@ -5649,7 +5649,7 @@
       <w:pPr>
         <w:pStyle w:val="Heading2"/>
       </w:pPr>
-      <w:bookmarkStart w:id="18" w:name="_Toc238123228"/>
+      <w:bookmarkStart w:id="18" w:name="_Toc238123742"/>
       <w:r>
         <w:rPr>
           <w:rFonts w:ascii="Times New Roman" w:eastAsia="Times New Roman" w:hAnsi="Times New Roman"/>
@@ -5663,20 +5663,23 @@
         <w:ind w:firstLine="567"/>
       </w:pPr>
       <w:r>
-        <w:t>Đối tượng nghiên cứu là mối quan hệ giữa nội dung hội thoại, hành động được đề cập, vai trò giao tiếp của phát ngôn và mức rủi ro. Đơn vị đầu vào có thể là một tin nhắn hoặc nhiều lượt hội thoại. Mỗi lượt gồm chỉ số thứ tự, vai người nói và văn bản. Lượt quan sát là lượt cuối cùng mà mô hình được phép sử dụng khi đưa ra kết quả dự đoán; các lượt sau, nếu có trong nguồn dữ liệu, không được cung cấp cho mô hình.</w:t>
+        <w:t xml:space="preserve">Đối tượng nghiên cứu là mối quan hệ giữa nội dung hội thoại, hành động được đề cập, vai trò giao tiếp của phát ngôn và mức rủi ro. Đơn vị đầu vào có thể là một tin </w:t>
+      </w:r>
+      <w:r>
+        <w:lastRenderedPageBreak/>
+        <w:t>nhắn hoặc nhiều lượt hội thoại. Mỗi lượt gồm chỉ số thứ tự, vai người nói và văn bản. Lượt quan sát là lượt cuối cùng mà mô hình được phép sử dụng khi đưa ra kết quả dự đoán; các lượt sau, nếu có trong nguồn dữ liệu, không được cung cấp cho mô hình.</w:t>
       </w:r>
     </w:p>
     <w:p>
       <w:pPr>
         <w:pStyle w:val="Heading2"/>
       </w:pPr>
-      <w:bookmarkStart w:id="19" w:name="_Toc238123229"/>
+      <w:bookmarkStart w:id="19" w:name="_Toc238123743"/>
       <w:r>
         <w:rPr>
           <w:rFonts w:ascii="Times New Roman" w:eastAsia="Times New Roman" w:hAnsi="Times New Roman"/>
         </w:rPr>
-        <w:lastRenderedPageBreak/>
-        <w:t>3.2. Hệ thống hành động được đề cập</w:t>
+        <w:t>3.2. Hệ thống CandidateAction</w:t>
       </w:r>
       <w:bookmarkEnd w:id="19"/>
     </w:p>
@@ -5685,7 +5688,7 @@
         <w:ind w:firstLine="567"/>
       </w:pPr>
       <w:r>
-        <w:t>hành động được đề cập là loại hành động mà câu hoặc hội thoại đang đề cập. Tên mã tiếng Anh được giữ nguyên vì đây là các nhãn dùng trực tiếp trong dữ liệu và source mã nguồn; phần mô tả tiếng Việt giúp người đọc hiểu ý nghĩa vận hành của từng lớp.</w:t>
+        <w:t>CandidateAction là trường kỹ thuật chỉ loại hành động được đề cập trong câu hoặc hội thoại. Tên trường được giữ nguyên vì được sử dụng trực tiếp trong dữ liệu và mã nguồn; phần mô tả tiếng Việt giúp người đọc hiểu ý nghĩa vận hành của từng lớp.</w:t>
       </w:r>
     </w:p>
     <w:p>
@@ -5698,7 +5701,7 @@
         <w:rPr>
           <w:i/>
         </w:rPr>
-        <w:t>Bảng 2. Hệ thống hành động được đề cập của ScamGuard-VN</w:t>
+        <w:t>Bảng 2. Hệ thống CandidateAction của ScamGuard-VN</w:t>
       </w:r>
     </w:p>
     <w:tbl>
@@ -6586,19 +6589,22 @@
         <w:ind w:firstLine="567"/>
       </w:pPr>
       <w:r>
-        <w:t>Lớp NONE không có nghĩa là mô hình đã học được mọi hoạt động đời sống và chứng minh không có hành động nào. Nó chỉ có nghĩa là mô hình không chọn được một trong chín nhóm hành động đã định nghĩa. Đây là một lớp đóng, do đó hành động mới ngoài hệ thống phân loại có thể bị ép vào NONE hoặc một lớp gần nhất. Hạn chế này được trình bày công khai và là lý do đề xuất nghiên cứu nhận diện hành động theo hướng tập mở trong tương lai.</w:t>
+        <w:t xml:space="preserve">Lớp NONE không có nghĩa là mô hình đã học được mọi hoạt động đời sống và chứng minh không có hành động nào. Nó chỉ có nghĩa là mô hình không chọn được một trong chín nhóm hành động đã định nghĩa. Đây là một lớp đóng, do đó hành động mới ngoài hệ thống phân loại có thể bị ép vào NONE hoặc một lớp gần nhất. Hạn chế </w:t>
+      </w:r>
+      <w:r>
+        <w:lastRenderedPageBreak/>
+        <w:t>này được trình bày công khai và là lý do đề xuất nghiên cứu nhận diện hành động theo hướng tập mở trong tương lai.</w:t>
       </w:r>
     </w:p>
     <w:p>
       <w:pPr>
         <w:pStyle w:val="Heading2"/>
       </w:pPr>
-      <w:bookmarkStart w:id="20" w:name="_Toc238123230"/>
+      <w:bookmarkStart w:id="20" w:name="_Toc238123744"/>
       <w:r>
         <w:rPr>
           <w:rFonts w:ascii="Times New Roman" w:eastAsia="Times New Roman" w:hAnsi="Times New Roman"/>
         </w:rPr>
-        <w:lastRenderedPageBreak/>
         <w:t>3.3. Các thuộc tính thể hiện vai trò của câu</w:t>
       </w:r>
       <w:bookmarkEnd w:id="20"/>
@@ -6608,7 +6614,7 @@
         <w:ind w:firstLine="567"/>
       </w:pPr>
       <w:r>
-        <w:t>Bốn thuộc tính được gán độc lập theo giá trị YES hoặc NO. Chúng không thay thế hành động được đề cập mà bổ sung thông tin về cách hành động xuất hiện trong phát ngôn. Một câu có thể nhắc đúng hành động DISCLOSE_SECRET nhưng trạng thái yêu cầu bằng NO vì đang phủ định hoặc thuật lại.</w:t>
+        <w:t>Bốn thuộc tính được gán độc lập theo giá trị YES hoặc NO. Chúng không thay thế CandidateAction mà bổ sung thông tin về cách hành động xuất hiện trong phát ngôn. Một câu có thể nhắc đúng hành động DISCLOSE_SECRET nhưng trạng thái yêu cầu bằng NO vì đang phủ định hoặc thuật lại.</w:t>
       </w:r>
     </w:p>
     <w:p>
@@ -7163,14 +7169,14 @@
         <w:ind w:firstLine="567"/>
       </w:pPr>
       <w:r>
-        <w:t>hành động được xác nhận được tính là đúng khi hành động được đề cập khác NONE, trạng thái yêu cầu bằng YES và ba thuộc tính trạng thái phủ định, trạng thái trích dẫn, trạng thái kể lại đều bằng NO. Đây là quy tắc tổng hợp phục vụ phân tích, không phải một đầu ra được mã hóa cứng để quyết định mức độ rủi ro. Mô hình mức độ rủi ro vẫn học từ biểu diễn hội thoại đầu cuối, nhưng bộ mã hóa đã được huấn luyện bằng các nhiệm vụ ngữ nghĩa trước đó.</w:t>
+        <w:t>Supported-action được tính là đúng khi CandidateAction khác NONE, trạng thái yêu cầu bằng YES và ba thuộc tính trạng thái phủ định, trạng thái trích dẫn, trạng thái kể lại đều bằng NO. Đây là quy tắc tổng hợp phục vụ phân tích, không phải một đầu ra được mã hóa cứng để quyết định mức độ rủi ro. Mô hình mức độ rủi ro vẫn học từ biểu diễn hội thoại đầu cuối, nhưng bộ mã hóa đã được huấn luyện bằng các nhiệm vụ ngữ nghĩa trước đó.</w:t>
       </w:r>
     </w:p>
     <w:p>
       <w:pPr>
         <w:pStyle w:val="Heading2"/>
       </w:pPr>
-      <w:bookmarkStart w:id="21" w:name="_Toc238123231"/>
+      <w:bookmarkStart w:id="21" w:name="_Toc238123745"/>
       <w:r>
         <w:rPr>
           <w:rFonts w:ascii="Times New Roman" w:eastAsia="Times New Roman" w:hAnsi="Times New Roman"/>
@@ -7439,6 +7445,7 @@
               <w:rPr>
                 <w:sz w:val="23"/>
               </w:rPr>
+              <w:lastRenderedPageBreak/>
               <w:t>REVIEW</w:t>
             </w:r>
           </w:p>
@@ -7541,7 +7548,6 @@
               <w:rPr>
                 <w:sz w:val="23"/>
               </w:rPr>
-              <w:lastRenderedPageBreak/>
               <w:t>HIGH_EVIDENCE</w:t>
             </w:r>
           </w:p>
@@ -7637,7 +7643,7 @@
       <w:pPr>
         <w:pStyle w:val="Heading2"/>
       </w:pPr>
-      <w:bookmarkStart w:id="22" w:name="_Toc238123232"/>
+      <w:bookmarkStart w:id="22" w:name="_Toc238123746"/>
       <w:r>
         <w:rPr>
           <w:rFonts w:ascii="Times New Roman" w:eastAsia="Times New Roman" w:hAnsi="Times New Roman"/>
@@ -7884,7 +7890,7 @@
               <w:rPr>
                 <w:sz w:val="24"/>
               </w:rPr>
-              <w:t>Huấn luyện hành động được đề cập và bốn thuộc tính vai trò câu</w:t>
+              <w:t>Huấn luyện CandidateAction và bốn thuộc tính vai trò câu</w:t>
             </w:r>
           </w:p>
         </w:tc>
@@ -8016,7 +8022,7 @@
               <w:rPr>
                 <w:sz w:val="24"/>
               </w:rPr>
-              <w:t>Independent test</w:t>
+              <w:t>Independent kiểm thử</w:t>
             </w:r>
           </w:p>
         </w:tc>
@@ -8104,19 +8110,22 @@
         <w:ind w:firstLine="567"/>
       </w:pPr>
       <w:r>
-        <w:t>Đợt bổ sung giá trị cao sinh 204 mẫu đa chủ đề bằng mô hình ngôn ngữ. kiểm tra tự động loại một mẫu vì trạng thái yêu cầu xung đột với trạng thái trích dẫn hoặc trạng thái kể lại, giữ 203 mẫu chỉ cho huấn luyện. Các mẫu này được đánh dấu AI_GENERATED_REQUIRES_HUMAN_REVIEW, không được gọi là nhãn chuẩn do con người gán. Cách đánh dấu giúp tách rõ dữ liệu hỗ trợ huấn luyện khỏi dữ liệu dùng để tuyên bố độ chính xác.</w:t>
+        <w:t xml:space="preserve">Đợt bổ sung giá trị cao sinh 204 mẫu đa chủ đề bằng mô hình ngôn ngữ. Kiểm tra tự động loại một mẫu vì trạng thái yêu cầu xung đột với trạng thái trích dẫn hoặc trạng thái kể lại, giữ 203 mẫu chỉ cho huấn luyện. Các mẫu này được đánh dấu </w:t>
+      </w:r>
+      <w:r>
+        <w:lastRenderedPageBreak/>
+        <w:t>AI_GENERATED_REQUIRES_HUMAN_REVIEW, không được gọi là nhãn chuẩn do con người gán. Cách đánh dấu giúp tách rõ dữ liệu hỗ trợ huấn luyện khỏi dữ liệu dùng để tuyên bố độ chính xác.</w:t>
       </w:r>
     </w:p>
     <w:p>
       <w:pPr>
         <w:pStyle w:val="Heading2"/>
       </w:pPr>
-      <w:bookmarkStart w:id="23" w:name="_Toc238123233"/>
+      <w:bookmarkStart w:id="23" w:name="_Toc238123747"/>
       <w:r>
         <w:rPr>
           <w:rFonts w:ascii="Times New Roman" w:eastAsia="Times New Roman" w:hAnsi="Times New Roman"/>
         </w:rPr>
-        <w:lastRenderedPageBreak/>
         <w:t>3.6. Quy trình xây dựng và kiểm soát dữ liệu</w:t>
       </w:r>
       <w:bookmarkEnd w:id="23"/>
@@ -8127,7 +8136,7 @@
           <w:noProof/>
         </w:rPr>
         <w:drawing>
-          <wp:inline distT="0" distB="0" distL="0" distR="0" wp14:anchorId="18A2DA2B" wp14:editId="3A986735">
+          <wp:inline distT="0" distB="0" distL="0" distR="0" wp14:anchorId="0A6C5050" wp14:editId="7851B79E">
             <wp:extent cx="5760720" cy="2918765"/>
             <wp:effectExtent l="0" t="0" r="0" b="0"/>
             <wp:docPr id="2" name="Picture 2"/>
@@ -8243,7 +8252,7 @@
         <w:t xml:space="preserve">Bước 5 - kiểm tra: </w:t>
       </w:r>
       <w:r>
-        <w:t>chương trình kiểm tra mã nhãn, thứ tự lượt, xung đột logic, trùng lặp nguyên văn, pair_id thiếu đối tác và chồng lấn giữa các phân hoạch. Mẫu lỗi được sửa hoặc loại trước khi huấn luyện.</w:t>
+        <w:t>Chương trình kiểm tra mã nhãn, thứ tự lượt, xung đột logic, trùng lặp nguyên văn, pair_id thiếu đối tác và chồng lấn giữa các phân hoạch. Mẫu lỗi được sửa hoặc loại trước khi huấn luyện.</w:t>
       </w:r>
     </w:p>
     <w:p>
@@ -8264,7 +8273,7 @@
       <w:pPr>
         <w:pStyle w:val="Heading2"/>
       </w:pPr>
-      <w:bookmarkStart w:id="24" w:name="_Toc238123234"/>
+      <w:bookmarkStart w:id="24" w:name="_Toc238123748"/>
       <w:r>
         <w:rPr>
           <w:rFonts w:ascii="Times New Roman" w:eastAsia="Times New Roman" w:hAnsi="Times New Roman"/>
@@ -8948,7 +8957,7 @@
         <w:ind w:firstLine="567"/>
       </w:pPr>
       <w:r>
-        <w:t>Cặp A-B giữ hành động DISCLOSE_SECRET và từ khóa OTP nhưng thay đổi phạm vi phủ định. Cặp C-D giữ hành động FOLLOW_LINK và ý định xác minh nhưng đổi từ yêu cầu sang cảnh báo. hàm mất mát theo cặp là thành phần hàm mất mát sử dụng quan hệ giữa hai mẫu; ở phiên bản hiện tại, nó khuyến khích điểm trạng thái yêu cầu của mẫu yêu cầu cao hơn mẫu không yêu cầu một khoảng tối thiểu. Công trình không tuyên bố rằng toàn bộ quan hệ mức độ rủi ro giữa mọi loại cặp đã được đưa trực tiếp vào hàm mất mát.</w:t>
+        <w:t>Cặp A-B giữ hành động DISCLOSE_SECRET và từ khóa OTP nhưng thay đổi phạm vi phủ định. Cặp C-D giữ hành động FOLLOW_LINK và ý định xác minh nhưng đổi từ yêu cầu sang cảnh báo. Hàm mất mát theo cặp là thành phần hàm mất mát sử dụng quan hệ giữa hai mẫu; ở phiên bản hiện tại, nó khuyến khích điểm trạng thái yêu cầu của mẫu yêu cầu cao hơn mẫu không yêu cầu một khoảng tối thiểu. Công trình không tuyên bố rằng toàn bộ quan hệ mức độ rủi ro giữa mọi loại cặp đã được đưa trực tiếp vào hàm mất mát.</w:t>
       </w:r>
     </w:p>
     <w:p>
@@ -8963,7 +8972,7 @@
       <w:pPr>
         <w:pStyle w:val="Heading2"/>
       </w:pPr>
-      <w:bookmarkStart w:id="25" w:name="_Toc238123235"/>
+      <w:bookmarkStart w:id="25" w:name="_Toc238123749"/>
       <w:r>
         <w:rPr>
           <w:rFonts w:ascii="Times New Roman" w:eastAsia="Times New Roman" w:hAnsi="Times New Roman"/>
@@ -8979,7 +8988,7 @@
           <w:noProof/>
         </w:rPr>
         <w:drawing>
-          <wp:inline distT="0" distB="0" distL="0" distR="0" wp14:anchorId="03BC2FF4" wp14:editId="658852FE">
+          <wp:inline distT="0" distB="0" distL="0" distR="0" wp14:anchorId="71FE2F31" wp14:editId="3F656250">
             <wp:extent cx="5760720" cy="2918765"/>
             <wp:effectExtent l="0" t="0" r="0" b="0"/>
             <wp:docPr id="3" name="Picture 3"/>
@@ -9067,7 +9076,7 @@
         <w:t xml:space="preserve">Mã hóa bằng XLM-R: </w:t>
       </w:r>
       <w:r>
-        <w:t>bộ tách đơn vị từ biến chuỗi thành đơn vị từ. bộ mã hóa tạo biểu diễn cho toàn bộ phần hội thoại và riêng lượt hiện tại, sau đó hai biểu diễn được nối lại.</w:t>
+        <w:t>Bộ phân tách văn bản chia chuỗi thành các đơn vị văn bản nhỏ. Bộ mã hóa tạo biểu diễn cho toàn bộ phần hội thoại và riêng lượt hiện tại, sau đó hai biểu diễn được nối lại.</w:t>
       </w:r>
     </w:p>
     <w:p>
@@ -9081,7 +9090,7 @@
         <w:t xml:space="preserve">Dự đoán ngữ nghĩa: </w:t>
       </w:r>
       <w:r>
-        <w:t>Năm đầu ra dự đoán hành động được đề cập, trạng thái yêu cầu, trạng thái phủ định, trạng thái trích dẫn và trạng thái kể lại. Các xác suất này được trả về để phục vụ phân tích và giải thích kỹ thuật.</w:t>
+        <w:t>Năm đầu ra dự đoán CandidateAction, trạng thái yêu cầu, trạng thái phủ định, trạng thái trích dẫn và trạng thái kể lại. Các xác suất này được trả về để phục vụ phân tích và giải thích kỹ thuật.</w:t>
       </w:r>
     </w:p>
     <w:p>
@@ -9095,7 +9104,7 @@
         <w:t xml:space="preserve">Phân loại mức độ rủi ro: </w:t>
       </w:r>
       <w:r>
-        <w:t>mô hình phân loại mức độ rủi ro sử dụng bộ mã hóa đã được huấn luyện ngữ nghĩa, đóng băng phần nhúng và sáu tầng đầu, rồi tối ưu bộ phân loại ba lớp. Nó học từ biểu diễn hội thoại chứ không dùng luật từ khóa.</w:t>
+        <w:t>Mô hình phân loại mức độ rủi ro sử dụng bộ mã hóa đã được huấn luyện ngữ nghĩa, đóng băng phần nhúng và sáu tầng đầu, rồi tối ưu bộ phân loại ba lớp. Nó học từ biểu diễn hội thoại chứ không dùng luật từ khóa.</w:t>
       </w:r>
     </w:p>
     <w:p>
@@ -9123,14 +9132,14 @@
         <w:t xml:space="preserve">Sinh hướng dẫn tùy chọn: </w:t>
       </w:r>
       <w:r>
-        <w:t>Nếu người dùng cấu hình Ollama Cloud, máy chủ gửi mức mức độ rủi ro, hành động và đoạn hội thoại tới mô hình sinh để tạo hướng xử lý và chế độ phản hồi. Tầng này không được đổi kết quả dự đoán của bộ phân loại.</w:t>
+        <w:t>Nếu người dùng cấu hình Ollama Cloud, máy chủ gửi mức độ rủi ro, hành động và đoạn hội thoại tới mô hình sinh để tạo hướng xử lý và chế độ phản hồi. Tầng này không được đổi kết quả dự đoán của bộ phân loại.</w:t>
       </w:r>
     </w:p>
     <w:p>
       <w:pPr>
         <w:pStyle w:val="Heading2"/>
       </w:pPr>
-      <w:bookmarkStart w:id="26" w:name="_Toc238123236"/>
+      <w:bookmarkStart w:id="26" w:name="_Toc238123750"/>
       <w:r>
         <w:rPr>
           <w:rFonts w:ascii="Times New Roman" w:eastAsia="Times New Roman" w:hAnsi="Times New Roman"/>
@@ -9320,7 +9329,7 @@
               <w:rPr>
                 <w:sz w:val="22"/>
               </w:rPr>
-              <w:t>Kế thừa quy trình và điểm kiểm tra mô hình nghiên cứu trước; phù hợp văn bản đa dạng ký hiệu.</w:t>
+              <w:t>Kế thừa quy trình và bản mô hình đã lưu nghiên cứu trước; phù hợp văn bản đa dạng ký hiệu.</w:t>
             </w:r>
           </w:p>
         </w:tc>
@@ -9476,7 +9485,7 @@
               <w:rPr>
                 <w:sz w:val="22"/>
               </w:rPr>
-              <w:t>Phù hợp bộ nhớ RTX 4050 Laptop GPU.</w:t>
+              <w:t>Phù hợp bộ nhớ RTX 4050 máy tính xách tay GPU.</w:t>
             </w:r>
           </w:p>
         </w:tc>
@@ -9554,7 +9563,7 @@
               <w:rPr>
                 <w:sz w:val="22"/>
               </w:rPr>
-              <w:t>Theo dõi DEV sau mỗi vòng huấn luyện và chọn điểm kiểm tra mô hình tốt nhất.</w:t>
+              <w:t>Theo dõi DEV sau mỗi vòng huấn luyện và chọn bản mô hình đã lưu tốt nhất.</w:t>
             </w:r>
           </w:p>
         </w:tc>
@@ -9804,7 +9813,7 @@
         <w:ind w:firstLine="567"/>
       </w:pPr>
       <w:r>
-        <w:t>Giai đoạn thứ nhất huấn luyện mô hình ngữ nghĩa. Hàm mất mát gồm entropy chéo của hành động được đề cập, bốn thuộc tính và hàm mất mát theo cặp. trạng thái yêu cầu được đặt trọng số cao hơn vì đây là ranh giới quan trọng giữa việc chỉ nhắc tới hành động và thật sự thúc đẩy hành động. điểm kiểm tra mô hình được chọn theo tổng có trọng số của Macro-F1 hành động được đề cập, Macro-F1 trạng thái yêu cầu và Macro-F1 hành động được xác nhận.</w:t>
+        <w:t>Giai đoạn thứ nhất huấn luyện mô hình ngữ nghĩa. Hàm mất mát gồm entropy chéo của CandidateAction, bốn thuộc tính và hàm mất mát theo cặp. Trạng thái yêu cầu được đặt trọng số cao hơn vì đây là ranh giới quan trọng giữa việc chỉ nhắc tới hành động và thật sự thúc đẩy hành động. Bản mô hình đã lưu được chọn theo tổng có trọng số của Macro-F1 CandidateAction, Macro-F1 trạng thái yêu cầu và Macro-F1 Supported-action.</w:t>
       </w:r>
     </w:p>
     <w:p>
@@ -9812,14 +9821,14 @@
         <w:ind w:firstLine="567"/>
       </w:pPr>
       <w:r>
-        <w:t>Giai đoạn thứ hai xây dựng mô hình phân loại mức độ rủi ro. bộ mã hóa được nạp từ điểm kiểm tra mô hình ngữ nghĩa đã chọn; bộ phân loại mức độ rủi ro được khởi tạo mới. Phần nhúng và sáu tầng đầu được đóng băng, các tầng trên cùng bộ phân loại được tối ưu trên dữ liệu mức độ rủi ro. Cách chuyển bộ mã hóa này cung cấp sự giám sát ngữ nghĩa gián tiếp cho mức độ rủi ro, nhưng không biến hệ thống thành kiến trúc mà nhãn mức độ rủi ro chỉ phụ thuộc vào năm điểm dự đoán ngữ nghĩa.</w:t>
+        <w:t>Giai đoạn thứ hai xây dựng mô hình phân loại mức độ rủi ro. Bộ mã hóa được nạp từ bản mô hình ngữ nghĩa đã lưu đã chọn; bộ phân loại mức độ rủi ro được khởi tạo mới. Phần nhúng và sáu tầng đầu được đóng băng, các tầng trên cùng bộ phân loại được tối ưu trên dữ liệu mức độ rủi ro. Cách chuyển bộ mã hóa này cung cấp sự giám sát ngữ nghĩa gián tiếp cho mức độ rủi ro, nhưng không biến hệ thống thành kiến trúc mà nhãn mức độ rủi ro chỉ phụ thuộc vào năm điểm dự đoán ngữ nghĩa.</w:t>
       </w:r>
     </w:p>
     <w:p>
       <w:pPr>
         <w:pStyle w:val="Heading2"/>
       </w:pPr>
-      <w:bookmarkStart w:id="27" w:name="_Toc238123237"/>
+      <w:bookmarkStart w:id="27" w:name="_Toc238123751"/>
       <w:r>
         <w:rPr>
           <w:rFonts w:ascii="Times New Roman" w:eastAsia="Times New Roman" w:hAnsi="Times New Roman"/>
@@ -9835,7 +9844,7 @@
           <w:noProof/>
         </w:rPr>
         <w:drawing>
-          <wp:inline distT="0" distB="0" distL="0" distR="0" wp14:anchorId="39E4D2AF" wp14:editId="1A735972">
+          <wp:inline distT="0" distB="0" distL="0" distR="0" wp14:anchorId="2F79661D" wp14:editId="5F4F3236">
             <wp:extent cx="5760720" cy="2918765"/>
             <wp:effectExtent l="0" t="0" r="0" b="0"/>
             <wp:docPr id="4" name="Picture 4"/>
@@ -9895,7 +9904,7 @@
         <w:t xml:space="preserve">Khóa trước khi suy luận: </w:t>
       </w:r>
       <w:r>
-        <w:t>Chốt điểm kiểm tra mô hình ngữ nghĩa, điểm kiểm tra mô hình mức độ rủi ro, quy trình tiền xử lý, bộ tách đơn vị từ, thứ tự mẫu, quy tắc argmax và chính sách vận hành. Không được xem INTERNAL_GOLD.</w:t>
+        <w:t>Chốt bản mô hình ngữ nghĩa đã lưu, bản mô hình mức độ rủi ro đã lưu, quy trình tiền xử lý, bộ phân tách văn bản, thứ tự mẫu, quy tắc argmax và chính sách vận hành. Không được xem INTERNAL_GOLD.</w:t>
       </w:r>
     </w:p>
     <w:p>
@@ -9923,7 +9932,7 @@
         <w:t xml:space="preserve">Suy luận một lượt: </w:t>
       </w:r>
       <w:r>
-        <w:t>mô hình chạy đủ 200 mẫu, không chỉnh câu, không thay mô hình và không thử lại mẫu vì kết quả có vẻ sai.</w:t>
+        <w:t>Mô hình chạy đủ 200 mẫu, không chỉnh câu, không thay mô hình và không thử lại mẫu vì kết quả có vẻ sai.</w:t>
       </w:r>
     </w:p>
     <w:p>
@@ -9965,14 +9974,14 @@
         <w:t xml:space="preserve">Mở nhãn chuẩn và đánh giá: </w:t>
       </w:r>
       <w:r>
-        <w:t>nhãn chuẩn chỉ được mở sau khi kết quả dự đoán đã có mã băm. chỉ số được tính đúng một lần. Nếu bất kỳ điều kiện nào bị vi phạm, phép thử phải ghi FINAL_INDEPENDENT_TEST_VALID=NO.</w:t>
+        <w:t>Nhãn chuẩn chỉ được mở sau khi kết quả dự đoán đã có mã băm. Chỉ số được tính đúng một lần. Nếu bất kỳ điều kiện nào bị vi phạm, phép thử phải ghi FINAL_INDEPENDENT_TEST_VALID=NO.</w:t>
       </w:r>
     </w:p>
     <w:p>
       <w:pPr>
         <w:pStyle w:val="Heading2"/>
       </w:pPr>
-      <w:bookmarkStart w:id="28" w:name="_Toc238123238"/>
+      <w:bookmarkStart w:id="28" w:name="_Toc238123752"/>
       <w:r>
         <w:rPr>
           <w:rFonts w:ascii="Times New Roman" w:eastAsia="Times New Roman" w:hAnsi="Times New Roman"/>
@@ -9986,7 +9995,7 @@
         <w:ind w:firstLine="567"/>
       </w:pPr>
       <w:r>
-        <w:t xml:space="preserve">Accuracy là tỷ lệ kết quả dự đoán trùng nhãn chuẩn. Precision cho biết trong các mẫu mô hình dự đoán vào một lớp, bao nhiêu mẫu đúng. Recall cho biết trong các mẫu thật sự thuộc lớp đó, mô hình phát hiện được bao nhiêu. F1 là trung bình điều hòa giữa Precision và Recall. Macro-F1 tính F1 riêng cho từng lớp rồi lấy trung bình, vì vậy lớp ít mẫu không bị che lấp bởi lớp đông mẫu. độ tin cậy trong ứng dụng là điểm softmax </w:t>
+        <w:t xml:space="preserve">Accuracy là tỷ lệ kết quả dự đoán trùng nhãn chuẩn. Precision cho biết trong các mẫu mô hình dự đoán vào một lớp, bao nhiêu mẫu đúng. Recall cho biết trong các mẫu thật sự thuộc lớp đó, mô hình phát hiện được bao nhiêu. F1 là trung bình điều hòa giữa Precision và Recall. Macro-F1 tính F1 riêng cho từng lớp rồi lấy trung bình, vì vậy lớp ít mẫu không bị che lấp bởi lớp đông mẫu. Độ tin cậy trong ứng dụng là điểm softmax </w:t>
       </w:r>
       <w:r>
         <w:lastRenderedPageBreak/>
@@ -10005,7 +10014,7 @@
       <w:pPr>
         <w:pStyle w:val="Heading1"/>
       </w:pPr>
-      <w:bookmarkStart w:id="29" w:name="_Toc238123239"/>
+      <w:bookmarkStart w:id="29" w:name="_Toc238123753"/>
       <w:r>
         <w:rPr>
           <w:rFonts w:ascii="Times New Roman" w:eastAsia="Times New Roman" w:hAnsi="Times New Roman"/>
@@ -10018,7 +10027,7 @@
       <w:pPr>
         <w:pStyle w:val="Heading2"/>
       </w:pPr>
-      <w:bookmarkStart w:id="30" w:name="_Toc238123240"/>
+      <w:bookmarkStart w:id="30" w:name="_Toc238123754"/>
       <w:r>
         <w:rPr>
           <w:rFonts w:ascii="Times New Roman" w:eastAsia="Times New Roman" w:hAnsi="Times New Roman"/>
@@ -10159,7 +10168,7 @@
               <w:rPr>
                 <w:sz w:val="23"/>
               </w:rPr>
-              <w:t>Hành động được đề cập</w:t>
+              <w:t>CandidateAction</w:t>
             </w:r>
           </w:p>
         </w:tc>
@@ -10549,7 +10558,7 @@
               <w:rPr>
                 <w:sz w:val="23"/>
               </w:rPr>
-              <w:t>Hành động được xác nhận</w:t>
+              <w:t>Supported-action</w:t>
             </w:r>
           </w:p>
         </w:tc>
@@ -10613,7 +10622,7 @@
         <w:ind w:firstLine="567"/>
       </w:pPr>
       <w:r>
-        <w:t>Kết quả cho thấy mô hình học tốt các ranh giới ngữ nghĩa trong dữ liệu phát triển. Đặc biệt, trạng thái yêu cầu đạt Macro-F1 99,78%, phù hợp với mục tiêu giảm lỗi do thấy từ khóa rồi kết luận có yêu cầu. hành động được xác nhận đạt 99,13%, cho thấy việc kết hợp hành động với trạng thái được yêu cầu tạo ra một đại lượng gần hơn với ý nghĩa vận hành so với hành động được đề cập đơn lẻ.</w:t>
+        <w:t>Kết quả cho thấy mô hình học tốt các ranh giới ngữ nghĩa trong dữ liệu phát triển. Đặc biệt, trạng thái yêu cầu đạt Macro-F1 99,78%, phù hợp với mục tiêu giảm lỗi do thấy từ khóa rồi kết luận có yêu cầu. Supported-action đạt 99,13%, cho thấy việc kết hợp hành động với trạng thái được yêu cầu tạo ra một đại lượng gần hơn với ý nghĩa vận hành so với CandidateAction đơn lẻ.</w:t>
       </w:r>
     </w:p>
     <w:p>
@@ -10628,7 +10637,7 @@
       <w:pPr>
         <w:pStyle w:val="Heading2"/>
       </w:pPr>
-      <w:bookmarkStart w:id="31" w:name="_Toc238123241"/>
+      <w:bookmarkStart w:id="31" w:name="_Toc238123755"/>
       <w:r>
         <w:rPr>
           <w:rFonts w:ascii="Times New Roman" w:eastAsia="Times New Roman" w:hAnsi="Times New Roman"/>
@@ -10912,14 +10921,14 @@
         <w:ind w:firstLine="567"/>
       </w:pPr>
       <w:r>
-        <w:t>Mô hình mức độ rủi ro đạt kết quả cân bằng giữa các lớp trên DEV. Tuy nhiên, đây vẫn là kết quả trong miền dữ liệu phát triển. Điểm độ tin cậy hiển thị trong ứng dụng là softmax của mô hình, chưa qua hiệu chỉnh xác suất trên một quần thể người dùng đại diện, nên báo cáo và giao diện đều phải chú thích rõ giới hạn này.</w:t>
+        <w:t>Mô hình mức độ rủi ro đạt kết quả cân bằng giữa các lớp trên DEV. Tuy nhiên, đây vẫn là kết quả trong miền dữ liệu phát triển. Độ tin cậy hiển thị trong ứng dụng là softmax của mô hình, chưa qua hiệu chỉnh xác suất trên một quần thể người dùng đại diện, nên báo cáo và giao diện đều phải chú thích rõ giới hạn này.</w:t>
       </w:r>
     </w:p>
     <w:p>
       <w:pPr>
         <w:pStyle w:val="Heading2"/>
       </w:pPr>
-      <w:bookmarkStart w:id="32" w:name="_Toc238123242"/>
+      <w:bookmarkStart w:id="32" w:name="_Toc238123756"/>
       <w:r>
         <w:rPr>
           <w:rFonts w:ascii="Times New Roman" w:eastAsia="Times New Roman" w:hAnsi="Times New Roman"/>
@@ -11592,7 +11601,7 @@
         <w:ind w:firstLine="567"/>
       </w:pPr>
       <w:r>
-        <w:t xml:space="preserve">Tập kiểm thử gồm 70 mẫu có lừa đảo, 65 mẫu âm khó và 65 mẫu âm dễ. nhãn chuẩn chỉ có hai nhãn đích NO_EVIDENCE và HIGH_EVIDENCE; REVIEW là vùng đầu ra thận trọng của hệ thống chứ không phải một loại dữ liệu bị bỏ sót. Do đó, Macro-F1 tính cả ba lớp sẽ bằng 54,53% vì lớp REVIEW không có mẫu nhãn chuẩn; </w:t>
+        <w:t xml:space="preserve">Tập kiểm thử gồm 70 mẫu có lừa đảo, 65 mẫu âm khó và 65 mẫu âm dễ. Nhãn chuẩn chỉ có hai nhãn đích NO_EVIDENCE và HIGH_EVIDENCE; REVIEW là vùng đầu ra thận trọng của hệ thống chứ không phải một loại dữ liệu bị bỏ sót. Do đó, Macro-F1 tính cả ba lớp sẽ bằng 54,53% vì lớp REVIEW không có mẫu nhãn chuẩn; </w:t>
       </w:r>
       <w:r>
         <w:lastRenderedPageBreak/>
@@ -11611,7 +11620,7 @@
       <w:pPr>
         <w:pStyle w:val="Heading2"/>
       </w:pPr>
-      <w:bookmarkStart w:id="33" w:name="_Toc238123243"/>
+      <w:bookmarkStart w:id="33" w:name="_Toc238123757"/>
       <w:r>
         <w:rPr>
           <w:rFonts w:ascii="Times New Roman" w:eastAsia="Times New Roman" w:hAnsi="Times New Roman"/>
@@ -12191,7 +12200,7 @@
       <w:pPr>
         <w:pStyle w:val="Heading2"/>
       </w:pPr>
-      <w:bookmarkStart w:id="34" w:name="_Toc238123244"/>
+      <w:bookmarkStart w:id="34" w:name="_Toc238123758"/>
       <w:r>
         <w:rPr>
           <w:rFonts w:ascii="Times New Roman" w:eastAsia="Times New Roman" w:hAnsi="Times New Roman"/>
@@ -12205,11 +12214,11 @@
         <w:ind w:firstLine="567"/>
       </w:pPr>
       <w:r>
-        <w:t xml:space="preserve">Đối với câu hỏi thứ nhất, kết quả trạng thái yêu cầu và hành động được xác nhận trên DEV cho thấy phân tích thuộc tính ngữ nghĩa có khả năng học được khác biệt giữa “nhắc đến” và “thực sự yêu cầu”. Các cặp đối chứng góp phần làm ranh giới này </w:t>
+        <w:t xml:space="preserve">Đối với câu hỏi thứ nhất, kết quả trạng thái yêu cầu và Supported-action trên DEV cho thấy phân tích thuộc tính ngữ nghĩa có khả năng học được khác biệt giữa “nhắc đến” và “thực sự yêu cầu”. Các cặp đối chứng góp phần làm ranh giới này rõ </w:t>
       </w:r>
       <w:r>
         <w:lastRenderedPageBreak/>
-        <w:t>rõ hơn, dù nghiên cứu hiện chưa có thí nghiệm loại bỏ thành phần trên cùng một tập test để định lượng riêng mức đóng góp.</w:t>
+        <w:t>hơn, dù nghiên cứu hiện chưa có thí nghiệm loại bỏ thành phần trên cùng một tập kiểm thử để định lượng riêng mức đóng góp.</w:t>
       </w:r>
     </w:p>
     <w:p>
@@ -12232,7 +12241,7 @@
       <w:pPr>
         <w:pStyle w:val="Heading2"/>
       </w:pPr>
-      <w:bookmarkStart w:id="35" w:name="_Toc238123245"/>
+      <w:bookmarkStart w:id="35" w:name="_Toc238123759"/>
       <w:r>
         <w:rPr>
           <w:rFonts w:ascii="Times New Roman" w:eastAsia="Times New Roman" w:hAnsi="Times New Roman"/>
@@ -12262,14 +12271,14 @@
         <w:ind w:firstLine="567"/>
       </w:pPr>
       <w:r>
-        <w:t>Đóng góp thứ ba là quy trình kiểm thử có khóa thành phần nghiên cứu và SHA256. kết quả dự đoán được đóng băng trước khi mở nhãn chuẩn, giúp phân biệt phép thử độc lập với việc đánh giá lại sau khi đã xem kết quả. Đây là đóng góp về tính kiểm chứng của quy trình nghiên cứu, đặc biệt cần thiết với mô hình được cải tiến lặp lại.</w:t>
+        <w:t>Đóng góp thứ ba là quy trình kiểm thử có khóa thành phần nghiên cứu và SHA256. Kết quả dự đoán được đóng băng trước khi mở nhãn chuẩn, giúp phân biệt phép thử độc lập với việc đánh giá lại sau khi đã xem kết quả. Đây là đóng góp về tính kiểm chứng của quy trình nghiên cứu, đặc biệt cần thiết với mô hình được cải tiến lặp lại.</w:t>
       </w:r>
     </w:p>
     <w:p>
       <w:pPr>
         <w:pStyle w:val="Heading2"/>
       </w:pPr>
-      <w:bookmarkStart w:id="36" w:name="_Toc238123246"/>
+      <w:bookmarkStart w:id="36" w:name="_Toc238123760"/>
       <w:r>
         <w:rPr>
           <w:rFonts w:ascii="Times New Roman" w:eastAsia="Times New Roman" w:hAnsi="Times New Roman"/>
@@ -12283,7 +12292,7 @@
         <w:ind w:firstLine="567"/>
       </w:pPr>
       <w:r>
-        <w:t>Ứng dụng Android nhận ba loại đầu vào: văn bản dán trực tiếp, ảnh chụp màn hình được OCR và mã QR. Nội dung được gửi tới máy chủ cục bộ chạy trên máy tính có điểm kiểm tra mô hình. Máy chủ trả về mức độ, độ tin cậy và dữ liệu kỹ thuật; ứng dụng chỉ trình bày kết quả, không tự gán nhãn bằng danh sách từ khóa.</w:t>
+        <w:t>Ứng dụng Android nhận ba loại đầu vào: văn bản dán trực tiếp, ảnh chụp màn hình được OCR và mã QR. Nội dung được gửi tới máy chủ cục bộ chạy trên máy tính có bản mô hình đã lưu. Máy chủ trả về mức độ, độ tin cậy và dữ liệu kỹ thuật; ứng dụng chỉ trình bày kết quả, không tự gán nhãn bằng danh sách từ khóa.</w:t>
       </w:r>
     </w:p>
     <w:p>
@@ -12298,7 +12307,7 @@
       <w:pPr>
         <w:pStyle w:val="Heading2"/>
       </w:pPr>
-      <w:bookmarkStart w:id="37" w:name="_Toc238123247"/>
+      <w:bookmarkStart w:id="37" w:name="_Toc238123761"/>
       <w:r>
         <w:rPr>
           <w:rFonts w:ascii="Times New Roman" w:eastAsia="Times New Roman" w:hAnsi="Times New Roman"/>
@@ -12596,7 +12605,7 @@
               <w:rPr>
                 <w:sz w:val="21"/>
               </w:rPr>
-              <w:t>Chưa có thí nghiệm loại bỏ thành phần trên cùng test</w:t>
+              <w:t>Chưa có thí nghiệm loại bỏ thành phần trên cùng kiểm thử</w:t>
             </w:r>
           </w:p>
         </w:tc>
@@ -12644,7 +12653,7 @@
               <w:rPr>
                 <w:sz w:val="21"/>
               </w:rPr>
-              <w:t>Huấn luyện các cấu hình bỏ từng thành phần, giữ nguyên hạt giống ngẫu nhiên và tập test.</w:t>
+              <w:t>Huấn luyện các cấu hình bỏ từng thành phần, giữ nguyên hạt giống ngẫu nhiên và tập kiểm thử.</w:t>
             </w:r>
           </w:p>
         </w:tc>
@@ -12854,7 +12863,7 @@
               <w:rPr>
                 <w:sz w:val="21"/>
               </w:rPr>
-              <w:t>Khó sử dụng khi laptop và điện thoại không cùng mạng.</w:t>
+              <w:t>Khó sử dụng khi máy tính xách tay và điện thoại không cùng mạng.</w:t>
             </w:r>
           </w:p>
         </w:tc>
@@ -12901,7 +12910,7 @@
       <w:pPr>
         <w:pStyle w:val="Heading1"/>
       </w:pPr>
-      <w:bookmarkStart w:id="38" w:name="_Toc238123248"/>
+      <w:bookmarkStart w:id="38" w:name="_Toc238123762"/>
       <w:r>
         <w:rPr>
           <w:rFonts w:ascii="Times New Roman" w:eastAsia="Times New Roman" w:hAnsi="Times New Roman"/>
@@ -12914,7 +12923,7 @@
       <w:pPr>
         <w:pStyle w:val="Heading2"/>
       </w:pPr>
-      <w:bookmarkStart w:id="39" w:name="_Toc238123249"/>
+      <w:bookmarkStart w:id="39" w:name="_Toc238123763"/>
       <w:r>
         <w:rPr>
           <w:rFonts w:ascii="Times New Roman" w:eastAsia="Times New Roman" w:hAnsi="Times New Roman"/>
@@ -12936,18 +12945,18 @@
         <w:ind w:firstLine="567"/>
       </w:pPr>
       <w:r>
-        <w:t xml:space="preserve">Trên tập DEV, mô hình ngữ nghĩa đạt Macro-F1 96,14% cho hành động được đề cập và 99,13% cho hành động được xác nhận; mô hình mức độ rủi ro đạt Accuracy 96,73% và Macro-F1 96,72%. Trên 200 mẫu kiểm thử độc lập khó hơn, độ chính xác nghiêm ngặt đạt 76,50%, Macro-F1 trên hai nhãn có trong nhãn chuẩn đạt 81,79% và </w:t>
+        <w:t xml:space="preserve">Trên tập DEV, mô hình ngữ nghĩa đạt Macro-F1 96,14% cho CandidateAction và 99,13% cho Supported-action; mô hình mức độ rủi ro đạt Accuracy 96,73% và Macro-F1 96,72%. Trên 200 mẫu kiểm thử độc lập khó hơn, độ chính xác nghiêm ngặt đạt 76,50%, Macro-F1 trên hai nhãn có trong nhãn chuẩn đạt 81,79% và độ chính xác vận </w:t>
       </w:r>
       <w:r>
         <w:lastRenderedPageBreak/>
-        <w:t>độ chính xác vận hành đạt 86,50%. Sự chênh lệch giữa DEV và kiểm thử độc lập được công bố như một bằng chứng về dịch chuyển miền và giới hạn khái quát, không bị che bằng chỉ số thuận lợi hơn.</w:t>
+        <w:t>hành đạt 86,50%. Sự chênh lệch giữa DEV và kiểm thử độc lập được công bố như một bằng chứng về dịch chuyển miền và giới hạn khái quát, không bị che bằng chỉ số thuận lợi hơn.</w:t>
       </w:r>
     </w:p>
     <w:p>
       <w:pPr>
         <w:pStyle w:val="Heading2"/>
       </w:pPr>
-      <w:bookmarkStart w:id="40" w:name="_Toc238123250"/>
+      <w:bookmarkStart w:id="40" w:name="_Toc238123764"/>
       <w:r>
         <w:rPr>
           <w:rFonts w:ascii="Times New Roman" w:eastAsia="Times New Roman" w:hAnsi="Times New Roman"/>
@@ -12963,7 +12972,7 @@
         <w:ind w:left="425" w:hanging="198"/>
       </w:pPr>
       <w:r>
-        <w:t xml:space="preserve"> Đề xuất cách biểu diễn bài toán nhận diện lừa đảo tiếng Việt bằng hành động được đề cập và các thuộc tính ngữ nghĩa, tạo lớp thông tin trung gian có thể kiểm tra.</w:t>
+        <w:t xml:space="preserve"> Đề xuất cách biểu diễn bài toán nhận diện lừa đảo tiếng Việt bằng CandidateAction và các thuộc tính ngữ nghĩa, tạo lớp thông tin trung gian có thể kiểm tra.</w:t>
       </w:r>
     </w:p>
     <w:p>
@@ -12993,7 +13002,7 @@
         <w:ind w:left="425" w:hanging="198"/>
       </w:pPr>
       <w:r>
-        <w:t xml:space="preserve"> Thực hiện quy trình kiểm thử độc lập có đóng băng đầu vào, điểm kiểm tra mô hình, kết quả dự đoán và SHA256 trước khi mở nhãn chuẩn, qua đó tăng khả năng tái kiểm chứng.</w:t>
+        <w:t xml:space="preserve"> Thực hiện quy trình kiểm thử độc lập có đóng băng đầu vào, bản mô hình đã lưu, kết quả dự đoán và SHA256 trước khi mở nhãn chuẩn, qua đó tăng khả năng tái kiểm chứng.</w:t>
       </w:r>
     </w:p>
     <w:p>
@@ -13010,7 +13019,7 @@
       <w:pPr>
         <w:pStyle w:val="Heading2"/>
       </w:pPr>
-      <w:bookmarkStart w:id="41" w:name="_Toc238123251"/>
+      <w:bookmarkStart w:id="41" w:name="_Toc238123765"/>
       <w:r>
         <w:rPr>
           <w:rFonts w:ascii="Times New Roman" w:eastAsia="Times New Roman" w:hAnsi="Times New Roman"/>
@@ -13024,7 +13033,7 @@
         <w:ind w:firstLine="567"/>
       </w:pPr>
       <w:r>
-        <w:t>Nghiên cứu tiếp theo sẽ ưu tiên dữ liệu thật đã ẩn danh, có nhiều người gán nhãn và đo mức đồng thuận. Tập kiểm thử mới cần có đủ ba lớp, đặc biệt các trường hợp REVIEW thật sự mơ hồ, đồng thời phải được giữ kín cho đến khi điểm kiểm tra mô hình và ngưỡng đã khóa.</w:t>
+        <w:t>Nghiên cứu tiếp theo sẽ ưu tiên dữ liệu thật đã ẩn danh, có nhiều người gán nhãn và đo mức đồng thuận. Tập kiểm thử mới cần có đủ ba lớp, đặc biệt các trường hợp REVIEW thật sự mơ hồ, đồng thời phải được giữ kín cho đến khi bản mô hình đã lưu và ngưỡng đã khóa.</w:t>
       </w:r>
     </w:p>
     <w:p>
@@ -13047,7 +13056,7 @@
       <w:pPr>
         <w:pStyle w:val="Heading2"/>
       </w:pPr>
-      <w:bookmarkStart w:id="42" w:name="_Toc238123252"/>
+      <w:bookmarkStart w:id="42" w:name="_Toc238123766"/>
       <w:r>
         <w:rPr>
           <w:rFonts w:ascii="Times New Roman" w:eastAsia="Times New Roman" w:hAnsi="Times New Roman"/>
@@ -13076,14 +13085,14 @@
       </w:pPr>
       <w:r>
         <w:lastRenderedPageBreak/>
-        <w:t>Kho lưu trữ cung cấp điểm kiểm tra mô hình ngữ nghĩa và mức độ rủi ro qua bản phát hành, tệp kê khai SHA256, cấu hình môi trường và lệnh chạy máy chủ. Việc tái chạy có thể có sai khác nhỏ do phiên bản thư viện, phần cứng và phép toán GPU; các mã băm được dùng để xác nhận đúng thành phần nghiên cứu của kết quả đã báo cáo.</w:t>
+        <w:t>Kho lưu trữ cung cấp bản mô hình đã lưu ngữ nghĩa và mức độ rủi ro qua bản phát hành, tệp kê khai SHA256, cấu hình môi trường và lệnh chạy máy chủ. Việc tái chạy có thể có sai khác nhỏ do phiên bản thư viện, phần cứng và phép toán GPU; các mã băm được dùng để xác nhận đúng thành phần nghiên cứu của kết quả đã báo cáo.</w:t>
       </w:r>
     </w:p>
     <w:p>
       <w:pPr>
         <w:pStyle w:val="Heading1"/>
       </w:pPr>
-      <w:bookmarkStart w:id="43" w:name="_Toc238123253"/>
+      <w:bookmarkStart w:id="43" w:name="_Toc238123767"/>
       <w:r>
         <w:rPr>
           <w:rFonts w:ascii="Times New Roman" w:eastAsia="Times New Roman" w:hAnsi="Times New Roman"/>
@@ -13184,7 +13193,7 @@
       <w:pPr>
         <w:pStyle w:val="Heading1"/>
       </w:pPr>
-      <w:bookmarkStart w:id="44" w:name="_Toc238123254"/>
+      <w:bookmarkStart w:id="44" w:name="_Toc238123768"/>
       <w:r>
         <w:rPr>
           <w:rFonts w:ascii="Times New Roman" w:eastAsia="Times New Roman" w:hAnsi="Times New Roman"/>
@@ -13198,7 +13207,7 @@
       <w:pPr>
         <w:pStyle w:val="Heading2"/>
       </w:pPr>
-      <w:bookmarkStart w:id="45" w:name="_Toc238123255"/>
+      <w:bookmarkStart w:id="45" w:name="_Toc238123769"/>
       <w:r>
         <w:rPr>
           <w:rFonts w:ascii="Times New Roman" w:eastAsia="Times New Roman" w:hAnsi="Times New Roman"/>
@@ -13304,7 +13313,7 @@
       <w:pPr>
         <w:pStyle w:val="Heading2"/>
       </w:pPr>
-      <w:bookmarkStart w:id="46" w:name="_Toc238123256"/>
+      <w:bookmarkStart w:id="46" w:name="_Toc238123770"/>
       <w:r>
         <w:rPr>
           <w:rFonts w:ascii="Times New Roman" w:eastAsia="Times New Roman" w:hAnsi="Times New Roman"/>
@@ -13382,7 +13391,7 @@
       <w:pPr>
         <w:pStyle w:val="Heading2"/>
       </w:pPr>
-      <w:bookmarkStart w:id="47" w:name="_Toc238123257"/>
+      <w:bookmarkStart w:id="47" w:name="_Toc238123771"/>
       <w:r>
         <w:rPr>
           <w:rFonts w:ascii="Times New Roman" w:eastAsia="Times New Roman" w:hAnsi="Times New Roman"/>
@@ -13497,7 +13506,7 @@
               <w:rPr>
                 <w:sz w:val="19"/>
               </w:rPr>
-              <w:t>Điểm kiểm tra mô hình ngữ nghĩa</w:t>
+              <w:t>Bản mô hình ngữ nghĩa đã lưu</w:t>
             </w:r>
           </w:p>
         </w:tc>
@@ -13551,7 +13560,7 @@
               <w:rPr>
                 <w:sz w:val="19"/>
               </w:rPr>
-              <w:t>Điểm kiểm tra mô hình mức độ rủi ro</w:t>
+              <w:t>Bản mô hình mức độ rủi ro đã lưu</w:t>
             </w:r>
           </w:p>
         </w:tc>
@@ -13752,7 +13761,7 @@
       <w:pPr>
         <w:pStyle w:val="Heading2"/>
       </w:pPr>
-      <w:bookmarkStart w:id="48" w:name="_Toc238123258"/>
+      <w:bookmarkStart w:id="48" w:name="_Toc238123772"/>
       <w:r>
         <w:rPr>
           <w:rFonts w:ascii="Times New Roman" w:eastAsia="Times New Roman" w:hAnsi="Times New Roman"/>
@@ -13789,7 +13798,7 @@
         <w:ind w:left="454" w:hanging="227"/>
       </w:pPr>
       <w:r>
-        <w:t>3. API nạp điểm kiểm tra mô hình, mã hóa văn bản và trả về các thuộc tính ngữ nghĩa cùng mức độ rủi ro.</w:t>
+        <w:t>3. API nạp bản mô hình đã lưu, mã hóa văn bản và trả về các thuộc tính ngữ nghĩa cùng mức độ rủi ro.</w:t>
       </w:r>
     </w:p>
     <w:p>
@@ -13816,7 +13825,7 @@
       <w:pPr>
         <w:pStyle w:val="Heading2"/>
       </w:pPr>
-      <w:bookmarkStart w:id="49" w:name="_Toc238123259"/>
+      <w:bookmarkStart w:id="49" w:name="_Toc238123773"/>
       <w:r>
         <w:rPr>
           <w:rFonts w:ascii="Times New Roman" w:eastAsia="Times New Roman" w:hAnsi="Times New Roman"/>
@@ -13830,7 +13839,7 @@
         <w:ind w:firstLine="567"/>
       </w:pPr>
       <w:r>
-        <w:t>Người tái lập cần tạo môi trường theo tệp khai báo thư viện, tải đúng hai điểm kiểm tra mô hình, kiểm tra SHA256, khởi động API và cấu hình địa chỉ máy chủ trong ứng dụng Android. Muốn tái lập kết quả kiểm thử, phải dùng đúng FINAL_MODEL_INPUT, quy trình tiền xử lý, thứ tự mẫu và điểm kiểm tra mô hình; không được dùng INTERNAL_GOLD trong lúc suy luận.</w:t>
+        <w:t>Người tái lập cần tạo môi trường theo tệp khai báo thư viện, tải đúng hai bản mô hình đã lưu, kiểm tra SHA256, khởi động API và cấu hình địa chỉ máy chủ trong ứng dụng Android. Muốn tái lập kết quả kiểm thử, phải dùng đúng FINAL_MODEL_INPUT, quy trình tiền xử lý, thứ tự mẫu và bản mô hình đã lưu; không được dùng INTERNAL_GOLD trong lúc suy luận.</w:t>
       </w:r>
     </w:p>
     <w:sectPr>
@@ -14119,31 +14128,31 @@
       </w:rPr>
     </w:lvl>
   </w:abstractNum>
-  <w:num w:numId="1" w16cid:durableId="2091192201">
+  <w:num w:numId="1" w16cid:durableId="1120994352">
     <w:abstractNumId w:val="8"/>
   </w:num>
-  <w:num w:numId="2" w16cid:durableId="1910769960">
+  <w:num w:numId="2" w16cid:durableId="1063791345">
     <w:abstractNumId w:val="6"/>
   </w:num>
-  <w:num w:numId="3" w16cid:durableId="2052682905">
+  <w:num w:numId="3" w16cid:durableId="1471170311">
     <w:abstractNumId w:val="5"/>
   </w:num>
-  <w:num w:numId="4" w16cid:durableId="986399380">
+  <w:num w:numId="4" w16cid:durableId="1034424836">
     <w:abstractNumId w:val="4"/>
   </w:num>
-  <w:num w:numId="5" w16cid:durableId="806969116">
+  <w:num w:numId="5" w16cid:durableId="1424305649">
     <w:abstractNumId w:val="7"/>
   </w:num>
-  <w:num w:numId="6" w16cid:durableId="329140257">
+  <w:num w:numId="6" w16cid:durableId="577599313">
     <w:abstractNumId w:val="3"/>
   </w:num>
-  <w:num w:numId="7" w16cid:durableId="412169680">
+  <w:num w:numId="7" w16cid:durableId="1007439158">
     <w:abstractNumId w:val="2"/>
   </w:num>
-  <w:num w:numId="8" w16cid:durableId="381563247">
+  <w:num w:numId="8" w16cid:durableId="1711034575">
     <w:abstractNumId w:val="1"/>
   </w:num>
-  <w:num w:numId="9" w16cid:durableId="613362650">
+  <w:num w:numId="9" w16cid:durableId="634724372">
     <w:abstractNumId w:val="0"/>
   </w:num>
 </w:numbering>
@@ -25533,7 +25542,7 @@
     <w:autoRedefine/>
     <w:uiPriority w:val="39"/>
     <w:unhideWhenUsed/>
-    <w:rsid w:val="00462AE7"/>
+    <w:rsid w:val="00C96DF7"/>
     <w:pPr>
       <w:spacing w:after="100"/>
     </w:pPr>
@@ -25545,7 +25554,7 @@
     <w:autoRedefine/>
     <w:uiPriority w:val="39"/>
     <w:unhideWhenUsed/>
-    <w:rsid w:val="00462AE7"/>
+    <w:rsid w:val="00C96DF7"/>
     <w:pPr>
       <w:spacing w:after="100"/>
       <w:ind w:left="260"/>
@@ -25556,7 +25565,7 @@
     <w:basedOn w:val="DefaultParagraphFont"/>
     <w:uiPriority w:val="99"/>
     <w:unhideWhenUsed/>
-    <w:rsid w:val="00462AE7"/>
+    <w:rsid w:val="00C96DF7"/>
     <w:rPr>
       <w:color w:val="0000FF" w:themeColor="hyperlink"/>
       <w:u w:val="single"/>

</xml_diff>